<commit_message>
Pridanie priloh k dokumentacii
Pridanie priloh k dokumentacii
</commit_message>
<xml_diff>
--- a/dokumentacia/Dokumentácia k maturitnému projektu - Online testovací modul pre maturantov, Matúš Čiernik.docx
+++ b/dokumentacia/Dokumentácia k maturitnému projektu - Online testovací modul pre maturantov, Matúš Čiernik.docx
@@ -9035,13 +9035,13 @@
       <w:pPr>
         <w:pStyle w:val="Nadpis1"/>
       </w:pPr>
-      <w:bookmarkStart w:id="6" w:name="_Toc382839396"/>
-      <w:bookmarkStart w:id="7" w:name="_Toc221484204"/>
+      <w:bookmarkStart w:id="6" w:name="_Toc221484204"/>
+      <w:bookmarkStart w:id="7" w:name="_Toc382839396"/>
       <w:r>
         <w:lastRenderedPageBreak/>
         <w:t>Použité technológie</w:t>
       </w:r>
-      <w:bookmarkEnd w:id="7"/>
+      <w:bookmarkEnd w:id="6"/>
     </w:p>
     <w:p>
       <w:pPr>
@@ -12906,7 +12906,7 @@
         <w:lastRenderedPageBreak/>
         <w:t>Záver</w:t>
       </w:r>
-      <w:bookmarkEnd w:id="6"/>
+      <w:bookmarkEnd w:id="7"/>
       <w:bookmarkEnd w:id="38"/>
     </w:p>
     <w:p>
@@ -13488,51 +13488,69 @@
         </w:rPr>
         <w:t xml:space="preserve"> na webovú stránku: </w:t>
       </w:r>
-    </w:p>
-    <w:p>
-      <w:pPr>
-        <w:spacing w:line="360" w:lineRule="auto"/>
+      <w:proofErr w:type="spellStart"/>
+      <w:r>
         <w:rPr>
           <w:rFonts w:ascii="Times New Roman" w:hAnsi="Times New Roman" w:cs="Times New Roman"/>
           <w:sz w:val="24"/>
           <w:szCs w:val="24"/>
         </w:rPr>
-      </w:pPr>
-      <w:proofErr w:type="spellStart"/>
-      <w:r>
+        <w:t>otestujsa.site</w:t>
+      </w:r>
+      <w:proofErr w:type="spellEnd"/>
+    </w:p>
+    <w:p>
+      <w:pPr>
+        <w:spacing w:line="360" w:lineRule="auto"/>
         <w:rPr>
           <w:rFonts w:ascii="Times New Roman" w:hAnsi="Times New Roman" w:cs="Times New Roman"/>
           <w:sz w:val="24"/>
           <w:szCs w:val="24"/>
         </w:rPr>
-        <w:t>Link</w:t>
-      </w:r>
-      <w:proofErr w:type="spellEnd"/>
+      </w:pPr>
+      <w:proofErr w:type="spellStart"/>
       <w:r>
         <w:rPr>
           <w:rFonts w:ascii="Times New Roman" w:hAnsi="Times New Roman" w:cs="Times New Roman"/>
           <w:sz w:val="24"/>
           <w:szCs w:val="24"/>
         </w:rPr>
-        <w:t xml:space="preserve"> na </w:t>
-      </w:r>
-      <w:proofErr w:type="spellStart"/>
+        <w:t>Link</w:t>
+      </w:r>
+      <w:proofErr w:type="spellEnd"/>
       <w:r>
         <w:rPr>
           <w:rFonts w:ascii="Times New Roman" w:hAnsi="Times New Roman" w:cs="Times New Roman"/>
           <w:sz w:val="24"/>
           <w:szCs w:val="24"/>
         </w:rPr>
-        <w:t>zip</w:t>
-      </w:r>
-      <w:proofErr w:type="spellEnd"/>
+        <w:t xml:space="preserve"> na </w:t>
+      </w:r>
+      <w:proofErr w:type="spellStart"/>
       <w:r>
         <w:rPr>
           <w:rFonts w:ascii="Times New Roman" w:hAnsi="Times New Roman" w:cs="Times New Roman"/>
           <w:sz w:val="24"/>
           <w:szCs w:val="24"/>
         </w:rPr>
+        <w:t>zip</w:t>
+      </w:r>
+      <w:proofErr w:type="spellEnd"/>
+      <w:r>
+        <w:rPr>
+          <w:rFonts w:ascii="Times New Roman" w:hAnsi="Times New Roman" w:cs="Times New Roman"/>
+          <w:sz w:val="24"/>
+          <w:szCs w:val="24"/>
+        </w:rPr>
         <w:t xml:space="preserve"> súbor stránky: </w:t>
+      </w:r>
+      <w:r>
+        <w:rPr>
+          <w:rFonts w:ascii="Times New Roman" w:hAnsi="Times New Roman" w:cs="Times New Roman"/>
+          <w:sz w:val="24"/>
+          <w:szCs w:val="24"/>
+        </w:rPr>
+        <w:t>https://www.mediafire.com/file/7qtguhi2b5lt0ou/Matúš+Čiernik.zip/file</w:t>
       </w:r>
     </w:p>
     <w:p>
@@ -15420,7 +15438,6 @@
   <w:style w:type="character" w:default="1" w:styleId="Predvolenpsmoodseku">
     <w:name w:val="Default Paragraph Font"/>
     <w:uiPriority w:val="1"/>
-    <w:semiHidden/>
     <w:unhideWhenUsed/>
   </w:style>
   <w:style w:type="table" w:default="1" w:styleId="Normlnatabuka">
@@ -16576,6 +16593,7 @@
     <w:rsid w:val="00BE05E0"/>
     <w:rsid w:val="00BE5613"/>
     <w:rsid w:val="00C13BF0"/>
+    <w:rsid w:val="00C52E6C"/>
     <w:rsid w:val="00C53C67"/>
     <w:rsid w:val="00C9611B"/>
     <w:rsid w:val="00CB6EBA"/>
@@ -16587,6 +16605,7 @@
     <w:rsid w:val="00D67AE0"/>
     <w:rsid w:val="00D70661"/>
     <w:rsid w:val="00DA51F9"/>
+    <w:rsid w:val="00E022CA"/>
     <w:rsid w:val="00E67C3A"/>
     <w:rsid w:val="00F1144D"/>
     <w:rsid w:val="00F261A4"/>

</xml_diff>

<commit_message>
09-02-2026 - SKoro done
09-02-2026 - SKoro done
</commit_message>
<xml_diff>
--- a/dokumentacia/Dokumentácia k maturitnému projektu - Online testovací modul pre maturantov, Matúš Čiernik.docx
+++ b/dokumentacia/Dokumentácia k maturitnému projektu - Online testovací modul pre maturantov, Matúš Čiernik.docx
@@ -467,6 +467,7 @@
         <w:t xml:space="preserve"> 133/1, 027 44 Tvrdošín</w:t>
       </w:r>
     </w:p>
+    <w:p/>
     <w:p/>
     <w:p/>
     <w:p/>
@@ -892,23 +893,6 @@
         </w:rPr>
         <w:tab/>
       </w:r>
-    </w:p>
-    <w:p>
-      <w:pPr>
-        <w:rPr>
-          <w:lang w:eastAsia="sk-SK"/>
-        </w:rPr>
-      </w:pPr>
-    </w:p>
-    <w:p>
-      <w:pPr>
-        <w:rPr>
-          <w:rFonts w:ascii="Times New Roman" w:eastAsia="Times New Roman" w:hAnsi="Times New Roman" w:cs="Times New Roman"/>
-          <w:b/>
-          <w:szCs w:val="20"/>
-          <w:lang w:eastAsia="cs-CZ"/>
-        </w:rPr>
-      </w:pPr>
       <w:r>
         <w:rPr>
           <w:rFonts w:ascii="Times New Roman" w:eastAsia="Times New Roman" w:hAnsi="Times New Roman" w:cs="Times New Roman"/>
@@ -2106,12 +2090,9 @@
           <w:lang w:eastAsia="cs-CZ"/>
         </w:rPr>
         <w:sectPr>
-          <w:headerReference w:type="even" r:id="rId10"/>
-          <w:headerReference w:type="default" r:id="rId11"/>
-          <w:footerReference w:type="even" r:id="rId12"/>
-          <w:footerReference w:type="default" r:id="rId13"/>
-          <w:headerReference w:type="first" r:id="rId14"/>
-          <w:footerReference w:type="first" r:id="rId15"/>
+          <w:headerReference w:type="default" r:id="rId10"/>
+          <w:footerReference w:type="default" r:id="rId11"/>
+          <w:footerReference w:type="first" r:id="rId12"/>
           <w:type w:val="continuous"/>
           <w:pgSz w:w="11906" w:h="16838"/>
           <w:pgMar w:top="1418" w:right="1418" w:bottom="1418" w:left="1985" w:header="709" w:footer="709" w:gutter="0"/>
@@ -2209,11 +2190,20 @@
         </w:sdtPr>
         <w:sdtContent>
           <w:r>
-            <w:t xml:space="preserve"> Mgr. Martin </w:t>
+            <w:t xml:space="preserve"> Mgr. Martin</w:t>
+          </w:r>
+          <w:r>
+            <w:t>a</w:t>
+          </w:r>
+          <w:r>
+            <w:t xml:space="preserve"> </w:t>
           </w:r>
           <w:proofErr w:type="spellStart"/>
           <w:r>
             <w:t>Ovšák</w:t>
+          </w:r>
+          <w:r>
+            <w:t>a</w:t>
           </w:r>
           <w:proofErr w:type="spellEnd"/>
         </w:sdtContent>
@@ -2314,7 +2304,7 @@
           <w:alias w:val="Dátum"/>
           <w:tag w:val="Dátum"/>
           <w:id w:val="467856861"/>
-          <w:date w:fullDate="2026-02-08T00:00:00Z">
+          <w:date w:fullDate="2026-02-09T00:00:00Z">
             <w:dateFormat w:val="d. M. yyyy"/>
             <w:lid w:val="sk-SK"/>
             <w:storeMappedDataAs w:val="dateTime"/>
@@ -2329,7 +2319,16 @@
               <w:sz w:val="24"/>
               <w:szCs w:val="24"/>
             </w:rPr>
-            <w:t>8. 2. 2026</w:t>
+            <w:t>9</w:t>
+          </w:r>
+          <w:r>
+            <w:rPr>
+              <w:rFonts w:ascii="Times New Roman" w:hAnsi="Times New Roman" w:cs="Times New Roman"/>
+              <w:color w:val="808080" w:themeColor="background1" w:themeShade="80"/>
+              <w:sz w:val="24"/>
+              <w:szCs w:val="24"/>
+            </w:rPr>
+            <w:t>. 2. 2026</w:t>
           </w:r>
         </w:sdtContent>
       </w:sdt>
@@ -2421,82 +2420,53 @@
       <w:pPr>
         <w:pStyle w:val="TEXT"/>
         <w:ind w:firstLine="0"/>
-        <w:rPr>
-          <w:sz w:val="32"/>
-          <w:szCs w:val="32"/>
-        </w:rPr>
-      </w:pPr>
-      <w:r>
-        <w:rPr>
-          <w:sz w:val="32"/>
-          <w:szCs w:val="32"/>
-        </w:rPr>
+      </w:pPr>
+      <w:r>
         <w:t>ČIERNIK</w:t>
       </w:r>
       <w:r>
-        <w:rPr>
-          <w:sz w:val="32"/>
-          <w:szCs w:val="32"/>
-        </w:rPr>
         <w:t>, M</w:t>
       </w:r>
       <w:r>
-        <w:rPr>
-          <w:sz w:val="32"/>
-          <w:szCs w:val="32"/>
-        </w:rPr>
         <w:t>atúš</w:t>
       </w:r>
       <w:r>
-        <w:rPr>
-          <w:sz w:val="32"/>
-          <w:szCs w:val="32"/>
-        </w:rPr>
         <w:t xml:space="preserve">: </w:t>
       </w:r>
       <w:r>
-        <w:rPr>
-          <w:sz w:val="32"/>
-          <w:szCs w:val="32"/>
-        </w:rPr>
         <w:t>Online testovací modul pre maturantov</w:t>
       </w:r>
       <w:r>
-        <w:rPr>
-          <w:sz w:val="32"/>
-          <w:szCs w:val="32"/>
-        </w:rPr>
         <w:t xml:space="preserve">. Stredná priemyselná škola informačných technológií Ignáca </w:t>
       </w:r>
       <w:proofErr w:type="spellStart"/>
       <w:r>
-        <w:rPr>
-          <w:sz w:val="32"/>
-          <w:szCs w:val="32"/>
-        </w:rPr>
         <w:t>Gessaya</w:t>
       </w:r>
       <w:proofErr w:type="spellEnd"/>
       <w:r>
-        <w:rPr>
-          <w:sz w:val="32"/>
-          <w:szCs w:val="32"/>
-        </w:rPr>
         <w:t>, Tvrdošín: 202</w:t>
       </w:r>
       <w:r>
-        <w:rPr>
-          <w:sz w:val="32"/>
-          <w:szCs w:val="32"/>
-        </w:rPr>
         <w:t>6</w:t>
       </w:r>
       <w:r>
-        <w:rPr>
-          <w:sz w:val="32"/>
-          <w:szCs w:val="32"/>
-        </w:rPr>
-        <w:t>. Počet strán, počet znakov.</w:t>
+        <w:t>. Počet strán</w:t>
+      </w:r>
+      <w:r>
+        <w:t>: 18</w:t>
+      </w:r>
+      <w:r>
+        <w:t>, počet znakov</w:t>
+      </w:r>
+      <w:r>
+        <w:t xml:space="preserve">: </w:t>
+      </w:r>
+      <w:r>
+        <w:t>24 194</w:t>
+      </w:r>
+      <w:r>
+        <w:t>.</w:t>
       </w:r>
     </w:p>
     <w:p>
@@ -2504,8 +2474,8 @@
         <w:rPr>
           <w:rFonts w:ascii="Times New Roman" w:hAnsi="Times New Roman" w:cs="Times New Roman"/>
           <w:color w:val="C00000"/>
-          <w:sz w:val="32"/>
-          <w:szCs w:val="32"/>
+          <w:sz w:val="24"/>
+          <w:szCs w:val="24"/>
         </w:rPr>
       </w:pPr>
     </w:p>
@@ -2514,14 +2484,16 @@
         <w:jc w:val="both"/>
         <w:rPr>
           <w:color w:val="C00000"/>
+          <w:sz w:val="24"/>
+          <w:szCs w:val="24"/>
         </w:rPr>
       </w:pPr>
       <w:r>
         <w:rPr>
           <w:rFonts w:ascii="Times New Roman" w:hAnsi="Times New Roman" w:cs="Times New Roman"/>
           <w:color w:val="000000" w:themeColor="text1"/>
-          <w:sz w:val="32"/>
-          <w:szCs w:val="32"/>
+          <w:sz w:val="24"/>
+          <w:szCs w:val="24"/>
         </w:rPr>
         <w:t xml:space="preserve">Táto práca sa zaoberá </w:t>
       </w:r>
@@ -2529,8 +2501,8 @@
         <w:rPr>
           <w:rFonts w:ascii="Times New Roman" w:hAnsi="Times New Roman" w:cs="Times New Roman"/>
           <w:color w:val="000000" w:themeColor="text1"/>
-          <w:sz w:val="32"/>
-          <w:szCs w:val="32"/>
+          <w:sz w:val="24"/>
+          <w:szCs w:val="24"/>
         </w:rPr>
         <w:t xml:space="preserve">vytvorením </w:t>
       </w:r>
@@ -2538,8 +2510,8 @@
         <w:rPr>
           <w:rFonts w:ascii="Times New Roman" w:hAnsi="Times New Roman" w:cs="Times New Roman"/>
           <w:color w:val="000000" w:themeColor="text1"/>
-          <w:sz w:val="32"/>
-          <w:szCs w:val="32"/>
+          <w:sz w:val="24"/>
+          <w:szCs w:val="24"/>
         </w:rPr>
         <w:t>online testovacieho modulu určeného pre maturantov stredných škôl. Hlavným cieľom projektu je pomôcť študentom pripraviť sa na maturitnú skúšku jednoduchou a prehľadnou formou. Systém umožňuje riešiť testy z rôznych predmetov, zobraziť</w:t>
       </w:r>
@@ -2547,8 +2519,8 @@
         <w:rPr>
           <w:rFonts w:ascii="Times New Roman" w:hAnsi="Times New Roman" w:cs="Times New Roman"/>
           <w:color w:val="000000" w:themeColor="text1"/>
-          <w:sz w:val="32"/>
-          <w:szCs w:val="32"/>
+          <w:sz w:val="24"/>
+          <w:szCs w:val="24"/>
         </w:rPr>
         <w:t xml:space="preserve"> vyhodnotenie testov priamo </w:t>
       </w:r>
@@ -2556,8 +2528,8 @@
         <w:rPr>
           <w:rFonts w:ascii="Times New Roman" w:hAnsi="Times New Roman" w:cs="Times New Roman"/>
           <w:color w:val="000000" w:themeColor="text1"/>
-          <w:sz w:val="32"/>
-          <w:szCs w:val="32"/>
+          <w:sz w:val="24"/>
+          <w:szCs w:val="24"/>
         </w:rPr>
         <w:t>po dokončení a sledovať úspešnosť používateľa. Aplikácia je prístupná z počítača aj mobil</w:t>
       </w:r>
@@ -2565,8 +2537,8 @@
         <w:rPr>
           <w:rFonts w:ascii="Times New Roman" w:hAnsi="Times New Roman" w:cs="Times New Roman"/>
           <w:color w:val="000000" w:themeColor="text1"/>
-          <w:sz w:val="32"/>
-          <w:szCs w:val="32"/>
+          <w:sz w:val="24"/>
+          <w:szCs w:val="24"/>
         </w:rPr>
         <w:t xml:space="preserve">u </w:t>
       </w:r>
@@ -2574,8 +2546,8 @@
         <w:rPr>
           <w:rFonts w:ascii="Times New Roman" w:hAnsi="Times New Roman" w:cs="Times New Roman"/>
           <w:color w:val="000000" w:themeColor="text1"/>
-          <w:sz w:val="32"/>
-          <w:szCs w:val="32"/>
+          <w:sz w:val="24"/>
+          <w:szCs w:val="24"/>
         </w:rPr>
         <w:t>a</w:t>
       </w:r>
@@ -2583,8 +2555,8 @@
         <w:rPr>
           <w:rFonts w:ascii="Times New Roman" w:hAnsi="Times New Roman" w:cs="Times New Roman"/>
           <w:color w:val="000000" w:themeColor="text1"/>
-          <w:sz w:val="32"/>
-          <w:szCs w:val="32"/>
+          <w:sz w:val="24"/>
+          <w:szCs w:val="24"/>
         </w:rPr>
         <w:t> je jednoduchá a intuitívna</w:t>
       </w:r>
@@ -2592,8 +2564,8 @@
         <w:rPr>
           <w:rFonts w:ascii="Times New Roman" w:hAnsi="Times New Roman" w:cs="Times New Roman"/>
           <w:color w:val="000000" w:themeColor="text1"/>
-          <w:sz w:val="32"/>
-          <w:szCs w:val="32"/>
+          <w:sz w:val="24"/>
+          <w:szCs w:val="24"/>
         </w:rPr>
         <w:t>. Projekt reflektuje rastúcu potrebu využívania moderných technológií vo vzdelávaní.</w:t>
       </w:r>
@@ -2695,16 +2667,16 @@
         <w:jc w:val="both"/>
         <w:rPr>
           <w:rFonts w:ascii="Times New Roman" w:eastAsia="Times New Roman" w:hAnsi="Times New Roman" w:cs="Times New Roman"/>
-          <w:sz w:val="32"/>
-          <w:szCs w:val="32"/>
+          <w:sz w:val="24"/>
+          <w:szCs w:val="24"/>
           <w:lang w:eastAsia="sk-SK"/>
         </w:rPr>
       </w:pPr>
       <w:r>
         <w:rPr>
           <w:rFonts w:ascii="Times New Roman" w:eastAsia="Times New Roman" w:hAnsi="Times New Roman" w:cs="Times New Roman"/>
-          <w:sz w:val="32"/>
-          <w:szCs w:val="32"/>
+          <w:sz w:val="24"/>
+          <w:szCs w:val="24"/>
           <w:lang w:eastAsia="sk-SK"/>
         </w:rPr>
         <w:t xml:space="preserve">ČIERNIK, Matúš: Online Test Module </w:t>
@@ -2713,8 +2685,8 @@
       <w:r>
         <w:rPr>
           <w:rFonts w:ascii="Times New Roman" w:eastAsia="Times New Roman" w:hAnsi="Times New Roman" w:cs="Times New Roman"/>
-          <w:sz w:val="32"/>
-          <w:szCs w:val="32"/>
+          <w:sz w:val="24"/>
+          <w:szCs w:val="24"/>
           <w:lang w:eastAsia="sk-SK"/>
         </w:rPr>
         <w:t>for</w:t>
@@ -2723,8 +2695,8 @@
       <w:r>
         <w:rPr>
           <w:rFonts w:ascii="Times New Roman" w:eastAsia="Times New Roman" w:hAnsi="Times New Roman" w:cs="Times New Roman"/>
-          <w:sz w:val="32"/>
-          <w:szCs w:val="32"/>
+          <w:sz w:val="24"/>
+          <w:szCs w:val="24"/>
           <w:lang w:eastAsia="sk-SK"/>
         </w:rPr>
         <w:t xml:space="preserve"> </w:t>
@@ -2733,8 +2705,8 @@
       <w:r>
         <w:rPr>
           <w:rFonts w:ascii="Times New Roman" w:eastAsia="Times New Roman" w:hAnsi="Times New Roman" w:cs="Times New Roman"/>
-          <w:sz w:val="32"/>
-          <w:szCs w:val="32"/>
+          <w:sz w:val="24"/>
+          <w:szCs w:val="24"/>
           <w:lang w:eastAsia="sk-SK"/>
         </w:rPr>
         <w:t>High</w:t>
@@ -2743,8 +2715,8 @@
       <w:r>
         <w:rPr>
           <w:rFonts w:ascii="Times New Roman" w:eastAsia="Times New Roman" w:hAnsi="Times New Roman" w:cs="Times New Roman"/>
-          <w:sz w:val="32"/>
-          <w:szCs w:val="32"/>
+          <w:sz w:val="24"/>
+          <w:szCs w:val="24"/>
           <w:lang w:eastAsia="sk-SK"/>
         </w:rPr>
         <w:t xml:space="preserve"> </w:t>
@@ -2753,8 +2725,8 @@
       <w:r>
         <w:rPr>
           <w:rFonts w:ascii="Times New Roman" w:eastAsia="Times New Roman" w:hAnsi="Times New Roman" w:cs="Times New Roman"/>
-          <w:sz w:val="32"/>
-          <w:szCs w:val="32"/>
+          <w:sz w:val="24"/>
+          <w:szCs w:val="24"/>
           <w:lang w:eastAsia="sk-SK"/>
         </w:rPr>
         <w:t>School</w:t>
@@ -2763,8 +2735,8 @@
       <w:r>
         <w:rPr>
           <w:rFonts w:ascii="Times New Roman" w:eastAsia="Times New Roman" w:hAnsi="Times New Roman" w:cs="Times New Roman"/>
-          <w:sz w:val="32"/>
-          <w:szCs w:val="32"/>
+          <w:sz w:val="24"/>
+          <w:szCs w:val="24"/>
           <w:lang w:eastAsia="sk-SK"/>
         </w:rPr>
         <w:t xml:space="preserve"> </w:t>
@@ -2773,8 +2745,8 @@
       <w:r>
         <w:rPr>
           <w:rFonts w:ascii="Times New Roman" w:eastAsia="Times New Roman" w:hAnsi="Times New Roman" w:cs="Times New Roman"/>
-          <w:sz w:val="32"/>
-          <w:szCs w:val="32"/>
+          <w:sz w:val="24"/>
+          <w:szCs w:val="24"/>
           <w:lang w:eastAsia="sk-SK"/>
         </w:rPr>
         <w:t>Graduates</w:t>
@@ -2783,8 +2755,8 @@
       <w:r>
         <w:rPr>
           <w:rFonts w:ascii="Times New Roman" w:eastAsia="Times New Roman" w:hAnsi="Times New Roman" w:cs="Times New Roman"/>
-          <w:sz w:val="32"/>
-          <w:szCs w:val="32"/>
+          <w:sz w:val="24"/>
+          <w:szCs w:val="24"/>
           <w:lang w:eastAsia="sk-SK"/>
         </w:rPr>
         <w:t xml:space="preserve">. Ignác </w:t>
@@ -2793,8 +2765,8 @@
       <w:r>
         <w:rPr>
           <w:rFonts w:ascii="Times New Roman" w:eastAsia="Times New Roman" w:hAnsi="Times New Roman" w:cs="Times New Roman"/>
-          <w:sz w:val="32"/>
-          <w:szCs w:val="32"/>
+          <w:sz w:val="24"/>
+          <w:szCs w:val="24"/>
           <w:lang w:eastAsia="sk-SK"/>
         </w:rPr>
         <w:t>Gessay</w:t>
@@ -2803,8 +2775,8 @@
       <w:r>
         <w:rPr>
           <w:rFonts w:ascii="Times New Roman" w:eastAsia="Times New Roman" w:hAnsi="Times New Roman" w:cs="Times New Roman"/>
-          <w:sz w:val="32"/>
-          <w:szCs w:val="32"/>
+          <w:sz w:val="24"/>
+          <w:szCs w:val="24"/>
           <w:lang w:eastAsia="sk-SK"/>
         </w:rPr>
         <w:t xml:space="preserve"> </w:t>
@@ -2813,8 +2785,8 @@
       <w:r>
         <w:rPr>
           <w:rFonts w:ascii="Times New Roman" w:eastAsia="Times New Roman" w:hAnsi="Times New Roman" w:cs="Times New Roman"/>
-          <w:sz w:val="32"/>
-          <w:szCs w:val="32"/>
+          <w:sz w:val="24"/>
+          <w:szCs w:val="24"/>
           <w:lang w:eastAsia="sk-SK"/>
         </w:rPr>
         <w:t>Secondary</w:t>
@@ -2823,8 +2795,8 @@
       <w:r>
         <w:rPr>
           <w:rFonts w:ascii="Times New Roman" w:eastAsia="Times New Roman" w:hAnsi="Times New Roman" w:cs="Times New Roman"/>
-          <w:sz w:val="32"/>
-          <w:szCs w:val="32"/>
+          <w:sz w:val="24"/>
+          <w:szCs w:val="24"/>
           <w:lang w:eastAsia="sk-SK"/>
         </w:rPr>
         <w:t xml:space="preserve"> </w:t>
@@ -2833,8 +2805,8 @@
       <w:r>
         <w:rPr>
           <w:rFonts w:ascii="Times New Roman" w:eastAsia="Times New Roman" w:hAnsi="Times New Roman" w:cs="Times New Roman"/>
-          <w:sz w:val="32"/>
-          <w:szCs w:val="32"/>
+          <w:sz w:val="24"/>
+          <w:szCs w:val="24"/>
           <w:lang w:eastAsia="sk-SK"/>
         </w:rPr>
         <w:t>School</w:t>
@@ -2843,8 +2815,8 @@
       <w:r>
         <w:rPr>
           <w:rFonts w:ascii="Times New Roman" w:eastAsia="Times New Roman" w:hAnsi="Times New Roman" w:cs="Times New Roman"/>
-          <w:sz w:val="32"/>
-          <w:szCs w:val="32"/>
+          <w:sz w:val="24"/>
+          <w:szCs w:val="24"/>
           <w:lang w:eastAsia="sk-SK"/>
         </w:rPr>
         <w:t xml:space="preserve"> of </w:t>
@@ -2853,8 +2825,8 @@
       <w:r>
         <w:rPr>
           <w:rFonts w:ascii="Times New Roman" w:eastAsia="Times New Roman" w:hAnsi="Times New Roman" w:cs="Times New Roman"/>
-          <w:sz w:val="32"/>
-          <w:szCs w:val="32"/>
+          <w:sz w:val="24"/>
+          <w:szCs w:val="24"/>
           <w:lang w:eastAsia="sk-SK"/>
         </w:rPr>
         <w:t>Information</w:t>
@@ -2863,8 +2835,8 @@
       <w:r>
         <w:rPr>
           <w:rFonts w:ascii="Times New Roman" w:eastAsia="Times New Roman" w:hAnsi="Times New Roman" w:cs="Times New Roman"/>
-          <w:sz w:val="32"/>
-          <w:szCs w:val="32"/>
+          <w:sz w:val="24"/>
+          <w:szCs w:val="24"/>
           <w:lang w:eastAsia="sk-SK"/>
         </w:rPr>
         <w:t xml:space="preserve"> </w:t>
@@ -2873,8 +2845,8 @@
       <w:r>
         <w:rPr>
           <w:rFonts w:ascii="Times New Roman" w:eastAsia="Times New Roman" w:hAnsi="Times New Roman" w:cs="Times New Roman"/>
-          <w:sz w:val="32"/>
-          <w:szCs w:val="32"/>
+          <w:sz w:val="24"/>
+          <w:szCs w:val="24"/>
           <w:lang w:eastAsia="sk-SK"/>
         </w:rPr>
         <w:t>Technology</w:t>
@@ -2883,8 +2855,8 @@
       <w:r>
         <w:rPr>
           <w:rFonts w:ascii="Times New Roman" w:eastAsia="Times New Roman" w:hAnsi="Times New Roman" w:cs="Times New Roman"/>
-          <w:sz w:val="32"/>
-          <w:szCs w:val="32"/>
+          <w:sz w:val="24"/>
+          <w:szCs w:val="24"/>
           <w:lang w:eastAsia="sk-SK"/>
         </w:rPr>
         <w:t>, Tvrdošín: 202</w:t>
@@ -2892,8 +2864,8 @@
       <w:r>
         <w:rPr>
           <w:rFonts w:ascii="Times New Roman" w:eastAsia="Times New Roman" w:hAnsi="Times New Roman" w:cs="Times New Roman"/>
-          <w:sz w:val="32"/>
-          <w:szCs w:val="32"/>
+          <w:sz w:val="24"/>
+          <w:szCs w:val="24"/>
           <w:lang w:eastAsia="sk-SK"/>
         </w:rPr>
         <w:t>6</w:t>
@@ -2901,10 +2873,106 @@
       <w:r>
         <w:rPr>
           <w:rFonts w:ascii="Times New Roman" w:hAnsi="Times New Roman" w:cs="Times New Roman"/>
-          <w:sz w:val="32"/>
-          <w:szCs w:val="32"/>
-        </w:rPr>
-        <w:t>. Počet strán, počet znakov.</w:t>
+          <w:sz w:val="24"/>
+          <w:szCs w:val="24"/>
+        </w:rPr>
+        <w:t xml:space="preserve">. </w:t>
+      </w:r>
+      <w:proofErr w:type="spellStart"/>
+      <w:r>
+        <w:rPr>
+          <w:rFonts w:ascii="Times New Roman" w:hAnsi="Times New Roman" w:cs="Times New Roman"/>
+          <w:sz w:val="24"/>
+          <w:szCs w:val="24"/>
+        </w:rPr>
+        <w:t>Number</w:t>
+      </w:r>
+      <w:proofErr w:type="spellEnd"/>
+      <w:r>
+        <w:rPr>
+          <w:rFonts w:ascii="Times New Roman" w:hAnsi="Times New Roman" w:cs="Times New Roman"/>
+          <w:sz w:val="24"/>
+          <w:szCs w:val="24"/>
+        </w:rPr>
+        <w:t xml:space="preserve"> of </w:t>
+      </w:r>
+      <w:proofErr w:type="spellStart"/>
+      <w:r>
+        <w:rPr>
+          <w:rFonts w:ascii="Times New Roman" w:hAnsi="Times New Roman" w:cs="Times New Roman"/>
+          <w:sz w:val="24"/>
+          <w:szCs w:val="24"/>
+        </w:rPr>
+        <w:t>pages</w:t>
+      </w:r>
+      <w:proofErr w:type="spellEnd"/>
+      <w:r>
+        <w:rPr>
+          <w:rFonts w:ascii="Times New Roman" w:hAnsi="Times New Roman" w:cs="Times New Roman"/>
+          <w:sz w:val="24"/>
+          <w:szCs w:val="24"/>
+        </w:rPr>
+        <w:t>: 18</w:t>
+      </w:r>
+      <w:r>
+        <w:rPr>
+          <w:rFonts w:ascii="Times New Roman" w:hAnsi="Times New Roman" w:cs="Times New Roman"/>
+          <w:sz w:val="24"/>
+          <w:szCs w:val="24"/>
+        </w:rPr>
+        <w:t xml:space="preserve">, </w:t>
+      </w:r>
+      <w:proofErr w:type="spellStart"/>
+      <w:r>
+        <w:rPr>
+          <w:rFonts w:ascii="Times New Roman" w:hAnsi="Times New Roman" w:cs="Times New Roman"/>
+          <w:sz w:val="24"/>
+          <w:szCs w:val="24"/>
+        </w:rPr>
+        <w:t>number</w:t>
+      </w:r>
+      <w:proofErr w:type="spellEnd"/>
+      <w:r>
+        <w:rPr>
+          <w:rFonts w:ascii="Times New Roman" w:hAnsi="Times New Roman" w:cs="Times New Roman"/>
+          <w:sz w:val="24"/>
+          <w:szCs w:val="24"/>
+        </w:rPr>
+        <w:t xml:space="preserve"> of </w:t>
+      </w:r>
+      <w:proofErr w:type="spellStart"/>
+      <w:r>
+        <w:rPr>
+          <w:rFonts w:ascii="Times New Roman" w:hAnsi="Times New Roman" w:cs="Times New Roman"/>
+          <w:sz w:val="24"/>
+          <w:szCs w:val="24"/>
+        </w:rPr>
+        <w:t>characters</w:t>
+      </w:r>
+      <w:proofErr w:type="spellEnd"/>
+      <w:r>
+        <w:rPr>
+          <w:rFonts w:ascii="Times New Roman" w:hAnsi="Times New Roman" w:cs="Times New Roman"/>
+          <w:sz w:val="24"/>
+          <w:szCs w:val="24"/>
+        </w:rPr>
+        <w:t xml:space="preserve">: </w:t>
+      </w:r>
+      <w:r>
+        <w:rPr>
+          <w:rFonts w:ascii="Times New Roman" w:hAnsi="Times New Roman" w:cs="Times New Roman"/>
+          <w:sz w:val="24"/>
+          <w:szCs w:val="24"/>
+        </w:rPr>
+        <w:t>24 194</w:t>
+      </w:r>
+      <w:r>
+        <w:rPr>
+          <w:rFonts w:ascii="Times New Roman" w:hAnsi="Times New Roman" w:cs="Times New Roman"/>
+          <w:sz w:val="24"/>
+          <w:szCs w:val="24"/>
+        </w:rPr>
+        <w:t>.</w:t>
       </w:r>
     </w:p>
     <w:p>
@@ -2913,8 +2981,8 @@
         <w:rPr>
           <w:rFonts w:ascii="Times New Roman" w:hAnsi="Times New Roman" w:cs="Times New Roman"/>
           <w:color w:val="C00000"/>
-          <w:sz w:val="32"/>
-          <w:szCs w:val="32"/>
+          <w:sz w:val="24"/>
+          <w:szCs w:val="24"/>
         </w:rPr>
       </w:pPr>
     </w:p>
@@ -2924,8 +2992,8 @@
         <w:rPr>
           <w:rFonts w:ascii="Times New Roman" w:hAnsi="Times New Roman" w:cs="Times New Roman"/>
           <w:color w:val="000000" w:themeColor="text1"/>
-          <w:sz w:val="32"/>
-          <w:szCs w:val="32"/>
+          <w:sz w:val="24"/>
+          <w:szCs w:val="24"/>
         </w:rPr>
       </w:pPr>
       <w:proofErr w:type="spellStart"/>
@@ -2933,8 +3001,8 @@
         <w:rPr>
           <w:rFonts w:ascii="Times New Roman" w:hAnsi="Times New Roman" w:cs="Times New Roman"/>
           <w:color w:val="000000" w:themeColor="text1"/>
-          <w:sz w:val="32"/>
-          <w:szCs w:val="32"/>
+          <w:sz w:val="24"/>
+          <w:szCs w:val="24"/>
         </w:rPr>
         <w:t>This</w:t>
       </w:r>
@@ -2943,8 +3011,8 @@
         <w:rPr>
           <w:rFonts w:ascii="Times New Roman" w:hAnsi="Times New Roman" w:cs="Times New Roman"/>
           <w:color w:val="000000" w:themeColor="text1"/>
-          <w:sz w:val="32"/>
-          <w:szCs w:val="32"/>
+          <w:sz w:val="24"/>
+          <w:szCs w:val="24"/>
         </w:rPr>
         <w:t xml:space="preserve"> </w:t>
       </w:r>
@@ -2953,8 +3021,8 @@
         <w:rPr>
           <w:rFonts w:ascii="Times New Roman" w:hAnsi="Times New Roman" w:cs="Times New Roman"/>
           <w:color w:val="000000" w:themeColor="text1"/>
-          <w:sz w:val="32"/>
-          <w:szCs w:val="32"/>
+          <w:sz w:val="24"/>
+          <w:szCs w:val="24"/>
         </w:rPr>
         <w:t>thesis</w:t>
       </w:r>
@@ -2963,8 +3031,8 @@
         <w:rPr>
           <w:rFonts w:ascii="Times New Roman" w:hAnsi="Times New Roman" w:cs="Times New Roman"/>
           <w:color w:val="000000" w:themeColor="text1"/>
-          <w:sz w:val="32"/>
-          <w:szCs w:val="32"/>
+          <w:sz w:val="24"/>
+          <w:szCs w:val="24"/>
         </w:rPr>
         <w:t xml:space="preserve"> </w:t>
       </w:r>
@@ -2973,8 +3041,8 @@
         <w:rPr>
           <w:rFonts w:ascii="Times New Roman" w:hAnsi="Times New Roman" w:cs="Times New Roman"/>
           <w:color w:val="000000" w:themeColor="text1"/>
-          <w:sz w:val="32"/>
-          <w:szCs w:val="32"/>
+          <w:sz w:val="24"/>
+          <w:szCs w:val="24"/>
         </w:rPr>
         <w:t>focuses</w:t>
       </w:r>
@@ -2983,8 +3051,8 @@
         <w:rPr>
           <w:rFonts w:ascii="Times New Roman" w:hAnsi="Times New Roman" w:cs="Times New Roman"/>
           <w:color w:val="000000" w:themeColor="text1"/>
-          <w:sz w:val="32"/>
-          <w:szCs w:val="32"/>
+          <w:sz w:val="24"/>
+          <w:szCs w:val="24"/>
         </w:rPr>
         <w:t xml:space="preserve"> on </w:t>
       </w:r>
@@ -2993,8 +3061,8 @@
         <w:rPr>
           <w:rFonts w:ascii="Times New Roman" w:hAnsi="Times New Roman" w:cs="Times New Roman"/>
           <w:color w:val="000000" w:themeColor="text1"/>
-          <w:sz w:val="32"/>
-          <w:szCs w:val="32"/>
+          <w:sz w:val="24"/>
+          <w:szCs w:val="24"/>
         </w:rPr>
         <w:t>the</w:t>
       </w:r>
@@ -3003,8 +3071,8 @@
         <w:rPr>
           <w:rFonts w:ascii="Times New Roman" w:hAnsi="Times New Roman" w:cs="Times New Roman"/>
           <w:color w:val="000000" w:themeColor="text1"/>
-          <w:sz w:val="32"/>
-          <w:szCs w:val="32"/>
+          <w:sz w:val="24"/>
+          <w:szCs w:val="24"/>
         </w:rPr>
         <w:t xml:space="preserve"> </w:t>
       </w:r>
@@ -3013,8 +3081,8 @@
         <w:rPr>
           <w:rFonts w:ascii="Times New Roman" w:hAnsi="Times New Roman" w:cs="Times New Roman"/>
           <w:color w:val="000000" w:themeColor="text1"/>
-          <w:sz w:val="32"/>
-          <w:szCs w:val="32"/>
+          <w:sz w:val="24"/>
+          <w:szCs w:val="24"/>
         </w:rPr>
         <w:t>development</w:t>
       </w:r>
@@ -3023,8 +3091,8 @@
         <w:rPr>
           <w:rFonts w:ascii="Times New Roman" w:hAnsi="Times New Roman" w:cs="Times New Roman"/>
           <w:color w:val="000000" w:themeColor="text1"/>
-          <w:sz w:val="32"/>
-          <w:szCs w:val="32"/>
+          <w:sz w:val="24"/>
+          <w:szCs w:val="24"/>
         </w:rPr>
         <w:t xml:space="preserve"> of </w:t>
       </w:r>
@@ -3033,8 +3101,8 @@
         <w:rPr>
           <w:rFonts w:ascii="Times New Roman" w:hAnsi="Times New Roman" w:cs="Times New Roman"/>
           <w:color w:val="000000" w:themeColor="text1"/>
-          <w:sz w:val="32"/>
-          <w:szCs w:val="32"/>
+          <w:sz w:val="24"/>
+          <w:szCs w:val="24"/>
         </w:rPr>
         <w:t>an</w:t>
       </w:r>
@@ -3043,8 +3111,8 @@
         <w:rPr>
           <w:rFonts w:ascii="Times New Roman" w:hAnsi="Times New Roman" w:cs="Times New Roman"/>
           <w:color w:val="000000" w:themeColor="text1"/>
-          <w:sz w:val="32"/>
-          <w:szCs w:val="32"/>
+          <w:sz w:val="24"/>
+          <w:szCs w:val="24"/>
         </w:rPr>
         <w:t xml:space="preserve"> online </w:t>
       </w:r>
@@ -3053,8 +3121,8 @@
         <w:rPr>
           <w:rFonts w:ascii="Times New Roman" w:hAnsi="Times New Roman" w:cs="Times New Roman"/>
           <w:color w:val="000000" w:themeColor="text1"/>
-          <w:sz w:val="32"/>
-          <w:szCs w:val="32"/>
+          <w:sz w:val="24"/>
+          <w:szCs w:val="24"/>
         </w:rPr>
         <w:t>testing</w:t>
       </w:r>
@@ -3063,8 +3131,8 @@
         <w:rPr>
           <w:rFonts w:ascii="Times New Roman" w:hAnsi="Times New Roman" w:cs="Times New Roman"/>
           <w:color w:val="000000" w:themeColor="text1"/>
-          <w:sz w:val="32"/>
-          <w:szCs w:val="32"/>
+          <w:sz w:val="24"/>
+          <w:szCs w:val="24"/>
         </w:rPr>
         <w:t xml:space="preserve"> module </w:t>
       </w:r>
@@ -3073,8 +3141,8 @@
         <w:rPr>
           <w:rFonts w:ascii="Times New Roman" w:hAnsi="Times New Roman" w:cs="Times New Roman"/>
           <w:color w:val="000000" w:themeColor="text1"/>
-          <w:sz w:val="32"/>
-          <w:szCs w:val="32"/>
+          <w:sz w:val="24"/>
+          <w:szCs w:val="24"/>
         </w:rPr>
         <w:t>intended</w:t>
       </w:r>
@@ -3083,8 +3151,8 @@
         <w:rPr>
           <w:rFonts w:ascii="Times New Roman" w:hAnsi="Times New Roman" w:cs="Times New Roman"/>
           <w:color w:val="000000" w:themeColor="text1"/>
-          <w:sz w:val="32"/>
-          <w:szCs w:val="32"/>
+          <w:sz w:val="24"/>
+          <w:szCs w:val="24"/>
         </w:rPr>
         <w:t xml:space="preserve"> </w:t>
       </w:r>
@@ -3093,8 +3161,8 @@
         <w:rPr>
           <w:rFonts w:ascii="Times New Roman" w:hAnsi="Times New Roman" w:cs="Times New Roman"/>
           <w:color w:val="000000" w:themeColor="text1"/>
-          <w:sz w:val="32"/>
-          <w:szCs w:val="32"/>
+          <w:sz w:val="24"/>
+          <w:szCs w:val="24"/>
         </w:rPr>
         <w:t>for</w:t>
       </w:r>
@@ -3103,8 +3171,8 @@
         <w:rPr>
           <w:rFonts w:ascii="Times New Roman" w:hAnsi="Times New Roman" w:cs="Times New Roman"/>
           <w:color w:val="000000" w:themeColor="text1"/>
-          <w:sz w:val="32"/>
-          <w:szCs w:val="32"/>
+          <w:sz w:val="24"/>
+          <w:szCs w:val="24"/>
         </w:rPr>
         <w:t xml:space="preserve"> </w:t>
       </w:r>
@@ -3113,8 +3181,8 @@
         <w:rPr>
           <w:rFonts w:ascii="Times New Roman" w:hAnsi="Times New Roman" w:cs="Times New Roman"/>
           <w:color w:val="000000" w:themeColor="text1"/>
-          <w:sz w:val="32"/>
-          <w:szCs w:val="32"/>
+          <w:sz w:val="24"/>
+          <w:szCs w:val="24"/>
         </w:rPr>
         <w:t>secondary</w:t>
       </w:r>
@@ -3123,8 +3191,8 @@
         <w:rPr>
           <w:rFonts w:ascii="Times New Roman" w:hAnsi="Times New Roman" w:cs="Times New Roman"/>
           <w:color w:val="000000" w:themeColor="text1"/>
-          <w:sz w:val="32"/>
-          <w:szCs w:val="32"/>
+          <w:sz w:val="24"/>
+          <w:szCs w:val="24"/>
         </w:rPr>
         <w:t xml:space="preserve"> </w:t>
       </w:r>
@@ -3133,8 +3201,8 @@
         <w:rPr>
           <w:rFonts w:ascii="Times New Roman" w:hAnsi="Times New Roman" w:cs="Times New Roman"/>
           <w:color w:val="000000" w:themeColor="text1"/>
-          <w:sz w:val="32"/>
-          <w:szCs w:val="32"/>
+          <w:sz w:val="24"/>
+          <w:szCs w:val="24"/>
         </w:rPr>
         <w:t>school</w:t>
       </w:r>
@@ -3143,8 +3211,8 @@
         <w:rPr>
           <w:rFonts w:ascii="Times New Roman" w:hAnsi="Times New Roman" w:cs="Times New Roman"/>
           <w:color w:val="000000" w:themeColor="text1"/>
-          <w:sz w:val="32"/>
-          <w:szCs w:val="32"/>
+          <w:sz w:val="24"/>
+          <w:szCs w:val="24"/>
         </w:rPr>
         <w:t xml:space="preserve"> </w:t>
       </w:r>
@@ -3153,8 +3221,8 @@
         <w:rPr>
           <w:rFonts w:ascii="Times New Roman" w:hAnsi="Times New Roman" w:cs="Times New Roman"/>
           <w:color w:val="000000" w:themeColor="text1"/>
-          <w:sz w:val="32"/>
-          <w:szCs w:val="32"/>
+          <w:sz w:val="24"/>
+          <w:szCs w:val="24"/>
         </w:rPr>
         <w:t>graduation</w:t>
       </w:r>
@@ -3163,8 +3231,8 @@
         <w:rPr>
           <w:rFonts w:ascii="Times New Roman" w:hAnsi="Times New Roman" w:cs="Times New Roman"/>
           <w:color w:val="000000" w:themeColor="text1"/>
-          <w:sz w:val="32"/>
-          <w:szCs w:val="32"/>
+          <w:sz w:val="24"/>
+          <w:szCs w:val="24"/>
         </w:rPr>
         <w:t xml:space="preserve"> </w:t>
       </w:r>
@@ -3173,8 +3241,8 @@
         <w:rPr>
           <w:rFonts w:ascii="Times New Roman" w:hAnsi="Times New Roman" w:cs="Times New Roman"/>
           <w:color w:val="000000" w:themeColor="text1"/>
-          <w:sz w:val="32"/>
-          <w:szCs w:val="32"/>
+          <w:sz w:val="24"/>
+          <w:szCs w:val="24"/>
         </w:rPr>
         <w:t>students</w:t>
       </w:r>
@@ -3183,8 +3251,8 @@
         <w:rPr>
           <w:rFonts w:ascii="Times New Roman" w:hAnsi="Times New Roman" w:cs="Times New Roman"/>
           <w:color w:val="000000" w:themeColor="text1"/>
-          <w:sz w:val="32"/>
-          <w:szCs w:val="32"/>
+          <w:sz w:val="24"/>
+          <w:szCs w:val="24"/>
         </w:rPr>
         <w:t xml:space="preserve">. </w:t>
       </w:r>
@@ -3193,8 +3261,8 @@
         <w:rPr>
           <w:rFonts w:ascii="Times New Roman" w:hAnsi="Times New Roman" w:cs="Times New Roman"/>
           <w:color w:val="000000" w:themeColor="text1"/>
-          <w:sz w:val="32"/>
-          <w:szCs w:val="32"/>
+          <w:sz w:val="24"/>
+          <w:szCs w:val="24"/>
         </w:rPr>
         <w:t>The</w:t>
       </w:r>
@@ -3203,8 +3271,8 @@
         <w:rPr>
           <w:rFonts w:ascii="Times New Roman" w:hAnsi="Times New Roman" w:cs="Times New Roman"/>
           <w:color w:val="000000" w:themeColor="text1"/>
-          <w:sz w:val="32"/>
-          <w:szCs w:val="32"/>
+          <w:sz w:val="24"/>
+          <w:szCs w:val="24"/>
         </w:rPr>
         <w:t xml:space="preserve"> </w:t>
       </w:r>
@@ -3213,8 +3281,8 @@
         <w:rPr>
           <w:rFonts w:ascii="Times New Roman" w:hAnsi="Times New Roman" w:cs="Times New Roman"/>
           <w:color w:val="000000" w:themeColor="text1"/>
-          <w:sz w:val="32"/>
-          <w:szCs w:val="32"/>
+          <w:sz w:val="24"/>
+          <w:szCs w:val="24"/>
         </w:rPr>
         <w:t>main</w:t>
       </w:r>
@@ -3223,8 +3291,8 @@
         <w:rPr>
           <w:rFonts w:ascii="Times New Roman" w:hAnsi="Times New Roman" w:cs="Times New Roman"/>
           <w:color w:val="000000" w:themeColor="text1"/>
-          <w:sz w:val="32"/>
-          <w:szCs w:val="32"/>
+          <w:sz w:val="24"/>
+          <w:szCs w:val="24"/>
         </w:rPr>
         <w:t xml:space="preserve"> </w:t>
       </w:r>
@@ -3233,8 +3301,8 @@
         <w:rPr>
           <w:rFonts w:ascii="Times New Roman" w:hAnsi="Times New Roman" w:cs="Times New Roman"/>
           <w:color w:val="000000" w:themeColor="text1"/>
-          <w:sz w:val="32"/>
-          <w:szCs w:val="32"/>
+          <w:sz w:val="24"/>
+          <w:szCs w:val="24"/>
         </w:rPr>
         <w:t>goal</w:t>
       </w:r>
@@ -3243,8 +3311,8 @@
         <w:rPr>
           <w:rFonts w:ascii="Times New Roman" w:hAnsi="Times New Roman" w:cs="Times New Roman"/>
           <w:color w:val="000000" w:themeColor="text1"/>
-          <w:sz w:val="32"/>
-          <w:szCs w:val="32"/>
+          <w:sz w:val="24"/>
+          <w:szCs w:val="24"/>
         </w:rPr>
         <w:t xml:space="preserve"> of </w:t>
       </w:r>
@@ -3253,8 +3321,8 @@
         <w:rPr>
           <w:rFonts w:ascii="Times New Roman" w:hAnsi="Times New Roman" w:cs="Times New Roman"/>
           <w:color w:val="000000" w:themeColor="text1"/>
-          <w:sz w:val="32"/>
-          <w:szCs w:val="32"/>
+          <w:sz w:val="24"/>
+          <w:szCs w:val="24"/>
         </w:rPr>
         <w:t>the</w:t>
       </w:r>
@@ -3263,8 +3331,8 @@
         <w:rPr>
           <w:rFonts w:ascii="Times New Roman" w:hAnsi="Times New Roman" w:cs="Times New Roman"/>
           <w:color w:val="000000" w:themeColor="text1"/>
-          <w:sz w:val="32"/>
-          <w:szCs w:val="32"/>
+          <w:sz w:val="24"/>
+          <w:szCs w:val="24"/>
         </w:rPr>
         <w:t xml:space="preserve"> </w:t>
       </w:r>
@@ -3273,8 +3341,8 @@
         <w:rPr>
           <w:rFonts w:ascii="Times New Roman" w:hAnsi="Times New Roman" w:cs="Times New Roman"/>
           <w:color w:val="000000" w:themeColor="text1"/>
-          <w:sz w:val="32"/>
-          <w:szCs w:val="32"/>
+          <w:sz w:val="24"/>
+          <w:szCs w:val="24"/>
         </w:rPr>
         <w:t>project</w:t>
       </w:r>
@@ -3283,8 +3351,8 @@
         <w:rPr>
           <w:rFonts w:ascii="Times New Roman" w:hAnsi="Times New Roman" w:cs="Times New Roman"/>
           <w:color w:val="000000" w:themeColor="text1"/>
-          <w:sz w:val="32"/>
-          <w:szCs w:val="32"/>
+          <w:sz w:val="24"/>
+          <w:szCs w:val="24"/>
         </w:rPr>
         <w:t xml:space="preserve"> </w:t>
       </w:r>
@@ -3293,8 +3361,8 @@
         <w:rPr>
           <w:rFonts w:ascii="Times New Roman" w:hAnsi="Times New Roman" w:cs="Times New Roman"/>
           <w:color w:val="000000" w:themeColor="text1"/>
-          <w:sz w:val="32"/>
-          <w:szCs w:val="32"/>
+          <w:sz w:val="24"/>
+          <w:szCs w:val="24"/>
         </w:rPr>
         <w:t>is</w:t>
       </w:r>
@@ -3303,8 +3371,8 @@
         <w:rPr>
           <w:rFonts w:ascii="Times New Roman" w:hAnsi="Times New Roman" w:cs="Times New Roman"/>
           <w:color w:val="000000" w:themeColor="text1"/>
-          <w:sz w:val="32"/>
-          <w:szCs w:val="32"/>
+          <w:sz w:val="24"/>
+          <w:szCs w:val="24"/>
         </w:rPr>
         <w:t xml:space="preserve"> to </w:t>
       </w:r>
@@ -3313,8 +3381,8 @@
         <w:rPr>
           <w:rFonts w:ascii="Times New Roman" w:hAnsi="Times New Roman" w:cs="Times New Roman"/>
           <w:color w:val="000000" w:themeColor="text1"/>
-          <w:sz w:val="32"/>
-          <w:szCs w:val="32"/>
+          <w:sz w:val="24"/>
+          <w:szCs w:val="24"/>
         </w:rPr>
         <w:t>help</w:t>
       </w:r>
@@ -3323,8 +3391,8 @@
         <w:rPr>
           <w:rFonts w:ascii="Times New Roman" w:hAnsi="Times New Roman" w:cs="Times New Roman"/>
           <w:color w:val="000000" w:themeColor="text1"/>
-          <w:sz w:val="32"/>
-          <w:szCs w:val="32"/>
+          <w:sz w:val="24"/>
+          <w:szCs w:val="24"/>
         </w:rPr>
         <w:t xml:space="preserve"> </w:t>
       </w:r>
@@ -3333,8 +3401,8 @@
         <w:rPr>
           <w:rFonts w:ascii="Times New Roman" w:hAnsi="Times New Roman" w:cs="Times New Roman"/>
           <w:color w:val="000000" w:themeColor="text1"/>
-          <w:sz w:val="32"/>
-          <w:szCs w:val="32"/>
+          <w:sz w:val="24"/>
+          <w:szCs w:val="24"/>
         </w:rPr>
         <w:t>students</w:t>
       </w:r>
@@ -3343,8 +3411,8 @@
         <w:rPr>
           <w:rFonts w:ascii="Times New Roman" w:hAnsi="Times New Roman" w:cs="Times New Roman"/>
           <w:color w:val="000000" w:themeColor="text1"/>
-          <w:sz w:val="32"/>
-          <w:szCs w:val="32"/>
+          <w:sz w:val="24"/>
+          <w:szCs w:val="24"/>
         </w:rPr>
         <w:t xml:space="preserve"> </w:t>
       </w:r>
@@ -3353,8 +3421,8 @@
         <w:rPr>
           <w:rFonts w:ascii="Times New Roman" w:hAnsi="Times New Roman" w:cs="Times New Roman"/>
           <w:color w:val="000000" w:themeColor="text1"/>
-          <w:sz w:val="32"/>
-          <w:szCs w:val="32"/>
+          <w:sz w:val="24"/>
+          <w:szCs w:val="24"/>
         </w:rPr>
         <w:t>prepare</w:t>
       </w:r>
@@ -3363,8 +3431,8 @@
         <w:rPr>
           <w:rFonts w:ascii="Times New Roman" w:hAnsi="Times New Roman" w:cs="Times New Roman"/>
           <w:color w:val="000000" w:themeColor="text1"/>
-          <w:sz w:val="32"/>
-          <w:szCs w:val="32"/>
+          <w:sz w:val="24"/>
+          <w:szCs w:val="24"/>
         </w:rPr>
         <w:t xml:space="preserve"> </w:t>
       </w:r>
@@ -3373,8 +3441,8 @@
         <w:rPr>
           <w:rFonts w:ascii="Times New Roman" w:hAnsi="Times New Roman" w:cs="Times New Roman"/>
           <w:color w:val="000000" w:themeColor="text1"/>
-          <w:sz w:val="32"/>
-          <w:szCs w:val="32"/>
+          <w:sz w:val="24"/>
+          <w:szCs w:val="24"/>
         </w:rPr>
         <w:t>for</w:t>
       </w:r>
@@ -3383,8 +3451,8 @@
         <w:rPr>
           <w:rFonts w:ascii="Times New Roman" w:hAnsi="Times New Roman" w:cs="Times New Roman"/>
           <w:color w:val="000000" w:themeColor="text1"/>
-          <w:sz w:val="32"/>
-          <w:szCs w:val="32"/>
+          <w:sz w:val="24"/>
+          <w:szCs w:val="24"/>
         </w:rPr>
         <w:t xml:space="preserve"> </w:t>
       </w:r>
@@ -3393,8 +3461,8 @@
         <w:rPr>
           <w:rFonts w:ascii="Times New Roman" w:hAnsi="Times New Roman" w:cs="Times New Roman"/>
           <w:color w:val="000000" w:themeColor="text1"/>
-          <w:sz w:val="32"/>
-          <w:szCs w:val="32"/>
+          <w:sz w:val="24"/>
+          <w:szCs w:val="24"/>
         </w:rPr>
         <w:t>the</w:t>
       </w:r>
@@ -3403,8 +3471,8 @@
         <w:rPr>
           <w:rFonts w:ascii="Times New Roman" w:hAnsi="Times New Roman" w:cs="Times New Roman"/>
           <w:color w:val="000000" w:themeColor="text1"/>
-          <w:sz w:val="32"/>
-          <w:szCs w:val="32"/>
+          <w:sz w:val="24"/>
+          <w:szCs w:val="24"/>
         </w:rPr>
         <w:t xml:space="preserve"> </w:t>
       </w:r>
@@ -3413,8 +3481,8 @@
         <w:rPr>
           <w:rFonts w:ascii="Times New Roman" w:hAnsi="Times New Roman" w:cs="Times New Roman"/>
           <w:color w:val="000000" w:themeColor="text1"/>
-          <w:sz w:val="32"/>
-          <w:szCs w:val="32"/>
+          <w:sz w:val="24"/>
+          <w:szCs w:val="24"/>
         </w:rPr>
         <w:t>final</w:t>
       </w:r>
@@ -3423,8 +3491,8 @@
         <w:rPr>
           <w:rFonts w:ascii="Times New Roman" w:hAnsi="Times New Roman" w:cs="Times New Roman"/>
           <w:color w:val="000000" w:themeColor="text1"/>
-          <w:sz w:val="32"/>
-          <w:szCs w:val="32"/>
+          <w:sz w:val="24"/>
+          <w:szCs w:val="24"/>
         </w:rPr>
         <w:t xml:space="preserve"> </w:t>
       </w:r>
@@ -3433,8 +3501,8 @@
         <w:rPr>
           <w:rFonts w:ascii="Times New Roman" w:hAnsi="Times New Roman" w:cs="Times New Roman"/>
           <w:color w:val="000000" w:themeColor="text1"/>
-          <w:sz w:val="32"/>
-          <w:szCs w:val="32"/>
+          <w:sz w:val="24"/>
+          <w:szCs w:val="24"/>
         </w:rPr>
         <w:t>graduation</w:t>
       </w:r>
@@ -3443,8 +3511,8 @@
         <w:rPr>
           <w:rFonts w:ascii="Times New Roman" w:hAnsi="Times New Roman" w:cs="Times New Roman"/>
           <w:color w:val="000000" w:themeColor="text1"/>
-          <w:sz w:val="32"/>
-          <w:szCs w:val="32"/>
+          <w:sz w:val="24"/>
+          <w:szCs w:val="24"/>
         </w:rPr>
         <w:t xml:space="preserve"> </w:t>
       </w:r>
@@ -3453,8 +3521,8 @@
         <w:rPr>
           <w:rFonts w:ascii="Times New Roman" w:hAnsi="Times New Roman" w:cs="Times New Roman"/>
           <w:color w:val="000000" w:themeColor="text1"/>
-          <w:sz w:val="32"/>
-          <w:szCs w:val="32"/>
+          <w:sz w:val="24"/>
+          <w:szCs w:val="24"/>
         </w:rPr>
         <w:t>exam</w:t>
       </w:r>
@@ -3463,8 +3531,8 @@
         <w:rPr>
           <w:rFonts w:ascii="Times New Roman" w:hAnsi="Times New Roman" w:cs="Times New Roman"/>
           <w:color w:val="000000" w:themeColor="text1"/>
-          <w:sz w:val="32"/>
-          <w:szCs w:val="32"/>
+          <w:sz w:val="24"/>
+          <w:szCs w:val="24"/>
         </w:rPr>
         <w:t xml:space="preserve"> in a </w:t>
       </w:r>
@@ -3473,8 +3541,8 @@
         <w:rPr>
           <w:rFonts w:ascii="Times New Roman" w:hAnsi="Times New Roman" w:cs="Times New Roman"/>
           <w:color w:val="000000" w:themeColor="text1"/>
-          <w:sz w:val="32"/>
-          <w:szCs w:val="32"/>
+          <w:sz w:val="24"/>
+          <w:szCs w:val="24"/>
         </w:rPr>
         <w:t>simple</w:t>
       </w:r>
@@ -3483,8 +3551,8 @@
         <w:rPr>
           <w:rFonts w:ascii="Times New Roman" w:hAnsi="Times New Roman" w:cs="Times New Roman"/>
           <w:color w:val="000000" w:themeColor="text1"/>
-          <w:sz w:val="32"/>
-          <w:szCs w:val="32"/>
+          <w:sz w:val="24"/>
+          <w:szCs w:val="24"/>
         </w:rPr>
         <w:t xml:space="preserve"> and </w:t>
       </w:r>
@@ -3493,8 +3561,8 @@
         <w:rPr>
           <w:rFonts w:ascii="Times New Roman" w:hAnsi="Times New Roman" w:cs="Times New Roman"/>
           <w:color w:val="000000" w:themeColor="text1"/>
-          <w:sz w:val="32"/>
-          <w:szCs w:val="32"/>
+          <w:sz w:val="24"/>
+          <w:szCs w:val="24"/>
         </w:rPr>
         <w:t>clear</w:t>
       </w:r>
@@ -3503,8 +3571,8 @@
         <w:rPr>
           <w:rFonts w:ascii="Times New Roman" w:hAnsi="Times New Roman" w:cs="Times New Roman"/>
           <w:color w:val="000000" w:themeColor="text1"/>
-          <w:sz w:val="32"/>
-          <w:szCs w:val="32"/>
+          <w:sz w:val="24"/>
+          <w:szCs w:val="24"/>
         </w:rPr>
         <w:t xml:space="preserve"> </w:t>
       </w:r>
@@ -3513,8 +3581,8 @@
         <w:rPr>
           <w:rFonts w:ascii="Times New Roman" w:hAnsi="Times New Roman" w:cs="Times New Roman"/>
           <w:color w:val="000000" w:themeColor="text1"/>
-          <w:sz w:val="32"/>
-          <w:szCs w:val="32"/>
+          <w:sz w:val="24"/>
+          <w:szCs w:val="24"/>
         </w:rPr>
         <w:t>way</w:t>
       </w:r>
@@ -3523,8 +3591,8 @@
         <w:rPr>
           <w:rFonts w:ascii="Times New Roman" w:hAnsi="Times New Roman" w:cs="Times New Roman"/>
           <w:color w:val="000000" w:themeColor="text1"/>
-          <w:sz w:val="32"/>
-          <w:szCs w:val="32"/>
+          <w:sz w:val="24"/>
+          <w:szCs w:val="24"/>
         </w:rPr>
         <w:t xml:space="preserve">. </w:t>
       </w:r>
@@ -3533,8 +3601,8 @@
         <w:rPr>
           <w:rFonts w:ascii="Times New Roman" w:hAnsi="Times New Roman" w:cs="Times New Roman"/>
           <w:color w:val="000000" w:themeColor="text1"/>
-          <w:sz w:val="32"/>
-          <w:szCs w:val="32"/>
+          <w:sz w:val="24"/>
+          <w:szCs w:val="24"/>
         </w:rPr>
         <w:t>The</w:t>
       </w:r>
@@ -3543,8 +3611,8 @@
         <w:rPr>
           <w:rFonts w:ascii="Times New Roman" w:hAnsi="Times New Roman" w:cs="Times New Roman"/>
           <w:color w:val="000000" w:themeColor="text1"/>
-          <w:sz w:val="32"/>
-          <w:szCs w:val="32"/>
+          <w:sz w:val="24"/>
+          <w:szCs w:val="24"/>
         </w:rPr>
         <w:t xml:space="preserve"> </w:t>
       </w:r>
@@ -3553,8 +3621,8 @@
         <w:rPr>
           <w:rFonts w:ascii="Times New Roman" w:hAnsi="Times New Roman" w:cs="Times New Roman"/>
           <w:color w:val="000000" w:themeColor="text1"/>
-          <w:sz w:val="32"/>
-          <w:szCs w:val="32"/>
+          <w:sz w:val="24"/>
+          <w:szCs w:val="24"/>
         </w:rPr>
         <w:t>system</w:t>
       </w:r>
@@ -3563,8 +3631,8 @@
         <w:rPr>
           <w:rFonts w:ascii="Times New Roman" w:hAnsi="Times New Roman" w:cs="Times New Roman"/>
           <w:color w:val="000000" w:themeColor="text1"/>
-          <w:sz w:val="32"/>
-          <w:szCs w:val="32"/>
+          <w:sz w:val="24"/>
+          <w:szCs w:val="24"/>
         </w:rPr>
         <w:t xml:space="preserve"> </w:t>
       </w:r>
@@ -3573,8 +3641,8 @@
         <w:rPr>
           <w:rFonts w:ascii="Times New Roman" w:hAnsi="Times New Roman" w:cs="Times New Roman"/>
           <w:color w:val="000000" w:themeColor="text1"/>
-          <w:sz w:val="32"/>
-          <w:szCs w:val="32"/>
+          <w:sz w:val="24"/>
+          <w:szCs w:val="24"/>
         </w:rPr>
         <w:t>allows</w:t>
       </w:r>
@@ -3583,8 +3651,8 @@
         <w:rPr>
           <w:rFonts w:ascii="Times New Roman" w:hAnsi="Times New Roman" w:cs="Times New Roman"/>
           <w:color w:val="000000" w:themeColor="text1"/>
-          <w:sz w:val="32"/>
-          <w:szCs w:val="32"/>
+          <w:sz w:val="24"/>
+          <w:szCs w:val="24"/>
         </w:rPr>
         <w:t xml:space="preserve"> </w:t>
       </w:r>
@@ -3593,8 +3661,8 @@
         <w:rPr>
           <w:rFonts w:ascii="Times New Roman" w:hAnsi="Times New Roman" w:cs="Times New Roman"/>
           <w:color w:val="000000" w:themeColor="text1"/>
-          <w:sz w:val="32"/>
-          <w:szCs w:val="32"/>
+          <w:sz w:val="24"/>
+          <w:szCs w:val="24"/>
         </w:rPr>
         <w:t>students</w:t>
       </w:r>
@@ -3603,8 +3671,8 @@
         <w:rPr>
           <w:rFonts w:ascii="Times New Roman" w:hAnsi="Times New Roman" w:cs="Times New Roman"/>
           <w:color w:val="000000" w:themeColor="text1"/>
-          <w:sz w:val="32"/>
-          <w:szCs w:val="32"/>
+          <w:sz w:val="24"/>
+          <w:szCs w:val="24"/>
         </w:rPr>
         <w:t xml:space="preserve"> to </w:t>
       </w:r>
@@ -3613,8 +3681,8 @@
         <w:rPr>
           <w:rFonts w:ascii="Times New Roman" w:hAnsi="Times New Roman" w:cs="Times New Roman"/>
           <w:color w:val="000000" w:themeColor="text1"/>
-          <w:sz w:val="32"/>
-          <w:szCs w:val="32"/>
+          <w:sz w:val="24"/>
+          <w:szCs w:val="24"/>
         </w:rPr>
         <w:t>complete</w:t>
       </w:r>
@@ -3623,8 +3691,8 @@
         <w:rPr>
           <w:rFonts w:ascii="Times New Roman" w:hAnsi="Times New Roman" w:cs="Times New Roman"/>
           <w:color w:val="000000" w:themeColor="text1"/>
-          <w:sz w:val="32"/>
-          <w:szCs w:val="32"/>
+          <w:sz w:val="24"/>
+          <w:szCs w:val="24"/>
         </w:rPr>
         <w:t xml:space="preserve"> </w:t>
       </w:r>
@@ -3633,8 +3701,8 @@
         <w:rPr>
           <w:rFonts w:ascii="Times New Roman" w:hAnsi="Times New Roman" w:cs="Times New Roman"/>
           <w:color w:val="000000" w:themeColor="text1"/>
-          <w:sz w:val="32"/>
-          <w:szCs w:val="32"/>
+          <w:sz w:val="24"/>
+          <w:szCs w:val="24"/>
         </w:rPr>
         <w:t>tests</w:t>
       </w:r>
@@ -3643,8 +3711,8 @@
         <w:rPr>
           <w:rFonts w:ascii="Times New Roman" w:hAnsi="Times New Roman" w:cs="Times New Roman"/>
           <w:color w:val="000000" w:themeColor="text1"/>
-          <w:sz w:val="32"/>
-          <w:szCs w:val="32"/>
+          <w:sz w:val="24"/>
+          <w:szCs w:val="24"/>
         </w:rPr>
         <w:t xml:space="preserve"> </w:t>
       </w:r>
@@ -3653,8 +3721,8 @@
         <w:rPr>
           <w:rFonts w:ascii="Times New Roman" w:hAnsi="Times New Roman" w:cs="Times New Roman"/>
           <w:color w:val="000000" w:themeColor="text1"/>
-          <w:sz w:val="32"/>
-          <w:szCs w:val="32"/>
+          <w:sz w:val="24"/>
+          <w:szCs w:val="24"/>
         </w:rPr>
         <w:t>from</w:t>
       </w:r>
@@ -3663,8 +3731,8 @@
         <w:rPr>
           <w:rFonts w:ascii="Times New Roman" w:hAnsi="Times New Roman" w:cs="Times New Roman"/>
           <w:color w:val="000000" w:themeColor="text1"/>
-          <w:sz w:val="32"/>
-          <w:szCs w:val="32"/>
+          <w:sz w:val="24"/>
+          <w:szCs w:val="24"/>
         </w:rPr>
         <w:t xml:space="preserve"> </w:t>
       </w:r>
@@ -3673,8 +3741,8 @@
         <w:rPr>
           <w:rFonts w:ascii="Times New Roman" w:hAnsi="Times New Roman" w:cs="Times New Roman"/>
           <w:color w:val="000000" w:themeColor="text1"/>
-          <w:sz w:val="32"/>
-          <w:szCs w:val="32"/>
+          <w:sz w:val="24"/>
+          <w:szCs w:val="24"/>
         </w:rPr>
         <w:t>various</w:t>
       </w:r>
@@ -3683,8 +3751,8 @@
         <w:rPr>
           <w:rFonts w:ascii="Times New Roman" w:hAnsi="Times New Roman" w:cs="Times New Roman"/>
           <w:color w:val="000000" w:themeColor="text1"/>
-          <w:sz w:val="32"/>
-          <w:szCs w:val="32"/>
+          <w:sz w:val="24"/>
+          <w:szCs w:val="24"/>
         </w:rPr>
         <w:t xml:space="preserve"> </w:t>
       </w:r>
@@ -3693,8 +3761,8 @@
         <w:rPr>
           <w:rFonts w:ascii="Times New Roman" w:hAnsi="Times New Roman" w:cs="Times New Roman"/>
           <w:color w:val="000000" w:themeColor="text1"/>
-          <w:sz w:val="32"/>
-          <w:szCs w:val="32"/>
+          <w:sz w:val="24"/>
+          <w:szCs w:val="24"/>
         </w:rPr>
         <w:t>subjects</w:t>
       </w:r>
@@ -3703,8 +3771,8 @@
         <w:rPr>
           <w:rFonts w:ascii="Times New Roman" w:hAnsi="Times New Roman" w:cs="Times New Roman"/>
           <w:color w:val="000000" w:themeColor="text1"/>
-          <w:sz w:val="32"/>
-          <w:szCs w:val="32"/>
+          <w:sz w:val="24"/>
+          <w:szCs w:val="24"/>
         </w:rPr>
         <w:t xml:space="preserve">, </w:t>
       </w:r>
@@ -3713,8 +3781,8 @@
         <w:rPr>
           <w:rFonts w:ascii="Times New Roman" w:hAnsi="Times New Roman" w:cs="Times New Roman"/>
           <w:color w:val="000000" w:themeColor="text1"/>
-          <w:sz w:val="32"/>
-          <w:szCs w:val="32"/>
+          <w:sz w:val="24"/>
+          <w:szCs w:val="24"/>
         </w:rPr>
         <w:t>view</w:t>
       </w:r>
@@ -3723,8 +3791,8 @@
         <w:rPr>
           <w:rFonts w:ascii="Times New Roman" w:hAnsi="Times New Roman" w:cs="Times New Roman"/>
           <w:color w:val="000000" w:themeColor="text1"/>
-          <w:sz w:val="32"/>
-          <w:szCs w:val="32"/>
+          <w:sz w:val="24"/>
+          <w:szCs w:val="24"/>
         </w:rPr>
         <w:t xml:space="preserve"> test </w:t>
       </w:r>
@@ -3733,8 +3801,8 @@
         <w:rPr>
           <w:rFonts w:ascii="Times New Roman" w:hAnsi="Times New Roman" w:cs="Times New Roman"/>
           <w:color w:val="000000" w:themeColor="text1"/>
-          <w:sz w:val="32"/>
-          <w:szCs w:val="32"/>
+          <w:sz w:val="24"/>
+          <w:szCs w:val="24"/>
         </w:rPr>
         <w:t>evaluations</w:t>
       </w:r>
@@ -3743,8 +3811,8 @@
         <w:rPr>
           <w:rFonts w:ascii="Times New Roman" w:hAnsi="Times New Roman" w:cs="Times New Roman"/>
           <w:color w:val="000000" w:themeColor="text1"/>
-          <w:sz w:val="32"/>
-          <w:szCs w:val="32"/>
+          <w:sz w:val="24"/>
+          <w:szCs w:val="24"/>
         </w:rPr>
         <w:t xml:space="preserve"> </w:t>
       </w:r>
@@ -3753,8 +3821,8 @@
         <w:rPr>
           <w:rFonts w:ascii="Times New Roman" w:hAnsi="Times New Roman" w:cs="Times New Roman"/>
           <w:color w:val="000000" w:themeColor="text1"/>
-          <w:sz w:val="32"/>
-          <w:szCs w:val="32"/>
+          <w:sz w:val="24"/>
+          <w:szCs w:val="24"/>
         </w:rPr>
         <w:t>immediately</w:t>
       </w:r>
@@ -3763,8 +3831,8 @@
         <w:rPr>
           <w:rFonts w:ascii="Times New Roman" w:hAnsi="Times New Roman" w:cs="Times New Roman"/>
           <w:color w:val="000000" w:themeColor="text1"/>
-          <w:sz w:val="32"/>
-          <w:szCs w:val="32"/>
+          <w:sz w:val="24"/>
+          <w:szCs w:val="24"/>
         </w:rPr>
         <w:t xml:space="preserve"> </w:t>
       </w:r>
@@ -3773,8 +3841,8 @@
         <w:rPr>
           <w:rFonts w:ascii="Times New Roman" w:hAnsi="Times New Roman" w:cs="Times New Roman"/>
           <w:color w:val="000000" w:themeColor="text1"/>
-          <w:sz w:val="32"/>
-          <w:szCs w:val="32"/>
+          <w:sz w:val="24"/>
+          <w:szCs w:val="24"/>
         </w:rPr>
         <w:t>after</w:t>
       </w:r>
@@ -3783,8 +3851,8 @@
         <w:rPr>
           <w:rFonts w:ascii="Times New Roman" w:hAnsi="Times New Roman" w:cs="Times New Roman"/>
           <w:color w:val="000000" w:themeColor="text1"/>
-          <w:sz w:val="32"/>
-          <w:szCs w:val="32"/>
+          <w:sz w:val="24"/>
+          <w:szCs w:val="24"/>
         </w:rPr>
         <w:t xml:space="preserve"> </w:t>
       </w:r>
@@ -3793,8 +3861,8 @@
         <w:rPr>
           <w:rFonts w:ascii="Times New Roman" w:hAnsi="Times New Roman" w:cs="Times New Roman"/>
           <w:color w:val="000000" w:themeColor="text1"/>
-          <w:sz w:val="32"/>
-          <w:szCs w:val="32"/>
+          <w:sz w:val="24"/>
+          <w:szCs w:val="24"/>
         </w:rPr>
         <w:t>completion</w:t>
       </w:r>
@@ -3803,8 +3871,8 @@
         <w:rPr>
           <w:rFonts w:ascii="Times New Roman" w:hAnsi="Times New Roman" w:cs="Times New Roman"/>
           <w:color w:val="000000" w:themeColor="text1"/>
-          <w:sz w:val="32"/>
-          <w:szCs w:val="32"/>
+          <w:sz w:val="24"/>
+          <w:szCs w:val="24"/>
         </w:rPr>
         <w:t xml:space="preserve">, and track </w:t>
       </w:r>
@@ -3813,8 +3881,8 @@
         <w:rPr>
           <w:rFonts w:ascii="Times New Roman" w:hAnsi="Times New Roman" w:cs="Times New Roman"/>
           <w:color w:val="000000" w:themeColor="text1"/>
-          <w:sz w:val="32"/>
-          <w:szCs w:val="32"/>
+          <w:sz w:val="24"/>
+          <w:szCs w:val="24"/>
         </w:rPr>
         <w:t>their</w:t>
       </w:r>
@@ -3823,8 +3891,8 @@
         <w:rPr>
           <w:rFonts w:ascii="Times New Roman" w:hAnsi="Times New Roman" w:cs="Times New Roman"/>
           <w:color w:val="000000" w:themeColor="text1"/>
-          <w:sz w:val="32"/>
-          <w:szCs w:val="32"/>
+          <w:sz w:val="24"/>
+          <w:szCs w:val="24"/>
         </w:rPr>
         <w:t xml:space="preserve"> </w:t>
       </w:r>
@@ -3833,8 +3901,8 @@
         <w:rPr>
           <w:rFonts w:ascii="Times New Roman" w:hAnsi="Times New Roman" w:cs="Times New Roman"/>
           <w:color w:val="000000" w:themeColor="text1"/>
-          <w:sz w:val="32"/>
-          <w:szCs w:val="32"/>
+          <w:sz w:val="24"/>
+          <w:szCs w:val="24"/>
         </w:rPr>
         <w:t>performance</w:t>
       </w:r>
@@ -3843,8 +3911,8 @@
         <w:rPr>
           <w:rFonts w:ascii="Times New Roman" w:hAnsi="Times New Roman" w:cs="Times New Roman"/>
           <w:color w:val="000000" w:themeColor="text1"/>
-          <w:sz w:val="32"/>
-          <w:szCs w:val="32"/>
+          <w:sz w:val="24"/>
+          <w:szCs w:val="24"/>
         </w:rPr>
         <w:t xml:space="preserve">. </w:t>
       </w:r>
@@ -3853,8 +3921,8 @@
         <w:rPr>
           <w:rFonts w:ascii="Times New Roman" w:hAnsi="Times New Roman" w:cs="Times New Roman"/>
           <w:color w:val="000000" w:themeColor="text1"/>
-          <w:sz w:val="32"/>
-          <w:szCs w:val="32"/>
+          <w:sz w:val="24"/>
+          <w:szCs w:val="24"/>
         </w:rPr>
         <w:t>The</w:t>
       </w:r>
@@ -3863,8 +3931,8 @@
         <w:rPr>
           <w:rFonts w:ascii="Times New Roman" w:hAnsi="Times New Roman" w:cs="Times New Roman"/>
           <w:color w:val="000000" w:themeColor="text1"/>
-          <w:sz w:val="32"/>
-          <w:szCs w:val="32"/>
+          <w:sz w:val="24"/>
+          <w:szCs w:val="24"/>
         </w:rPr>
         <w:t xml:space="preserve"> </w:t>
       </w:r>
@@ -3873,8 +3941,8 @@
         <w:rPr>
           <w:rFonts w:ascii="Times New Roman" w:hAnsi="Times New Roman" w:cs="Times New Roman"/>
           <w:color w:val="000000" w:themeColor="text1"/>
-          <w:sz w:val="32"/>
-          <w:szCs w:val="32"/>
+          <w:sz w:val="24"/>
+          <w:szCs w:val="24"/>
         </w:rPr>
         <w:t>application</w:t>
       </w:r>
@@ -3883,8 +3951,8 @@
         <w:rPr>
           <w:rFonts w:ascii="Times New Roman" w:hAnsi="Times New Roman" w:cs="Times New Roman"/>
           <w:color w:val="000000" w:themeColor="text1"/>
-          <w:sz w:val="32"/>
-          <w:szCs w:val="32"/>
+          <w:sz w:val="24"/>
+          <w:szCs w:val="24"/>
         </w:rPr>
         <w:t xml:space="preserve"> </w:t>
       </w:r>
@@ -3893,8 +3961,8 @@
         <w:rPr>
           <w:rFonts w:ascii="Times New Roman" w:hAnsi="Times New Roman" w:cs="Times New Roman"/>
           <w:color w:val="000000" w:themeColor="text1"/>
-          <w:sz w:val="32"/>
-          <w:szCs w:val="32"/>
+          <w:sz w:val="24"/>
+          <w:szCs w:val="24"/>
         </w:rPr>
         <w:t>is</w:t>
       </w:r>
@@ -3903,8 +3971,8 @@
         <w:rPr>
           <w:rFonts w:ascii="Times New Roman" w:hAnsi="Times New Roman" w:cs="Times New Roman"/>
           <w:color w:val="000000" w:themeColor="text1"/>
-          <w:sz w:val="32"/>
-          <w:szCs w:val="32"/>
+          <w:sz w:val="24"/>
+          <w:szCs w:val="24"/>
         </w:rPr>
         <w:t xml:space="preserve"> </w:t>
       </w:r>
@@ -3913,8 +3981,8 @@
         <w:rPr>
           <w:rFonts w:ascii="Times New Roman" w:hAnsi="Times New Roman" w:cs="Times New Roman"/>
           <w:color w:val="000000" w:themeColor="text1"/>
-          <w:sz w:val="32"/>
-          <w:szCs w:val="32"/>
+          <w:sz w:val="24"/>
+          <w:szCs w:val="24"/>
         </w:rPr>
         <w:t>accessible</w:t>
       </w:r>
@@ -3923,8 +3991,8 @@
         <w:rPr>
           <w:rFonts w:ascii="Times New Roman" w:hAnsi="Times New Roman" w:cs="Times New Roman"/>
           <w:color w:val="000000" w:themeColor="text1"/>
-          <w:sz w:val="32"/>
-          <w:szCs w:val="32"/>
+          <w:sz w:val="24"/>
+          <w:szCs w:val="24"/>
         </w:rPr>
         <w:t xml:space="preserve"> on </w:t>
       </w:r>
@@ -3933,8 +4001,8 @@
         <w:rPr>
           <w:rFonts w:ascii="Times New Roman" w:hAnsi="Times New Roman" w:cs="Times New Roman"/>
           <w:color w:val="000000" w:themeColor="text1"/>
-          <w:sz w:val="32"/>
-          <w:szCs w:val="32"/>
+          <w:sz w:val="24"/>
+          <w:szCs w:val="24"/>
         </w:rPr>
         <w:t>both</w:t>
       </w:r>
@@ -3943,8 +4011,8 @@
         <w:rPr>
           <w:rFonts w:ascii="Times New Roman" w:hAnsi="Times New Roman" w:cs="Times New Roman"/>
           <w:color w:val="000000" w:themeColor="text1"/>
-          <w:sz w:val="32"/>
-          <w:szCs w:val="32"/>
+          <w:sz w:val="24"/>
+          <w:szCs w:val="24"/>
         </w:rPr>
         <w:t xml:space="preserve"> desktop and mobile </w:t>
       </w:r>
@@ -3953,8 +4021,8 @@
         <w:rPr>
           <w:rFonts w:ascii="Times New Roman" w:hAnsi="Times New Roman" w:cs="Times New Roman"/>
           <w:color w:val="000000" w:themeColor="text1"/>
-          <w:sz w:val="32"/>
-          <w:szCs w:val="32"/>
+          <w:sz w:val="24"/>
+          <w:szCs w:val="24"/>
         </w:rPr>
         <w:t>devices</w:t>
       </w:r>
@@ -3963,8 +4031,8 @@
         <w:rPr>
           <w:rFonts w:ascii="Times New Roman" w:hAnsi="Times New Roman" w:cs="Times New Roman"/>
           <w:color w:val="000000" w:themeColor="text1"/>
-          <w:sz w:val="32"/>
-          <w:szCs w:val="32"/>
+          <w:sz w:val="24"/>
+          <w:szCs w:val="24"/>
         </w:rPr>
         <w:t xml:space="preserve"> and </w:t>
       </w:r>
@@ -3973,8 +4041,8 @@
         <w:rPr>
           <w:rFonts w:ascii="Times New Roman" w:hAnsi="Times New Roman" w:cs="Times New Roman"/>
           <w:color w:val="000000" w:themeColor="text1"/>
-          <w:sz w:val="32"/>
-          <w:szCs w:val="32"/>
+          <w:sz w:val="24"/>
+          <w:szCs w:val="24"/>
         </w:rPr>
         <w:t>is</w:t>
       </w:r>
@@ -3983,8 +4051,8 @@
         <w:rPr>
           <w:rFonts w:ascii="Times New Roman" w:hAnsi="Times New Roman" w:cs="Times New Roman"/>
           <w:color w:val="000000" w:themeColor="text1"/>
-          <w:sz w:val="32"/>
-          <w:szCs w:val="32"/>
+          <w:sz w:val="24"/>
+          <w:szCs w:val="24"/>
         </w:rPr>
         <w:t xml:space="preserve"> </w:t>
       </w:r>
@@ -3993,8 +4061,8 @@
         <w:rPr>
           <w:rFonts w:ascii="Times New Roman" w:hAnsi="Times New Roman" w:cs="Times New Roman"/>
           <w:color w:val="000000" w:themeColor="text1"/>
-          <w:sz w:val="32"/>
-          <w:szCs w:val="32"/>
+          <w:sz w:val="24"/>
+          <w:szCs w:val="24"/>
         </w:rPr>
         <w:t>designed</w:t>
       </w:r>
@@ -4003,8 +4071,8 @@
         <w:rPr>
           <w:rFonts w:ascii="Times New Roman" w:hAnsi="Times New Roman" w:cs="Times New Roman"/>
           <w:color w:val="000000" w:themeColor="text1"/>
-          <w:sz w:val="32"/>
-          <w:szCs w:val="32"/>
+          <w:sz w:val="24"/>
+          <w:szCs w:val="24"/>
         </w:rPr>
         <w:t xml:space="preserve"> to </w:t>
       </w:r>
@@ -4013,8 +4081,8 @@
         <w:rPr>
           <w:rFonts w:ascii="Times New Roman" w:hAnsi="Times New Roman" w:cs="Times New Roman"/>
           <w:color w:val="000000" w:themeColor="text1"/>
-          <w:sz w:val="32"/>
-          <w:szCs w:val="32"/>
+          <w:sz w:val="24"/>
+          <w:szCs w:val="24"/>
         </w:rPr>
         <w:t>be</w:t>
       </w:r>
@@ -4023,8 +4091,8 @@
         <w:rPr>
           <w:rFonts w:ascii="Times New Roman" w:hAnsi="Times New Roman" w:cs="Times New Roman"/>
           <w:color w:val="000000" w:themeColor="text1"/>
-          <w:sz w:val="32"/>
-          <w:szCs w:val="32"/>
+          <w:sz w:val="24"/>
+          <w:szCs w:val="24"/>
         </w:rPr>
         <w:t xml:space="preserve"> </w:t>
       </w:r>
@@ -4033,8 +4101,8 @@
         <w:rPr>
           <w:rFonts w:ascii="Times New Roman" w:hAnsi="Times New Roman" w:cs="Times New Roman"/>
           <w:color w:val="000000" w:themeColor="text1"/>
-          <w:sz w:val="32"/>
-          <w:szCs w:val="32"/>
+          <w:sz w:val="24"/>
+          <w:szCs w:val="24"/>
         </w:rPr>
         <w:t>simple</w:t>
       </w:r>
@@ -4043,8 +4111,8 @@
         <w:rPr>
           <w:rFonts w:ascii="Times New Roman" w:hAnsi="Times New Roman" w:cs="Times New Roman"/>
           <w:color w:val="000000" w:themeColor="text1"/>
-          <w:sz w:val="32"/>
-          <w:szCs w:val="32"/>
+          <w:sz w:val="24"/>
+          <w:szCs w:val="24"/>
         </w:rPr>
         <w:t xml:space="preserve"> and </w:t>
       </w:r>
@@ -4053,8 +4121,8 @@
         <w:rPr>
           <w:rFonts w:ascii="Times New Roman" w:hAnsi="Times New Roman" w:cs="Times New Roman"/>
           <w:color w:val="000000" w:themeColor="text1"/>
-          <w:sz w:val="32"/>
-          <w:szCs w:val="32"/>
+          <w:sz w:val="24"/>
+          <w:szCs w:val="24"/>
         </w:rPr>
         <w:t>intuitive</w:t>
       </w:r>
@@ -4063,8 +4131,8 @@
         <w:rPr>
           <w:rFonts w:ascii="Times New Roman" w:hAnsi="Times New Roman" w:cs="Times New Roman"/>
           <w:color w:val="000000" w:themeColor="text1"/>
-          <w:sz w:val="32"/>
-          <w:szCs w:val="32"/>
+          <w:sz w:val="24"/>
+          <w:szCs w:val="24"/>
         </w:rPr>
         <w:t xml:space="preserve">. </w:t>
       </w:r>
@@ -4073,8 +4141,8 @@
         <w:rPr>
           <w:rFonts w:ascii="Times New Roman" w:hAnsi="Times New Roman" w:cs="Times New Roman"/>
           <w:color w:val="000000" w:themeColor="text1"/>
-          <w:sz w:val="32"/>
-          <w:szCs w:val="32"/>
+          <w:sz w:val="24"/>
+          <w:szCs w:val="24"/>
         </w:rPr>
         <w:t>The</w:t>
       </w:r>
@@ -4083,8 +4151,8 @@
         <w:rPr>
           <w:rFonts w:ascii="Times New Roman" w:hAnsi="Times New Roman" w:cs="Times New Roman"/>
           <w:color w:val="000000" w:themeColor="text1"/>
-          <w:sz w:val="32"/>
-          <w:szCs w:val="32"/>
+          <w:sz w:val="24"/>
+          <w:szCs w:val="24"/>
         </w:rPr>
         <w:t xml:space="preserve"> </w:t>
       </w:r>
@@ -4093,8 +4161,8 @@
         <w:rPr>
           <w:rFonts w:ascii="Times New Roman" w:hAnsi="Times New Roman" w:cs="Times New Roman"/>
           <w:color w:val="000000" w:themeColor="text1"/>
-          <w:sz w:val="32"/>
-          <w:szCs w:val="32"/>
+          <w:sz w:val="24"/>
+          <w:szCs w:val="24"/>
         </w:rPr>
         <w:t>project</w:t>
       </w:r>
@@ -4103,8 +4171,8 @@
         <w:rPr>
           <w:rFonts w:ascii="Times New Roman" w:hAnsi="Times New Roman" w:cs="Times New Roman"/>
           <w:color w:val="000000" w:themeColor="text1"/>
-          <w:sz w:val="32"/>
-          <w:szCs w:val="32"/>
+          <w:sz w:val="24"/>
+          <w:szCs w:val="24"/>
         </w:rPr>
         <w:t xml:space="preserve"> </w:t>
       </w:r>
@@ -4113,8 +4181,8 @@
         <w:rPr>
           <w:rFonts w:ascii="Times New Roman" w:hAnsi="Times New Roman" w:cs="Times New Roman"/>
           <w:color w:val="000000" w:themeColor="text1"/>
-          <w:sz w:val="32"/>
-          <w:szCs w:val="32"/>
+          <w:sz w:val="24"/>
+          <w:szCs w:val="24"/>
         </w:rPr>
         <w:t>reflects</w:t>
       </w:r>
@@ -4123,8 +4191,8 @@
         <w:rPr>
           <w:rFonts w:ascii="Times New Roman" w:hAnsi="Times New Roman" w:cs="Times New Roman"/>
           <w:color w:val="000000" w:themeColor="text1"/>
-          <w:sz w:val="32"/>
-          <w:szCs w:val="32"/>
+          <w:sz w:val="24"/>
+          <w:szCs w:val="24"/>
         </w:rPr>
         <w:t xml:space="preserve"> </w:t>
       </w:r>
@@ -4133,8 +4201,8 @@
         <w:rPr>
           <w:rFonts w:ascii="Times New Roman" w:hAnsi="Times New Roman" w:cs="Times New Roman"/>
           <w:color w:val="000000" w:themeColor="text1"/>
-          <w:sz w:val="32"/>
-          <w:szCs w:val="32"/>
+          <w:sz w:val="24"/>
+          <w:szCs w:val="24"/>
         </w:rPr>
         <w:t>the</w:t>
       </w:r>
@@ -4143,8 +4211,8 @@
         <w:rPr>
           <w:rFonts w:ascii="Times New Roman" w:hAnsi="Times New Roman" w:cs="Times New Roman"/>
           <w:color w:val="000000" w:themeColor="text1"/>
-          <w:sz w:val="32"/>
-          <w:szCs w:val="32"/>
+          <w:sz w:val="24"/>
+          <w:szCs w:val="24"/>
         </w:rPr>
         <w:t xml:space="preserve"> </w:t>
       </w:r>
@@ -4153,8 +4221,8 @@
         <w:rPr>
           <w:rFonts w:ascii="Times New Roman" w:hAnsi="Times New Roman" w:cs="Times New Roman"/>
           <w:color w:val="000000" w:themeColor="text1"/>
-          <w:sz w:val="32"/>
-          <w:szCs w:val="32"/>
+          <w:sz w:val="24"/>
+          <w:szCs w:val="24"/>
         </w:rPr>
         <w:t>growing</w:t>
       </w:r>
@@ -4163,8 +4231,8 @@
         <w:rPr>
           <w:rFonts w:ascii="Times New Roman" w:hAnsi="Times New Roman" w:cs="Times New Roman"/>
           <w:color w:val="000000" w:themeColor="text1"/>
-          <w:sz w:val="32"/>
-          <w:szCs w:val="32"/>
+          <w:sz w:val="24"/>
+          <w:szCs w:val="24"/>
         </w:rPr>
         <w:t xml:space="preserve"> </w:t>
       </w:r>
@@ -4173,8 +4241,8 @@
         <w:rPr>
           <w:rFonts w:ascii="Times New Roman" w:hAnsi="Times New Roman" w:cs="Times New Roman"/>
           <w:color w:val="000000" w:themeColor="text1"/>
-          <w:sz w:val="32"/>
-          <w:szCs w:val="32"/>
+          <w:sz w:val="24"/>
+          <w:szCs w:val="24"/>
         </w:rPr>
         <w:t>need</w:t>
       </w:r>
@@ -4183,8 +4251,8 @@
         <w:rPr>
           <w:rFonts w:ascii="Times New Roman" w:hAnsi="Times New Roman" w:cs="Times New Roman"/>
           <w:color w:val="000000" w:themeColor="text1"/>
-          <w:sz w:val="32"/>
-          <w:szCs w:val="32"/>
+          <w:sz w:val="24"/>
+          <w:szCs w:val="24"/>
         </w:rPr>
         <w:t xml:space="preserve"> </w:t>
       </w:r>
@@ -4193,8 +4261,8 @@
         <w:rPr>
           <w:rFonts w:ascii="Times New Roman" w:hAnsi="Times New Roman" w:cs="Times New Roman"/>
           <w:color w:val="000000" w:themeColor="text1"/>
-          <w:sz w:val="32"/>
-          <w:szCs w:val="32"/>
+          <w:sz w:val="24"/>
+          <w:szCs w:val="24"/>
         </w:rPr>
         <w:t>for</w:t>
       </w:r>
@@ -4203,8 +4271,8 @@
         <w:rPr>
           <w:rFonts w:ascii="Times New Roman" w:hAnsi="Times New Roman" w:cs="Times New Roman"/>
           <w:color w:val="000000" w:themeColor="text1"/>
-          <w:sz w:val="32"/>
-          <w:szCs w:val="32"/>
+          <w:sz w:val="24"/>
+          <w:szCs w:val="24"/>
         </w:rPr>
         <w:t xml:space="preserve"> </w:t>
       </w:r>
@@ -4213,8 +4281,8 @@
         <w:rPr>
           <w:rFonts w:ascii="Times New Roman" w:hAnsi="Times New Roman" w:cs="Times New Roman"/>
           <w:color w:val="000000" w:themeColor="text1"/>
-          <w:sz w:val="32"/>
-          <w:szCs w:val="32"/>
+          <w:sz w:val="24"/>
+          <w:szCs w:val="24"/>
         </w:rPr>
         <w:t>the</w:t>
       </w:r>
@@ -4223,8 +4291,8 @@
         <w:rPr>
           <w:rFonts w:ascii="Times New Roman" w:hAnsi="Times New Roman" w:cs="Times New Roman"/>
           <w:color w:val="000000" w:themeColor="text1"/>
-          <w:sz w:val="32"/>
-          <w:szCs w:val="32"/>
+          <w:sz w:val="24"/>
+          <w:szCs w:val="24"/>
         </w:rPr>
         <w:t xml:space="preserve"> </w:t>
       </w:r>
@@ -4233,8 +4301,8 @@
         <w:rPr>
           <w:rFonts w:ascii="Times New Roman" w:hAnsi="Times New Roman" w:cs="Times New Roman"/>
           <w:color w:val="000000" w:themeColor="text1"/>
-          <w:sz w:val="32"/>
-          <w:szCs w:val="32"/>
+          <w:sz w:val="24"/>
+          <w:szCs w:val="24"/>
         </w:rPr>
         <w:t>use</w:t>
       </w:r>
@@ -4243,8 +4311,8 @@
         <w:rPr>
           <w:rFonts w:ascii="Times New Roman" w:hAnsi="Times New Roman" w:cs="Times New Roman"/>
           <w:color w:val="000000" w:themeColor="text1"/>
-          <w:sz w:val="32"/>
-          <w:szCs w:val="32"/>
+          <w:sz w:val="24"/>
+          <w:szCs w:val="24"/>
         </w:rPr>
         <w:t xml:space="preserve"> of </w:t>
       </w:r>
@@ -4253,8 +4321,8 @@
         <w:rPr>
           <w:rFonts w:ascii="Times New Roman" w:hAnsi="Times New Roman" w:cs="Times New Roman"/>
           <w:color w:val="000000" w:themeColor="text1"/>
-          <w:sz w:val="32"/>
-          <w:szCs w:val="32"/>
+          <w:sz w:val="24"/>
+          <w:szCs w:val="24"/>
         </w:rPr>
         <w:t>modern</w:t>
       </w:r>
@@ -4263,8 +4331,8 @@
         <w:rPr>
           <w:rFonts w:ascii="Times New Roman" w:hAnsi="Times New Roman" w:cs="Times New Roman"/>
           <w:color w:val="000000" w:themeColor="text1"/>
-          <w:sz w:val="32"/>
-          <w:szCs w:val="32"/>
+          <w:sz w:val="24"/>
+          <w:szCs w:val="24"/>
         </w:rPr>
         <w:t xml:space="preserve"> </w:t>
       </w:r>
@@ -4273,8 +4341,8 @@
         <w:rPr>
           <w:rFonts w:ascii="Times New Roman" w:hAnsi="Times New Roman" w:cs="Times New Roman"/>
           <w:color w:val="000000" w:themeColor="text1"/>
-          <w:sz w:val="32"/>
-          <w:szCs w:val="32"/>
+          <w:sz w:val="24"/>
+          <w:szCs w:val="24"/>
         </w:rPr>
         <w:t>technologies</w:t>
       </w:r>
@@ -4283,8 +4351,8 @@
         <w:rPr>
           <w:rFonts w:ascii="Times New Roman" w:hAnsi="Times New Roman" w:cs="Times New Roman"/>
           <w:color w:val="000000" w:themeColor="text1"/>
-          <w:sz w:val="32"/>
-          <w:szCs w:val="32"/>
+          <w:sz w:val="24"/>
+          <w:szCs w:val="24"/>
         </w:rPr>
         <w:t xml:space="preserve"> in </w:t>
       </w:r>
@@ -4293,8 +4361,8 @@
         <w:rPr>
           <w:rFonts w:ascii="Times New Roman" w:hAnsi="Times New Roman" w:cs="Times New Roman"/>
           <w:color w:val="000000" w:themeColor="text1"/>
-          <w:sz w:val="32"/>
-          <w:szCs w:val="32"/>
+          <w:sz w:val="24"/>
+          <w:szCs w:val="24"/>
         </w:rPr>
         <w:t>education</w:t>
       </w:r>
@@ -4303,8 +4371,8 @@
         <w:rPr>
           <w:rFonts w:ascii="Times New Roman" w:hAnsi="Times New Roman" w:cs="Times New Roman"/>
           <w:color w:val="000000" w:themeColor="text1"/>
-          <w:sz w:val="32"/>
-          <w:szCs w:val="32"/>
+          <w:sz w:val="24"/>
+          <w:szCs w:val="24"/>
         </w:rPr>
         <w:t>.</w:t>
       </w:r>
@@ -4314,6 +4382,8 @@
         <w:jc w:val="both"/>
         <w:rPr>
           <w:color w:val="C00000"/>
+          <w:sz w:val="24"/>
+          <w:szCs w:val="24"/>
         </w:rPr>
       </w:pPr>
     </w:p>
@@ -4484,7 +4554,7 @@
             </w:rPr>
             <w:fldChar w:fldCharType="separate"/>
           </w:r>
-          <w:hyperlink w:anchor="_Toc221484199" w:history="1">
+          <w:hyperlink w:anchor="_Toc221565693" w:history="1">
             <w:r>
               <w:rPr>
                 <w:rStyle w:val="Hypertextovprepojenie"/>
@@ -4507,7 +4577,7 @@
               <w:rPr>
                 <w:webHidden/>
               </w:rPr>
-              <w:instrText xml:space="preserve"> PAGEREF _Toc221484199 \h </w:instrText>
+              <w:instrText xml:space="preserve"> PAGEREF _Toc221565693 \h </w:instrText>
             </w:r>
             <w:r>
               <w:rPr>
@@ -4546,7 +4616,7 @@
               <w14:ligatures w14:val="standardContextual"/>
             </w:rPr>
           </w:pPr>
-          <w:hyperlink w:anchor="_Toc221484200" w:history="1">
+          <w:hyperlink w:anchor="_Toc221565694" w:history="1">
             <w:r>
               <w:rPr>
                 <w:rStyle w:val="Hypertextovprepojenie"/>
@@ -4586,7 +4656,7 @@
               <w:rPr>
                 <w:webHidden/>
               </w:rPr>
-              <w:instrText xml:space="preserve"> PAGEREF _Toc221484200 \h </w:instrText>
+              <w:instrText xml:space="preserve"> PAGEREF _Toc221565694 \h </w:instrText>
             </w:r>
             <w:r>
               <w:rPr>
@@ -4630,7 +4700,7 @@
               <w14:ligatures w14:val="standardContextual"/>
             </w:rPr>
           </w:pPr>
-          <w:hyperlink w:anchor="_Toc221484201" w:history="1">
+          <w:hyperlink w:anchor="_Toc221565695" w:history="1">
             <w:r>
               <w:rPr>
                 <w:rStyle w:val="Hypertextovprepojenie"/>
@@ -4676,7 +4746,7 @@
                 <w:noProof/>
                 <w:webHidden/>
               </w:rPr>
-              <w:instrText xml:space="preserve"> PAGEREF _Toc221484201 \h </w:instrText>
+              <w:instrText xml:space="preserve"> PAGEREF _Toc221565695 \h </w:instrText>
             </w:r>
             <w:r>
               <w:rPr>
@@ -4724,7 +4794,7 @@
               <w14:ligatures w14:val="standardContextual"/>
             </w:rPr>
           </w:pPr>
-          <w:hyperlink w:anchor="_Toc221484202" w:history="1">
+          <w:hyperlink w:anchor="_Toc221565696" w:history="1">
             <w:r>
               <w:rPr>
                 <w:rStyle w:val="Hypertextovprepojenie"/>
@@ -4770,7 +4840,7 @@
                 <w:noProof/>
                 <w:webHidden/>
               </w:rPr>
-              <w:instrText xml:space="preserve"> PAGEREF _Toc221484202 \h </w:instrText>
+              <w:instrText xml:space="preserve"> PAGEREF _Toc221565696 \h </w:instrText>
             </w:r>
             <w:r>
               <w:rPr>
@@ -4818,7 +4888,7 @@
               <w14:ligatures w14:val="standardContextual"/>
             </w:rPr>
           </w:pPr>
-          <w:hyperlink w:anchor="_Toc221484203" w:history="1">
+          <w:hyperlink w:anchor="_Toc221565697" w:history="1">
             <w:r>
               <w:rPr>
                 <w:rStyle w:val="Hypertextovprepojenie"/>
@@ -4864,7 +4934,7 @@
                 <w:noProof/>
                 <w:webHidden/>
               </w:rPr>
-              <w:instrText xml:space="preserve"> PAGEREF _Toc221484203 \h </w:instrText>
+              <w:instrText xml:space="preserve"> PAGEREF _Toc221565697 \h </w:instrText>
             </w:r>
             <w:r>
               <w:rPr>
@@ -4907,7 +4977,7 @@
               <w14:ligatures w14:val="standardContextual"/>
             </w:rPr>
           </w:pPr>
-          <w:hyperlink w:anchor="_Toc221484204" w:history="1">
+          <w:hyperlink w:anchor="_Toc221565698" w:history="1">
             <w:r>
               <w:rPr>
                 <w:rStyle w:val="Hypertextovprepojenie"/>
@@ -4947,7 +5017,7 @@
               <w:rPr>
                 <w:webHidden/>
               </w:rPr>
-              <w:instrText xml:space="preserve"> PAGEREF _Toc221484204 \h </w:instrText>
+              <w:instrText xml:space="preserve"> PAGEREF _Toc221565698 \h </w:instrText>
             </w:r>
             <w:r>
               <w:rPr>
@@ -4991,7 +5061,7 @@
               <w14:ligatures w14:val="standardContextual"/>
             </w:rPr>
           </w:pPr>
-          <w:hyperlink w:anchor="_Toc221484205" w:history="1">
+          <w:hyperlink w:anchor="_Toc221565699" w:history="1">
             <w:r>
               <w:rPr>
                 <w:rStyle w:val="Hypertextovprepojenie"/>
@@ -5037,7 +5107,7 @@
                 <w:noProof/>
                 <w:webHidden/>
               </w:rPr>
-              <w:instrText xml:space="preserve"> PAGEREF _Toc221484205 \h </w:instrText>
+              <w:instrText xml:space="preserve"> PAGEREF _Toc221565699 \h </w:instrText>
             </w:r>
             <w:r>
               <w:rPr>
@@ -5080,7 +5150,7 @@
               <w14:ligatures w14:val="standardContextual"/>
             </w:rPr>
           </w:pPr>
-          <w:hyperlink w:anchor="_Toc221484206" w:history="1">
+          <w:hyperlink w:anchor="_Toc221565700" w:history="1">
             <w:r>
               <w:rPr>
                 <w:rStyle w:val="Hypertextovprepojenie"/>
@@ -5120,7 +5190,7 @@
               <w:rPr>
                 <w:webHidden/>
               </w:rPr>
-              <w:instrText xml:space="preserve"> PAGEREF _Toc221484206 \h </w:instrText>
+              <w:instrText xml:space="preserve"> PAGEREF _Toc221565700 \h </w:instrText>
             </w:r>
             <w:r>
               <w:rPr>
@@ -5159,7 +5229,7 @@
               <w14:ligatures w14:val="standardContextual"/>
             </w:rPr>
           </w:pPr>
-          <w:hyperlink w:anchor="_Toc221484207" w:history="1">
+          <w:hyperlink w:anchor="_Toc221565701" w:history="1">
             <w:r>
               <w:rPr>
                 <w:rStyle w:val="Hypertextovprepojenie"/>
@@ -5199,7 +5269,7 @@
               <w:rPr>
                 <w:webHidden/>
               </w:rPr>
-              <w:instrText xml:space="preserve"> PAGEREF _Toc221484207 \h </w:instrText>
+              <w:instrText xml:space="preserve"> PAGEREF _Toc221565701 \h </w:instrText>
             </w:r>
             <w:r>
               <w:rPr>
@@ -5243,7 +5313,7 @@
               <w14:ligatures w14:val="standardContextual"/>
             </w:rPr>
           </w:pPr>
-          <w:hyperlink w:anchor="_Toc221484208" w:history="1">
+          <w:hyperlink w:anchor="_Toc221565702" w:history="1">
             <w:r>
               <w:rPr>
                 <w:rStyle w:val="Hypertextovprepojenie"/>
@@ -5289,7 +5359,7 @@
                 <w:noProof/>
                 <w:webHidden/>
               </w:rPr>
-              <w:instrText xml:space="preserve"> PAGEREF _Toc221484208 \h </w:instrText>
+              <w:instrText xml:space="preserve"> PAGEREF _Toc221565702 \h </w:instrText>
             </w:r>
             <w:r>
               <w:rPr>
@@ -5332,7 +5402,7 @@
               <w14:ligatures w14:val="standardContextual"/>
             </w:rPr>
           </w:pPr>
-          <w:hyperlink w:anchor="_Toc221484209" w:history="1">
+          <w:hyperlink w:anchor="_Toc221565703" w:history="1">
             <w:r>
               <w:rPr>
                 <w:rStyle w:val="Hypertextovprepojenie"/>
@@ -5372,7 +5442,7 @@
               <w:rPr>
                 <w:webHidden/>
               </w:rPr>
-              <w:instrText xml:space="preserve"> PAGEREF _Toc221484209 \h </w:instrText>
+              <w:instrText xml:space="preserve"> PAGEREF _Toc221565703 \h </w:instrText>
             </w:r>
             <w:r>
               <w:rPr>
@@ -5411,7 +5481,7 @@
               <w14:ligatures w14:val="standardContextual"/>
             </w:rPr>
           </w:pPr>
-          <w:hyperlink w:anchor="_Toc221484210" w:history="1">
+          <w:hyperlink w:anchor="_Toc221565704" w:history="1">
             <w:r>
               <w:rPr>
                 <w:rStyle w:val="Hypertextovprepojenie"/>
@@ -5451,7 +5521,7 @@
               <w:rPr>
                 <w:webHidden/>
               </w:rPr>
-              <w:instrText xml:space="preserve"> PAGEREF _Toc221484210 \h </w:instrText>
+              <w:instrText xml:space="preserve"> PAGEREF _Toc221565704 \h </w:instrText>
             </w:r>
             <w:r>
               <w:rPr>
@@ -5495,7 +5565,7 @@
               <w14:ligatures w14:val="standardContextual"/>
             </w:rPr>
           </w:pPr>
-          <w:hyperlink w:anchor="_Toc221484211" w:history="1">
+          <w:hyperlink w:anchor="_Toc221565705" w:history="1">
             <w:r>
               <w:rPr>
                 <w:rStyle w:val="Hypertextovprepojenie"/>
@@ -5541,7 +5611,7 @@
                 <w:noProof/>
                 <w:webHidden/>
               </w:rPr>
-              <w:instrText xml:space="preserve"> PAGEREF _Toc221484211 \h </w:instrText>
+              <w:instrText xml:space="preserve"> PAGEREF _Toc221565705 \h </w:instrText>
             </w:r>
             <w:r>
               <w:rPr>
@@ -5589,7 +5659,7 @@
               <w14:ligatures w14:val="standardContextual"/>
             </w:rPr>
           </w:pPr>
-          <w:hyperlink w:anchor="_Toc221484212" w:history="1">
+          <w:hyperlink w:anchor="_Toc221565706" w:history="1">
             <w:r>
               <w:rPr>
                 <w:rStyle w:val="Hypertextovprepojenie"/>
@@ -5635,7 +5705,7 @@
                 <w:noProof/>
                 <w:webHidden/>
               </w:rPr>
-              <w:instrText xml:space="preserve"> PAGEREF _Toc221484212 \h </w:instrText>
+              <w:instrText xml:space="preserve"> PAGEREF _Toc221565706 \h </w:instrText>
             </w:r>
             <w:r>
               <w:rPr>
@@ -5678,7 +5748,7 @@
               <w14:ligatures w14:val="standardContextual"/>
             </w:rPr>
           </w:pPr>
-          <w:hyperlink w:anchor="_Toc221484213" w:history="1">
+          <w:hyperlink w:anchor="_Toc221565707" w:history="1">
             <w:r>
               <w:rPr>
                 <w:rStyle w:val="Hypertextovprepojenie"/>
@@ -5718,7 +5788,7 @@
               <w:rPr>
                 <w:webHidden/>
               </w:rPr>
-              <w:instrText xml:space="preserve"> PAGEREF _Toc221484213 \h </w:instrText>
+              <w:instrText xml:space="preserve"> PAGEREF _Toc221565707 \h </w:instrText>
             </w:r>
             <w:r>
               <w:rPr>
@@ -5762,7 +5832,7 @@
               <w14:ligatures w14:val="standardContextual"/>
             </w:rPr>
           </w:pPr>
-          <w:hyperlink w:anchor="_Toc221484214" w:history="1">
+          <w:hyperlink w:anchor="_Toc221565708" w:history="1">
             <w:r>
               <w:rPr>
                 <w:rStyle w:val="Hypertextovprepojenie"/>
@@ -5808,7 +5878,7 @@
                 <w:noProof/>
                 <w:webHidden/>
               </w:rPr>
-              <w:instrText xml:space="preserve"> PAGEREF _Toc221484214 \h </w:instrText>
+              <w:instrText xml:space="preserve"> PAGEREF _Toc221565708 \h </w:instrText>
             </w:r>
             <w:r>
               <w:rPr>
@@ -5856,7 +5926,7 @@
               <w14:ligatures w14:val="standardContextual"/>
             </w:rPr>
           </w:pPr>
-          <w:hyperlink w:anchor="_Toc221484215" w:history="1">
+          <w:hyperlink w:anchor="_Toc221565709" w:history="1">
             <w:r>
               <w:rPr>
                 <w:rStyle w:val="Hypertextovprepojenie"/>
@@ -5902,7 +5972,7 @@
                 <w:noProof/>
                 <w:webHidden/>
               </w:rPr>
-              <w:instrText xml:space="preserve"> PAGEREF _Toc221484215 \h </w:instrText>
+              <w:instrText xml:space="preserve"> PAGEREF _Toc221565709 \h </w:instrText>
             </w:r>
             <w:r>
               <w:rPr>
@@ -5945,7 +6015,7 @@
               <w14:ligatures w14:val="standardContextual"/>
             </w:rPr>
           </w:pPr>
-          <w:hyperlink w:anchor="_Toc221484216" w:history="1">
+          <w:hyperlink w:anchor="_Toc221565710" w:history="1">
             <w:r>
               <w:rPr>
                 <w:rStyle w:val="Hypertextovprepojenie"/>
@@ -5985,7 +6055,7 @@
               <w:rPr>
                 <w:webHidden/>
               </w:rPr>
-              <w:instrText xml:space="preserve"> PAGEREF _Toc221484216 \h </w:instrText>
+              <w:instrText xml:space="preserve"> PAGEREF _Toc221565710 \h </w:instrText>
             </w:r>
             <w:r>
               <w:rPr>
@@ -6024,7 +6094,7 @@
               <w14:ligatures w14:val="standardContextual"/>
             </w:rPr>
           </w:pPr>
-          <w:hyperlink w:anchor="_Toc221484217" w:history="1">
+          <w:hyperlink w:anchor="_Toc221565711" w:history="1">
             <w:r>
               <w:rPr>
                 <w:rStyle w:val="Hypertextovprepojenie"/>
@@ -6064,7 +6134,7 @@
               <w:rPr>
                 <w:webHidden/>
               </w:rPr>
-              <w:instrText xml:space="preserve"> PAGEREF _Toc221484217 \h </w:instrText>
+              <w:instrText xml:space="preserve"> PAGEREF _Toc221565711 \h </w:instrText>
             </w:r>
             <w:r>
               <w:rPr>
@@ -6103,7 +6173,7 @@
               <w14:ligatures w14:val="standardContextual"/>
             </w:rPr>
           </w:pPr>
-          <w:hyperlink w:anchor="_Toc221484218" w:history="1">
+          <w:hyperlink w:anchor="_Toc221565712" w:history="1">
             <w:r>
               <w:rPr>
                 <w:rStyle w:val="Hypertextovprepojenie"/>
@@ -6143,7 +6213,7 @@
               <w:rPr>
                 <w:webHidden/>
               </w:rPr>
-              <w:instrText xml:space="preserve"> PAGEREF _Toc221484218 \h </w:instrText>
+              <w:instrText xml:space="preserve"> PAGEREF _Toc221565712 \h </w:instrText>
             </w:r>
             <w:r>
               <w:rPr>
@@ -6187,7 +6257,7 @@
               <w14:ligatures w14:val="standardContextual"/>
             </w:rPr>
           </w:pPr>
-          <w:hyperlink w:anchor="_Toc221484219" w:history="1">
+          <w:hyperlink w:anchor="_Toc221565713" w:history="1">
             <w:r>
               <w:rPr>
                 <w:rStyle w:val="Hypertextovprepojenie"/>
@@ -6233,7 +6303,7 @@
                 <w:noProof/>
                 <w:webHidden/>
               </w:rPr>
-              <w:instrText xml:space="preserve"> PAGEREF _Toc221484219 \h </w:instrText>
+              <w:instrText xml:space="preserve"> PAGEREF _Toc221565713 \h </w:instrText>
             </w:r>
             <w:r>
               <w:rPr>
@@ -6276,7 +6346,7 @@
               <w14:ligatures w14:val="standardContextual"/>
             </w:rPr>
           </w:pPr>
-          <w:hyperlink w:anchor="_Toc221484220" w:history="1">
+          <w:hyperlink w:anchor="_Toc221565714" w:history="1">
             <w:r>
               <w:rPr>
                 <w:rStyle w:val="Hypertextovprepojenie"/>
@@ -6316,7 +6386,7 @@
               <w:rPr>
                 <w:webHidden/>
               </w:rPr>
-              <w:instrText xml:space="preserve"> PAGEREF _Toc221484220 \h </w:instrText>
+              <w:instrText xml:space="preserve"> PAGEREF _Toc221565714 \h </w:instrText>
             </w:r>
             <w:r>
               <w:rPr>
@@ -6360,7 +6430,7 @@
               <w14:ligatures w14:val="standardContextual"/>
             </w:rPr>
           </w:pPr>
-          <w:hyperlink w:anchor="_Toc221484221" w:history="1">
+          <w:hyperlink w:anchor="_Toc221565715" w:history="1">
             <w:r>
               <w:rPr>
                 <w:rStyle w:val="Hypertextovprepojenie"/>
@@ -6406,7 +6476,7 @@
                 <w:noProof/>
                 <w:webHidden/>
               </w:rPr>
-              <w:instrText xml:space="preserve"> PAGEREF _Toc221484221 \h </w:instrText>
+              <w:instrText xml:space="preserve"> PAGEREF _Toc221565715 \h </w:instrText>
             </w:r>
             <w:r>
               <w:rPr>
@@ -6449,7 +6519,7 @@
               <w14:ligatures w14:val="standardContextual"/>
             </w:rPr>
           </w:pPr>
-          <w:hyperlink w:anchor="_Toc221484222" w:history="1">
+          <w:hyperlink w:anchor="_Toc221565716" w:history="1">
             <w:r>
               <w:rPr>
                 <w:rStyle w:val="Hypertextovprepojenie"/>
@@ -6489,7 +6559,7 @@
               <w:rPr>
                 <w:webHidden/>
               </w:rPr>
-              <w:instrText xml:space="preserve"> PAGEREF _Toc221484222 \h </w:instrText>
+              <w:instrText xml:space="preserve"> PAGEREF _Toc221565716 \h </w:instrText>
             </w:r>
             <w:r>
               <w:rPr>
@@ -6528,7 +6598,7 @@
               <w14:ligatures w14:val="standardContextual"/>
             </w:rPr>
           </w:pPr>
-          <w:hyperlink w:anchor="_Toc221484223" w:history="1">
+          <w:hyperlink w:anchor="_Toc221565717" w:history="1">
             <w:r>
               <w:rPr>
                 <w:rStyle w:val="Hypertextovprepojenie"/>
@@ -6568,7 +6638,7 @@
               <w:rPr>
                 <w:webHidden/>
               </w:rPr>
-              <w:instrText xml:space="preserve"> PAGEREF _Toc221484223 \h </w:instrText>
+              <w:instrText xml:space="preserve"> PAGEREF _Toc221565717 \h </w:instrText>
             </w:r>
             <w:r>
               <w:rPr>
@@ -6607,7 +6677,7 @@
               <w14:ligatures w14:val="standardContextual"/>
             </w:rPr>
           </w:pPr>
-          <w:hyperlink w:anchor="_Toc221484224" w:history="1">
+          <w:hyperlink w:anchor="_Toc221565718" w:history="1">
             <w:r>
               <w:rPr>
                 <w:rStyle w:val="Hypertextovprepojenie"/>
@@ -6647,7 +6717,7 @@
               <w:rPr>
                 <w:webHidden/>
               </w:rPr>
-              <w:instrText xml:space="preserve"> PAGEREF _Toc221484224 \h </w:instrText>
+              <w:instrText xml:space="preserve"> PAGEREF _Toc221565718 \h </w:instrText>
             </w:r>
             <w:r>
               <w:rPr>
@@ -6686,7 +6756,7 @@
               <w14:ligatures w14:val="standardContextual"/>
             </w:rPr>
           </w:pPr>
-          <w:hyperlink w:anchor="_Toc221484225" w:history="1">
+          <w:hyperlink w:anchor="_Toc221565719" w:history="1">
             <w:r>
               <w:rPr>
                 <w:rStyle w:val="Hypertextovprepojenie"/>
@@ -6726,7 +6796,7 @@
               <w:rPr>
                 <w:webHidden/>
               </w:rPr>
-              <w:instrText xml:space="preserve"> PAGEREF _Toc221484225 \h </w:instrText>
+              <w:instrText xml:space="preserve"> PAGEREF _Toc221565719 \h </w:instrText>
             </w:r>
             <w:r>
               <w:rPr>
@@ -6770,7 +6840,7 @@
               <w14:ligatures w14:val="standardContextual"/>
             </w:rPr>
           </w:pPr>
-          <w:hyperlink w:anchor="_Toc221484226" w:history="1">
+          <w:hyperlink w:anchor="_Toc221565720" w:history="1">
             <w:r>
               <w:rPr>
                 <w:rStyle w:val="Hypertextovprepojenie"/>
@@ -6816,7 +6886,7 @@
                 <w:noProof/>
                 <w:webHidden/>
               </w:rPr>
-              <w:instrText xml:space="preserve"> PAGEREF _Toc221484226 \h </w:instrText>
+              <w:instrText xml:space="preserve"> PAGEREF _Toc221565720 \h </w:instrText>
             </w:r>
             <w:r>
               <w:rPr>
@@ -6859,7 +6929,7 @@
               <w14:ligatures w14:val="standardContextual"/>
             </w:rPr>
           </w:pPr>
-          <w:hyperlink w:anchor="_Toc221484227" w:history="1">
+          <w:hyperlink w:anchor="_Toc221565721" w:history="1">
             <w:r>
               <w:rPr>
                 <w:rStyle w:val="Hypertextovprepojenie"/>
@@ -6899,7 +6969,7 @@
               <w:rPr>
                 <w:webHidden/>
               </w:rPr>
-              <w:instrText xml:space="preserve"> PAGEREF _Toc221484227 \h </w:instrText>
+              <w:instrText xml:space="preserve"> PAGEREF _Toc221565721 \h </w:instrText>
             </w:r>
             <w:r>
               <w:rPr>
@@ -6938,7 +7008,7 @@
               <w14:ligatures w14:val="standardContextual"/>
             </w:rPr>
           </w:pPr>
-          <w:hyperlink w:anchor="_Toc221484228" w:history="1">
+          <w:hyperlink w:anchor="_Toc221565722" w:history="1">
             <w:r>
               <w:rPr>
                 <w:rStyle w:val="Hypertextovprepojenie"/>
@@ -6978,7 +7048,7 @@
               <w:rPr>
                 <w:webHidden/>
               </w:rPr>
-              <w:instrText xml:space="preserve"> PAGEREF _Toc221484228 \h </w:instrText>
+              <w:instrText xml:space="preserve"> PAGEREF _Toc221565722 \h </w:instrText>
             </w:r>
             <w:r>
               <w:rPr>
@@ -7017,7 +7087,7 @@
               <w14:ligatures w14:val="standardContextual"/>
             </w:rPr>
           </w:pPr>
-          <w:hyperlink w:anchor="_Toc221484229" w:history="1">
+          <w:hyperlink w:anchor="_Toc221565723" w:history="1">
             <w:r>
               <w:rPr>
                 <w:rStyle w:val="Hypertextovprepojenie"/>
@@ -7057,7 +7127,7 @@
               <w:rPr>
                 <w:webHidden/>
               </w:rPr>
-              <w:instrText xml:space="preserve"> PAGEREF _Toc221484229 \h </w:instrText>
+              <w:instrText xml:space="preserve"> PAGEREF _Toc221565723 \h </w:instrText>
             </w:r>
             <w:r>
               <w:rPr>
@@ -7096,7 +7166,7 @@
               <w14:ligatures w14:val="standardContextual"/>
             </w:rPr>
           </w:pPr>
-          <w:hyperlink w:anchor="_Toc221484230" w:history="1">
+          <w:hyperlink w:anchor="_Toc221565724" w:history="1">
             <w:r>
               <w:rPr>
                 <w:rStyle w:val="Hypertextovprepojenie"/>
@@ -7136,7 +7206,7 @@
               <w:rPr>
                 <w:webHidden/>
               </w:rPr>
-              <w:instrText xml:space="preserve"> PAGEREF _Toc221484230 \h </w:instrText>
+              <w:instrText xml:space="preserve"> PAGEREF _Toc221565724 \h </w:instrText>
             </w:r>
             <w:r>
               <w:rPr>
@@ -7175,7 +7245,7 @@
               <w14:ligatures w14:val="standardContextual"/>
             </w:rPr>
           </w:pPr>
-          <w:hyperlink w:anchor="_Toc221484231" w:history="1">
+          <w:hyperlink w:anchor="_Toc221565725" w:history="1">
             <w:r>
               <w:rPr>
                 <w:rStyle w:val="Hypertextovprepojenie"/>
@@ -7215,7 +7285,7 @@
               <w:rPr>
                 <w:webHidden/>
               </w:rPr>
-              <w:instrText xml:space="preserve"> PAGEREF _Toc221484231 \h </w:instrText>
+              <w:instrText xml:space="preserve"> PAGEREF _Toc221565725 \h </w:instrText>
             </w:r>
             <w:r>
               <w:rPr>
@@ -7254,7 +7324,7 @@
               <w14:ligatures w14:val="standardContextual"/>
             </w:rPr>
           </w:pPr>
-          <w:hyperlink w:anchor="_Toc221484232" w:history="1">
+          <w:hyperlink w:anchor="_Toc221565726" w:history="1">
             <w:r>
               <w:rPr>
                 <w:rStyle w:val="Hypertextovprepojenie"/>
@@ -7294,7 +7364,7 @@
               <w:rPr>
                 <w:webHidden/>
               </w:rPr>
-              <w:instrText xml:space="preserve"> PAGEREF _Toc221484232 \h </w:instrText>
+              <w:instrText xml:space="preserve"> PAGEREF _Toc221565726 \h </w:instrText>
             </w:r>
             <w:r>
               <w:rPr>
@@ -7333,7 +7403,7 @@
               <w14:ligatures w14:val="standardContextual"/>
             </w:rPr>
           </w:pPr>
-          <w:hyperlink w:anchor="_Toc221484233" w:history="1">
+          <w:hyperlink w:anchor="_Toc221565727" w:history="1">
             <w:r>
               <w:rPr>
                 <w:rStyle w:val="Hypertextovprepojenie"/>
@@ -7373,7 +7443,7 @@
               <w:rPr>
                 <w:webHidden/>
               </w:rPr>
-              <w:instrText xml:space="preserve"> PAGEREF _Toc221484233 \h </w:instrText>
+              <w:instrText xml:space="preserve"> PAGEREF _Toc221565727 \h </w:instrText>
             </w:r>
             <w:r>
               <w:rPr>
@@ -7412,7 +7482,7 @@
               <w14:ligatures w14:val="standardContextual"/>
             </w:rPr>
           </w:pPr>
-          <w:hyperlink w:anchor="_Toc221484234" w:history="1">
+          <w:hyperlink w:anchor="_Toc221565728" w:history="1">
             <w:r>
               <w:rPr>
                 <w:rStyle w:val="Hypertextovprepojenie"/>
@@ -7452,7 +7522,7 @@
               <w:rPr>
                 <w:webHidden/>
               </w:rPr>
-              <w:instrText xml:space="preserve"> PAGEREF _Toc221484234 \h </w:instrText>
+              <w:instrText xml:space="preserve"> PAGEREF _Toc221565728 \h </w:instrText>
             </w:r>
             <w:r>
               <w:rPr>
@@ -7491,7 +7561,7 @@
               <w14:ligatures w14:val="standardContextual"/>
             </w:rPr>
           </w:pPr>
-          <w:hyperlink w:anchor="_Toc221484235" w:history="1">
+          <w:hyperlink w:anchor="_Toc221565729" w:history="1">
             <w:r>
               <w:rPr>
                 <w:rStyle w:val="Hypertextovprepojenie"/>
@@ -7514,7 +7584,7 @@
               <w:rPr>
                 <w:webHidden/>
               </w:rPr>
-              <w:instrText xml:space="preserve"> PAGEREF _Toc221484235 \h </w:instrText>
+              <w:instrText xml:space="preserve"> PAGEREF _Toc221565729 \h </w:instrText>
             </w:r>
             <w:r>
               <w:rPr>
@@ -7553,7 +7623,7 @@
               <w14:ligatures w14:val="standardContextual"/>
             </w:rPr>
           </w:pPr>
-          <w:hyperlink w:anchor="_Toc221484236" w:history="1">
+          <w:hyperlink w:anchor="_Toc221565730" w:history="1">
             <w:r>
               <w:rPr>
                 <w:rStyle w:val="Hypertextovprepojenie"/>
@@ -7576,7 +7646,7 @@
               <w:rPr>
                 <w:webHidden/>
               </w:rPr>
-              <w:instrText xml:space="preserve"> PAGEREF _Toc221484236 \h </w:instrText>
+              <w:instrText xml:space="preserve"> PAGEREF _Toc221565730 \h </w:instrText>
             </w:r>
             <w:r>
               <w:rPr>
@@ -7626,6 +7696,23 @@
       <w:pPr>
         <w:rPr>
           <w:rFonts w:ascii="Times New Roman" w:hAnsi="Times New Roman" w:cs="Times New Roman"/>
+          <w:sz w:val="24"/>
+          <w:szCs w:val="24"/>
+        </w:rPr>
+      </w:pPr>
+      <w:r>
+        <w:rPr>
+          <w:rFonts w:ascii="Times New Roman" w:hAnsi="Times New Roman" w:cs="Times New Roman"/>
+          <w:sz w:val="24"/>
+          <w:szCs w:val="24"/>
+        </w:rPr>
+        <w:br w:type="page"/>
+      </w:r>
+    </w:p>
+    <w:p>
+      <w:pPr>
+        <w:rPr>
+          <w:rFonts w:ascii="Times New Roman" w:hAnsi="Times New Roman" w:cs="Times New Roman"/>
           <w:b/>
           <w:smallCaps/>
           <w:color w:val="FF0000"/>
@@ -7639,6 +7726,7 @@
           <w:sz w:val="24"/>
           <w:szCs w:val="24"/>
         </w:rPr>
+        <w:lastRenderedPageBreak/>
         <w:t xml:space="preserve"> </w:t>
       </w:r>
       <w:r>
@@ -8518,7 +8606,7 @@
         </w:rPr>
       </w:pPr>
       <w:bookmarkStart w:id="0" w:name="_Toc382839392"/>
-      <w:bookmarkStart w:id="1" w:name="_Toc221484199"/>
+      <w:bookmarkStart w:id="1" w:name="_Toc221565693"/>
       <w:r>
         <w:rPr>
           <w:smallCaps w:val="0"/>
@@ -8535,16 +8623,16 @@
         <w:jc w:val="both"/>
         <w:rPr>
           <w:rFonts w:ascii="Times New Roman" w:eastAsia="Times New Roman" w:hAnsi="Times New Roman" w:cs="Times New Roman"/>
-          <w:sz w:val="32"/>
-          <w:szCs w:val="32"/>
+          <w:sz w:val="24"/>
+          <w:szCs w:val="24"/>
           <w:lang w:eastAsia="sk-SK"/>
         </w:rPr>
       </w:pPr>
       <w:r>
         <w:rPr>
           <w:rFonts w:ascii="Times New Roman" w:eastAsia="Times New Roman" w:hAnsi="Times New Roman" w:cs="Times New Roman"/>
-          <w:sz w:val="32"/>
-          <w:szCs w:val="32"/>
+          <w:sz w:val="24"/>
+          <w:szCs w:val="24"/>
           <w:lang w:eastAsia="sk-SK"/>
         </w:rPr>
         <w:t>Maturitná skúška je najdôležitejšou skúškou na strednej škole a jej zvládnutie si vyžaduje dôkladnú prípravu. Mnohí študenti sa pri učení stretávajú s problémom, že nemajú dostatok testov alebo nemajú možnosť overiť si svoje vedomosti rýchlo a prehľadne. Práve preto je vhodné využívať online nástroje, ktoré umožňujú efektívnejšie učenie.</w:t>
@@ -8556,8 +8644,8 @@
         <w:jc w:val="both"/>
         <w:rPr>
           <w:rFonts w:ascii="Times New Roman" w:eastAsia="Times New Roman" w:hAnsi="Times New Roman" w:cs="Times New Roman"/>
-          <w:sz w:val="32"/>
-          <w:szCs w:val="32"/>
+          <w:sz w:val="24"/>
+          <w:szCs w:val="24"/>
           <w:lang w:eastAsia="sk-SK"/>
         </w:rPr>
       </w:pPr>
@@ -8568,16 +8656,16 @@
         <w:jc w:val="both"/>
         <w:rPr>
           <w:rFonts w:ascii="Times New Roman" w:eastAsia="Times New Roman" w:hAnsi="Times New Roman" w:cs="Times New Roman"/>
-          <w:sz w:val="32"/>
-          <w:szCs w:val="32"/>
+          <w:sz w:val="24"/>
+          <w:szCs w:val="24"/>
           <w:lang w:eastAsia="sk-SK"/>
         </w:rPr>
       </w:pPr>
       <w:r>
         <w:rPr>
           <w:rFonts w:ascii="Times New Roman" w:eastAsia="Times New Roman" w:hAnsi="Times New Roman" w:cs="Times New Roman"/>
-          <w:sz w:val="32"/>
-          <w:szCs w:val="32"/>
+          <w:sz w:val="24"/>
+          <w:szCs w:val="24"/>
           <w:lang w:eastAsia="sk-SK"/>
         </w:rPr>
         <w:t>V minulosti sa testovanie realizovalo najmä formou písomných testov alebo pracovných zošitov. Postupne sa však začali používať počítače a internet, čo umožnilo vznik rôznych vzdelávacích webových stránok. Aj keď dnes existuje viacero online platforiem, nie všetky sú zamerané priamo na maturitné otázky alebo poskytujú prehľad o dlhodobej úspešnosti študenta.</w:t>
@@ -8589,8 +8677,8 @@
         <w:jc w:val="both"/>
         <w:rPr>
           <w:rFonts w:ascii="Times New Roman" w:eastAsia="Times New Roman" w:hAnsi="Times New Roman" w:cs="Times New Roman"/>
-          <w:sz w:val="32"/>
-          <w:szCs w:val="32"/>
+          <w:sz w:val="24"/>
+          <w:szCs w:val="24"/>
           <w:lang w:eastAsia="sk-SK"/>
         </w:rPr>
       </w:pPr>
@@ -8601,16 +8689,16 @@
         <w:jc w:val="both"/>
         <w:rPr>
           <w:rFonts w:ascii="Times New Roman" w:eastAsia="Times New Roman" w:hAnsi="Times New Roman" w:cs="Times New Roman"/>
-          <w:sz w:val="32"/>
-          <w:szCs w:val="32"/>
+          <w:sz w:val="24"/>
+          <w:szCs w:val="24"/>
           <w:lang w:eastAsia="sk-SK"/>
         </w:rPr>
       </w:pPr>
       <w:r>
         <w:rPr>
           <w:rFonts w:ascii="Times New Roman" w:eastAsia="Times New Roman" w:hAnsi="Times New Roman" w:cs="Times New Roman"/>
-          <w:sz w:val="32"/>
-          <w:szCs w:val="32"/>
+          <w:sz w:val="24"/>
+          <w:szCs w:val="24"/>
           <w:lang w:eastAsia="sk-SK"/>
         </w:rPr>
         <w:t>Cieľom tejto práce je vytvoriť online testovací modul pre maturantov, ktorý umožní riešenie testov rozdelených podľa predmetov, zobrazenie správnych odpovedí a vyhodnotenie úspešnosti. Ďalším cieľom je vytvoriť jednoduchý a prehľadný systém, ktorý bude dostupný z rôznych zariadení a bude vhodný na samostatnú prípravu na maturitu.</w:t>
@@ -8649,7 +8737,7 @@
       <w:pPr>
         <w:pStyle w:val="Nadpis1"/>
       </w:pPr>
-      <w:bookmarkStart w:id="2" w:name="_Toc221484200"/>
+      <w:bookmarkStart w:id="2" w:name="_Toc221565694"/>
       <w:r>
         <w:lastRenderedPageBreak/>
         <w:t>Zadanie a cieľ projektu</w:t>
@@ -8692,7 +8780,7 @@
       <w:pPr>
         <w:pStyle w:val="Nadpis2"/>
       </w:pPr>
-      <w:bookmarkStart w:id="3" w:name="_Toc221484201"/>
+      <w:bookmarkStart w:id="3" w:name="_Toc221565695"/>
       <w:r>
         <w:t>Zadanie maturitného projektu</w:t>
       </w:r>
@@ -8730,7 +8818,7 @@
       <w:r>
         <w:t xml:space="preserve">    </w:t>
       </w:r>
-      <w:bookmarkStart w:id="4" w:name="_Toc221484202"/>
+      <w:bookmarkStart w:id="4" w:name="_Toc221565696"/>
       <w:r>
         <w:t>Cieľ projektu</w:t>
       </w:r>
@@ -8788,7 +8876,7 @@
       <w:r>
         <w:t xml:space="preserve">  </w:t>
       </w:r>
-      <w:bookmarkStart w:id="5" w:name="_Toc221484203"/>
+      <w:bookmarkStart w:id="5" w:name="_Toc221565697"/>
       <w:r>
         <w:t>Požiadavky na projekt</w:t>
       </w:r>
@@ -9035,13 +9123,13 @@
       <w:pPr>
         <w:pStyle w:val="Nadpis1"/>
       </w:pPr>
-      <w:bookmarkStart w:id="6" w:name="_Toc221484204"/>
-      <w:bookmarkStart w:id="7" w:name="_Toc382839396"/>
+      <w:bookmarkStart w:id="6" w:name="_Toc382839396"/>
+      <w:bookmarkStart w:id="7" w:name="_Toc221565698"/>
       <w:r>
         <w:lastRenderedPageBreak/>
         <w:t>Použité technológie</w:t>
       </w:r>
-      <w:bookmarkEnd w:id="6"/>
+      <w:bookmarkEnd w:id="7"/>
     </w:p>
     <w:p>
       <w:pPr>
@@ -9085,7 +9173,7 @@
       <w:pPr>
         <w:pStyle w:val="Nadpis2"/>
       </w:pPr>
-      <w:bookmarkStart w:id="8" w:name="_Toc221484205"/>
+      <w:bookmarkStart w:id="8" w:name="_Toc221565699"/>
       <w:r>
         <w:t>Použité programovacie jazyky</w:t>
       </w:r>
@@ -9127,7 +9215,7 @@
       <w:pPr>
         <w:pStyle w:val="Nadpis3"/>
       </w:pPr>
-      <w:bookmarkStart w:id="9" w:name="_Toc221484206"/>
+      <w:bookmarkStart w:id="9" w:name="_Toc221565700"/>
       <w:r>
         <w:t>Programovací jazyk C#</w:t>
       </w:r>
@@ -9160,7 +9248,7 @@
       <w:pPr>
         <w:pStyle w:val="Nadpis3"/>
       </w:pPr>
-      <w:bookmarkStart w:id="10" w:name="_Toc221484207"/>
+      <w:bookmarkStart w:id="10" w:name="_Toc221565701"/>
       <w:r>
         <w:t xml:space="preserve">Programovací jazyk </w:t>
       </w:r>
@@ -9245,7 +9333,7 @@
       <w:pPr>
         <w:pStyle w:val="Nadpis2"/>
       </w:pPr>
-      <w:bookmarkStart w:id="11" w:name="_Toc221484208"/>
+      <w:bookmarkStart w:id="11" w:name="_Toc221565702"/>
       <w:r>
         <w:lastRenderedPageBreak/>
         <w:t>Použité knižnice a </w:t>
@@ -9300,7 +9388,7 @@
       <w:pPr>
         <w:pStyle w:val="Nadpis3"/>
       </w:pPr>
-      <w:bookmarkStart w:id="12" w:name="_Toc221484209"/>
+      <w:bookmarkStart w:id="12" w:name="_Toc221565703"/>
       <w:proofErr w:type="spellStart"/>
       <w:r>
         <w:t>Backend</w:t>
@@ -9609,7 +9697,7 @@
       <w:pPr>
         <w:pStyle w:val="Nadpis3"/>
       </w:pPr>
-      <w:bookmarkStart w:id="13" w:name="_Toc221484210"/>
+      <w:bookmarkStart w:id="13" w:name="_Toc221565704"/>
       <w:proofErr w:type="spellStart"/>
       <w:r>
         <w:t>Frontend</w:t>
@@ -9643,6 +9731,11 @@
     </w:p>
     <w:p>
       <w:pPr>
+        <w:pStyle w:val="TEXT"/>
+      </w:pPr>
+    </w:p>
+    <w:p>
+      <w:pPr>
         <w:pStyle w:val="Nadpis4"/>
       </w:pPr>
       <w:proofErr w:type="spellStart"/>
@@ -9718,6 +9811,11 @@
     </w:p>
     <w:p>
       <w:pPr>
+        <w:pStyle w:val="TEXT"/>
+      </w:pPr>
+    </w:p>
+    <w:p>
+      <w:pPr>
         <w:pStyle w:val="Nadpis4"/>
       </w:pPr>
       <w:proofErr w:type="spellStart"/>
@@ -9792,7 +9890,11 @@
       </w:r>
       <w:proofErr w:type="spellEnd"/>
       <w:r>
-        <w:t xml:space="preserve"> API, napríklad pri prihlasovaní používateľa, načítavaní testov alebo ukladaní výsledkov. Je jednoduchý na používanie a umožňuje prehľadné spracovanie odpovedí zo servera. </w:t>
+        <w:t xml:space="preserve"> API, napríklad pri prihlasovaní </w:t>
+      </w:r>
+      <w:r>
+        <w:lastRenderedPageBreak/>
+        <w:t xml:space="preserve">používateľa, načítavaní testov alebo ukladaní výsledkov. Je jednoduchý na používanie a umožňuje prehľadné spracovanie odpovedí zo servera. </w:t>
       </w:r>
       <w:proofErr w:type="spellStart"/>
       <w:r>
@@ -9808,60 +9910,299 @@
       </w:r>
       <w:proofErr w:type="spellEnd"/>
       <w:r>
-        <w:t xml:space="preserve"> som použil na správu dát získaných zo servera. Táto knižnica automaticky rieši ukladanie dát do </w:t>
-      </w:r>
+        <w:t xml:space="preserve"> som použil na správu dát získaných zo servera. Táto knižnica automaticky rieši ukladanie dát do pamäte (</w:t>
+      </w:r>
+      <w:proofErr w:type="spellStart"/>
+      <w:r>
+        <w:t>caching</w:t>
+      </w:r>
+      <w:proofErr w:type="spellEnd"/>
+      <w:r>
+        <w:t>), ich opätovné načítanie a aktualizáciu. Vďaka tomu má aplikácia vždy aktuálne údaje a práca s dátami je prehľadnejšia.</w:t>
+      </w:r>
+    </w:p>
+    <w:p>
+      <w:pPr>
+        <w:pStyle w:val="TEXT"/>
+      </w:pPr>
+    </w:p>
+    <w:p>
+      <w:pPr>
+        <w:pStyle w:val="Nadpis4"/>
+      </w:pPr>
+      <w:proofErr w:type="spellStart"/>
+      <w:r>
+        <w:t>Tanstack</w:t>
+      </w:r>
+      <w:proofErr w:type="spellEnd"/>
+      <w:r>
+        <w:t xml:space="preserve"> </w:t>
+      </w:r>
+      <w:proofErr w:type="spellStart"/>
+      <w:r>
+        <w:t>Form</w:t>
+      </w:r>
+      <w:proofErr w:type="spellEnd"/>
+      <w:r>
+        <w:t xml:space="preserve"> a</w:t>
+      </w:r>
+      <w:r>
+        <w:t> </w:t>
+      </w:r>
+      <w:proofErr w:type="spellStart"/>
+      <w:r>
+        <w:t>Zod</w:t>
+      </w:r>
+      <w:proofErr w:type="spellEnd"/>
+    </w:p>
+    <w:p>
+      <w:pPr>
+        <w:pStyle w:val="TEXT"/>
+      </w:pPr>
+      <w:r>
+        <w:t xml:space="preserve">Knižnica </w:t>
+      </w:r>
+      <w:proofErr w:type="spellStart"/>
+      <w:r>
+        <w:t>TanStack</w:t>
+      </w:r>
+      <w:proofErr w:type="spellEnd"/>
+      <w:r>
+        <w:t xml:space="preserve"> </w:t>
+      </w:r>
+      <w:proofErr w:type="spellStart"/>
+      <w:r>
+        <w:t>Form</w:t>
+      </w:r>
+      <w:proofErr w:type="spellEnd"/>
+      <w:r>
+        <w:t xml:space="preserve"> mi pomohla so správou formulárových vstupných polí a ich stavov. Táto knižnica umožňuje jednoducho spracovať údaje z formulárov, validovať ich a vypísať používateľovi</w:t>
+      </w:r>
+      <w:r>
+        <w:t>,</w:t>
+      </w:r>
+      <w:r>
+        <w:t xml:space="preserve"> čo vyplnil zle. Použitie </w:t>
+      </w:r>
+      <w:proofErr w:type="spellStart"/>
+      <w:r>
+        <w:t>TanStack</w:t>
+      </w:r>
+      <w:proofErr w:type="spellEnd"/>
+      <w:r>
+        <w:t xml:space="preserve"> </w:t>
+      </w:r>
+      <w:proofErr w:type="spellStart"/>
+      <w:r>
+        <w:t>Form</w:t>
+      </w:r>
+      <w:proofErr w:type="spellEnd"/>
+      <w:r>
+        <w:t xml:space="preserve"> prispelo k prehľadnosti kódu a zjednodušilo validáciu vstupných údajov. Na validáciu jednotlivých vstupných polí (</w:t>
+      </w:r>
+      <w:proofErr w:type="spellStart"/>
+      <w:r>
+        <w:t>inputov</w:t>
+      </w:r>
+      <w:proofErr w:type="spellEnd"/>
+      <w:r>
+        <w:t xml:space="preserve">) som využil ďalšiu knižnicu </w:t>
+      </w:r>
+      <w:proofErr w:type="spellStart"/>
+      <w:r>
+        <w:t>Zod</w:t>
+      </w:r>
+      <w:proofErr w:type="spellEnd"/>
+      <w:r>
+        <w:t xml:space="preserve">, ktorá umožňuje presne určiť, aké hodnoty môže používateľ zadať. Vďaka kombinácii </w:t>
+      </w:r>
+      <w:proofErr w:type="spellStart"/>
+      <w:r>
+        <w:t>TanStack</w:t>
+      </w:r>
+      <w:proofErr w:type="spellEnd"/>
+      <w:r>
+        <w:t xml:space="preserve"> </w:t>
+      </w:r>
+      <w:proofErr w:type="spellStart"/>
+      <w:r>
+        <w:t>Form</w:t>
+      </w:r>
+      <w:proofErr w:type="spellEnd"/>
+      <w:r>
+        <w:t xml:space="preserve"> a </w:t>
+      </w:r>
+      <w:proofErr w:type="spellStart"/>
+      <w:r>
+        <w:t>Zod</w:t>
+      </w:r>
+      <w:proofErr w:type="spellEnd"/>
+      <w:r>
+        <w:t xml:space="preserve"> je možné odhaliť chyby už pri vypĺňaní formulára a upozorniť používateľa. To zabezpečí, že do systému sa dostanú iba správne údaje.</w:t>
+      </w:r>
+    </w:p>
+    <w:p>
+      <w:pPr>
+        <w:pStyle w:val="TEXT"/>
+      </w:pPr>
+    </w:p>
+    <w:p>
+      <w:pPr>
+        <w:pStyle w:val="Nadpis4"/>
+      </w:pPr>
+      <w:r>
+        <w:t>UI a UX Aplikácie</w:t>
+      </w:r>
+    </w:p>
+    <w:p>
+      <w:pPr>
+        <w:pStyle w:val="TEXT"/>
+      </w:pPr>
+      <w:r>
+        <w:t xml:space="preserve">Na tvorbu používateľského rozhrania som použil komponentovú knižnicu </w:t>
+      </w:r>
+      <w:proofErr w:type="spellStart"/>
+      <w:r>
+        <w:t>shadcn</w:t>
+      </w:r>
+      <w:proofErr w:type="spellEnd"/>
+      <w:r>
+        <w:t>/</w:t>
+      </w:r>
+      <w:proofErr w:type="spellStart"/>
+      <w:r>
+        <w:t>ui</w:t>
+      </w:r>
+      <w:proofErr w:type="spellEnd"/>
+      <w:r>
+        <w:t>, ktorá poskytuje hotové a štýlovo jednotné komponenty, ako sú tlačidlá, formuláre, dialógové okná alebo tabuľky. Tieto komponenty mi umožnili rýchlejšie vytvoriť konzistentné používateľské rozhranie bez potreby vytvárať všetky prvky od začiatku.</w:t>
+      </w:r>
+      <w:r>
+        <w:t xml:space="preserve"> </w:t>
+      </w:r>
+      <w:r>
+        <w:t xml:space="preserve">Na doplnenie používateľského rozhrania o ikony slúžila knižnica </w:t>
+      </w:r>
+      <w:proofErr w:type="spellStart"/>
+      <w:r>
+        <w:t>Lucide</w:t>
+      </w:r>
+      <w:proofErr w:type="spellEnd"/>
+      <w:r>
+        <w:t xml:space="preserve"> </w:t>
+      </w:r>
+      <w:proofErr w:type="spellStart"/>
+      <w:r>
+        <w:t>React</w:t>
+      </w:r>
+      <w:proofErr w:type="spellEnd"/>
+      <w:r>
+        <w:t xml:space="preserve">. Ikony zlepšujú prehľadnosť aplikácie a uľahčujú používateľovi orientáciu v jednotlivých častiach systému. Na </w:t>
+      </w:r>
+      <w:proofErr w:type="spellStart"/>
+      <w:r>
+        <w:t>štýlovanie</w:t>
+      </w:r>
+      <w:proofErr w:type="spellEnd"/>
+      <w:r>
+        <w:t xml:space="preserve"> aplikácie som použil </w:t>
+      </w:r>
+      <w:proofErr w:type="spellStart"/>
+      <w:r>
+        <w:t>Tailwind</w:t>
+      </w:r>
+      <w:proofErr w:type="spellEnd"/>
+      <w:r>
+        <w:t xml:space="preserve"> CSS</w:t>
+      </w:r>
+      <w:r>
+        <w:t xml:space="preserve">, čo je náhrada za </w:t>
+      </w:r>
+      <w:proofErr w:type="spellStart"/>
+      <w:r>
+        <w:t>css</w:t>
+      </w:r>
+      <w:proofErr w:type="spellEnd"/>
+      <w:r>
+        <w:t>, ktor</w:t>
+      </w:r>
+      <w:r>
+        <w:t>á</w:t>
+      </w:r>
+      <w:r>
+        <w:t xml:space="preserve"> umožňuje rýchle a efektívne vytváranie moderného a </w:t>
+      </w:r>
+      <w:proofErr w:type="spellStart"/>
+      <w:r>
+        <w:t>responzívneho</w:t>
+      </w:r>
+      <w:proofErr w:type="spellEnd"/>
+      <w:r>
+        <w:t xml:space="preserve"> dizajnu. Pomocou tejto knižnice som dokázal jednoducho prispôsobiť vzhľad aplikácie rôznym veľkostiam obrazoviek. </w:t>
+      </w:r>
+      <w:proofErr w:type="spellStart"/>
+      <w:r>
+        <w:t>Tailwind</w:t>
+      </w:r>
+      <w:proofErr w:type="spellEnd"/>
+      <w:r>
+        <w:t xml:space="preserve"> CSS zároveň zabezpečuje jednotný vzhľad aplikácie a zjednodušuje údržbu štýlov.</w:t>
+      </w:r>
+    </w:p>
+    <w:p>
+      <w:pPr>
+        <w:pStyle w:val="TEXT"/>
+      </w:pPr>
+    </w:p>
+    <w:p>
+      <w:pPr>
+        <w:pStyle w:val="Nadpis2"/>
+      </w:pPr>
+      <w:bookmarkStart w:id="14" w:name="_Toc221565705"/>
       <w:r>
         <w:lastRenderedPageBreak/>
-        <w:t>pamäte (</w:t>
-      </w:r>
-      <w:proofErr w:type="spellStart"/>
-      <w:r>
-        <w:t>caching</w:t>
-      </w:r>
-      <w:proofErr w:type="spellEnd"/>
-      <w:r>
-        <w:t>), ich opätovné načítanie a aktualizáciu. Vďaka tomu má aplikácia vždy aktuálne údaje a práca s dátami je prehľadnejšia.</w:t>
-      </w:r>
-    </w:p>
-    <w:p>
-      <w:pPr>
-        <w:pStyle w:val="Nadpis4"/>
-      </w:pPr>
-      <w:proofErr w:type="spellStart"/>
-      <w:r>
-        <w:t>Tanstack</w:t>
-      </w:r>
-      <w:proofErr w:type="spellEnd"/>
+        <w:t>Databáza a ukladanie údajov</w:t>
+      </w:r>
+      <w:bookmarkEnd w:id="14"/>
       <w:r>
         <w:t xml:space="preserve"> </w:t>
       </w:r>
-      <w:proofErr w:type="spellStart"/>
-      <w:r>
-        <w:t>Form</w:t>
-      </w:r>
-      <w:proofErr w:type="spellEnd"/>
-      <w:r>
-        <w:t xml:space="preserve"> a</w:t>
-      </w:r>
-      <w:r>
-        <w:t> </w:t>
-      </w:r>
-      <w:proofErr w:type="spellStart"/>
-      <w:r>
-        <w:t>Zod</w:t>
-      </w:r>
-      <w:proofErr w:type="spellEnd"/>
     </w:p>
     <w:p>
       <w:pPr>
         <w:pStyle w:val="TEXT"/>
       </w:pPr>
       <w:r>
-        <w:t xml:space="preserve">Knižnica </w:t>
-      </w:r>
-      <w:proofErr w:type="spellStart"/>
-      <w:r>
-        <w:t>TanStack</w:t>
+        <w:t xml:space="preserve">Na ukladanie údajov bola použitá relačná databáza </w:t>
+      </w:r>
+      <w:proofErr w:type="spellStart"/>
+      <w:r>
+        <w:t>PostgreSQL</w:t>
+      </w:r>
+      <w:proofErr w:type="spellEnd"/>
+      <w:r>
+        <w:t xml:space="preserve">, ktorá poskytuje vysokú spoľahlivosť a výkon pri práci s väčším množstvom dát. Databáza slúži na ukladanie </w:t>
+      </w:r>
+      <w:r>
+        <w:t>všetkých dát v aplikácii</w:t>
+      </w:r>
+      <w:r>
+        <w:t xml:space="preserve">.  Komunikácia medzi </w:t>
+      </w:r>
+      <w:proofErr w:type="spellStart"/>
+      <w:r>
+        <w:t>backendovou</w:t>
+      </w:r>
+      <w:proofErr w:type="spellEnd"/>
+      <w:r>
+        <w:t xml:space="preserve"> aplikáciou a databázou je realizovaná pomocou objektovo-relačného mapovania (ORM),</w:t>
+      </w:r>
+      <w:r>
+        <w:t xml:space="preserve"> v mojom prípade Entity </w:t>
+      </w:r>
+      <w:proofErr w:type="spellStart"/>
+      <w:r>
+        <w:t>Framework</w:t>
       </w:r>
       <w:proofErr w:type="spellEnd"/>
       <w:r>
@@ -9869,73 +10210,14 @@
       </w:r>
       <w:proofErr w:type="spellStart"/>
       <w:r>
-        <w:t>Form</w:t>
-      </w:r>
-      <w:proofErr w:type="spellEnd"/>
-      <w:r>
-        <w:t xml:space="preserve"> mi pomohla so správou formulárových vstupných polí a ich stavov. Táto knižnica umožňuje jednoducho spracovať údaje z formulárov, validovať ich a vypísať používateľovi</w:t>
-      </w:r>
-      <w:r>
-        <w:t>,</w:t>
-      </w:r>
-      <w:r>
-        <w:t xml:space="preserve"> čo vyplnil zle. Použitie </w:t>
-      </w:r>
-      <w:proofErr w:type="spellStart"/>
-      <w:r>
-        <w:t>TanStack</w:t>
-      </w:r>
-      <w:proofErr w:type="spellEnd"/>
-      <w:r>
-        <w:t xml:space="preserve"> </w:t>
-      </w:r>
-      <w:proofErr w:type="spellStart"/>
-      <w:r>
-        <w:t>Form</w:t>
-      </w:r>
-      <w:proofErr w:type="spellEnd"/>
-      <w:r>
-        <w:t xml:space="preserve"> prispelo k prehľadnosti kódu a zjednodušilo validáciu vstupných údajov. Na validáciu jednotlivých vstupných polí (</w:t>
-      </w:r>
-      <w:proofErr w:type="spellStart"/>
-      <w:r>
-        <w:t>inputov</w:t>
-      </w:r>
-      <w:proofErr w:type="spellEnd"/>
-      <w:r>
-        <w:t xml:space="preserve">) som využil ďalšiu knižnicu </w:t>
-      </w:r>
-      <w:proofErr w:type="spellStart"/>
-      <w:r>
-        <w:t>Zod</w:t>
-      </w:r>
-      <w:proofErr w:type="spellEnd"/>
-      <w:r>
-        <w:t xml:space="preserve">, ktorá umožňuje presne určiť, aké hodnoty môže používateľ zadať. Vďaka kombinácii </w:t>
-      </w:r>
-      <w:proofErr w:type="spellStart"/>
-      <w:r>
-        <w:t>TanStack</w:t>
-      </w:r>
-      <w:proofErr w:type="spellEnd"/>
-      <w:r>
-        <w:t xml:space="preserve"> </w:t>
-      </w:r>
-      <w:proofErr w:type="spellStart"/>
-      <w:r>
-        <w:t>Form</w:t>
-      </w:r>
-      <w:proofErr w:type="spellEnd"/>
-      <w:r>
-        <w:t xml:space="preserve"> a </w:t>
-      </w:r>
-      <w:proofErr w:type="spellStart"/>
-      <w:r>
-        <w:t>Zod</w:t>
-      </w:r>
-      <w:proofErr w:type="spellEnd"/>
-      <w:r>
-        <w:t xml:space="preserve"> je možné odhaliť chyby už pri vypĺňaní formulára a upozorniť používateľa. To zabezpečí, že do systému sa dostanú iba správne údaje.</w:t>
+        <w:t>Core</w:t>
+      </w:r>
+      <w:proofErr w:type="spellEnd"/>
+      <w:r>
+        <w:t>, ktoré je s .NET aplikáciami veľmi často využívané. ORM umožňuje prevod relácií (tabuliek v databáze) na objekty a tým</w:t>
+      </w:r>
+      <w:r>
+        <w:t xml:space="preserve"> umožňuje jednoduchú a prehľadnú prácu s databázovými tabuľkami priamo v programovacom jazyku. </w:t>
       </w:r>
     </w:p>
     <w:p>
@@ -9945,191 +10227,9 @@
     </w:p>
     <w:p>
       <w:pPr>
-        <w:pStyle w:val="Nadpis4"/>
-      </w:pPr>
-      <w:r>
-        <w:t>UI a UX Aplikácie</w:t>
-      </w:r>
-    </w:p>
-    <w:p>
-      <w:pPr>
-        <w:pStyle w:val="TEXT"/>
-      </w:pPr>
-      <w:r>
-        <w:t xml:space="preserve">Na tvorbu používateľského rozhrania som použil komponentovú knižnicu </w:t>
-      </w:r>
-      <w:proofErr w:type="spellStart"/>
-      <w:r>
-        <w:t>shadcn</w:t>
-      </w:r>
-      <w:proofErr w:type="spellEnd"/>
-      <w:r>
-        <w:t>/</w:t>
-      </w:r>
-      <w:proofErr w:type="spellStart"/>
-      <w:r>
-        <w:t>ui</w:t>
-      </w:r>
-      <w:proofErr w:type="spellEnd"/>
-      <w:r>
-        <w:t>, ktorá poskytuje hotové a štýlovo jednotné komponenty, ako sú tlačidlá, formuláre, dialógové okná alebo tabuľky. Tieto komponenty mi umožnili rýchlejšie vytvoriť konzistentné používateľské rozhranie bez potreby vytvárať všetky prvky od začiatku.</w:t>
-      </w:r>
-      <w:r>
-        <w:t xml:space="preserve"> </w:t>
-      </w:r>
-      <w:r>
-        <w:t xml:space="preserve">Na doplnenie používateľského rozhrania o ikony slúžila knižnica </w:t>
-      </w:r>
-      <w:proofErr w:type="spellStart"/>
-      <w:r>
-        <w:t>Lucide</w:t>
-      </w:r>
-      <w:proofErr w:type="spellEnd"/>
-      <w:r>
-        <w:t xml:space="preserve"> </w:t>
-      </w:r>
-      <w:proofErr w:type="spellStart"/>
-      <w:r>
-        <w:t>React</w:t>
-      </w:r>
-      <w:proofErr w:type="spellEnd"/>
-      <w:r>
-        <w:t xml:space="preserve">. Ikony zlepšujú prehľadnosť aplikácie a uľahčujú používateľovi orientáciu v jednotlivých častiach systému. Na </w:t>
-      </w:r>
-      <w:proofErr w:type="spellStart"/>
-      <w:r>
-        <w:t>štýlovanie</w:t>
-      </w:r>
-      <w:proofErr w:type="spellEnd"/>
-      <w:r>
-        <w:t xml:space="preserve"> aplikácie som použil </w:t>
-      </w:r>
-      <w:proofErr w:type="spellStart"/>
-      <w:r>
-        <w:t>Tailwind</w:t>
-      </w:r>
-      <w:proofErr w:type="spellEnd"/>
-      <w:r>
-        <w:t xml:space="preserve"> CSS</w:t>
-      </w:r>
-      <w:r>
-        <w:t xml:space="preserve">, čo je náhrada za </w:t>
-      </w:r>
-      <w:proofErr w:type="spellStart"/>
-      <w:r>
-        <w:t>css</w:t>
-      </w:r>
-      <w:proofErr w:type="spellEnd"/>
-      <w:r>
-        <w:t>, ktor</w:t>
-      </w:r>
-      <w:r>
-        <w:t>á</w:t>
-      </w:r>
-      <w:r>
-        <w:t xml:space="preserve"> umožňuje rýchle a efektívne vytváranie moderného a </w:t>
-      </w:r>
-      <w:proofErr w:type="spellStart"/>
-      <w:r>
-        <w:t>responzívneho</w:t>
-      </w:r>
-      <w:proofErr w:type="spellEnd"/>
-      <w:r>
-        <w:t xml:space="preserve"> dizajnu. Pomocou tejto knižnice som dokázal jednoducho prispôsobiť vzhľad aplikácie rôznym veľkostiam obrazoviek. </w:t>
-      </w:r>
-      <w:proofErr w:type="spellStart"/>
-      <w:r>
-        <w:t>Tailwind</w:t>
-      </w:r>
-      <w:proofErr w:type="spellEnd"/>
-      <w:r>
-        <w:t xml:space="preserve"> CSS zároveň zabezpečuje jednotný vzhľad aplikácie a zjednodušuje údržbu štýlov.</w:t>
-      </w:r>
-    </w:p>
-    <w:p>
-      <w:pPr>
-        <w:pStyle w:val="TEXT"/>
-      </w:pPr>
-    </w:p>
-    <w:p>
-      <w:pPr>
         <w:pStyle w:val="Nadpis2"/>
       </w:pPr>
-      <w:bookmarkStart w:id="14" w:name="_Toc221484211"/>
-      <w:r>
-        <w:t>Databáza a ukladanie údajov</w:t>
-      </w:r>
-      <w:bookmarkEnd w:id="14"/>
-      <w:r>
-        <w:t xml:space="preserve"> </w:t>
-      </w:r>
-    </w:p>
-    <w:p>
-      <w:pPr>
-        <w:pStyle w:val="TEXT"/>
-      </w:pPr>
-      <w:r>
-        <w:t xml:space="preserve">Na ukladanie údajov bola použitá relačná databáza </w:t>
-      </w:r>
-      <w:proofErr w:type="spellStart"/>
-      <w:r>
-        <w:t>PostgreSQL</w:t>
-      </w:r>
-      <w:proofErr w:type="spellEnd"/>
-      <w:r>
-        <w:t xml:space="preserve">, ktorá poskytuje vysokú spoľahlivosť a výkon pri práci s väčším množstvom dát. Databáza slúži na ukladanie </w:t>
-      </w:r>
-      <w:r>
-        <w:t>všetkých dát v aplikácii</w:t>
-      </w:r>
-      <w:r>
-        <w:t xml:space="preserve">.  Komunikácia medzi </w:t>
-      </w:r>
-      <w:proofErr w:type="spellStart"/>
-      <w:r>
-        <w:t>backendovou</w:t>
-      </w:r>
-      <w:proofErr w:type="spellEnd"/>
-      <w:r>
-        <w:t xml:space="preserve"> aplikáciou a databázou je realizovaná pomocou objektovo-relačného mapovania (ORM),</w:t>
-      </w:r>
-      <w:r>
-        <w:t xml:space="preserve"> v mojom </w:t>
-      </w:r>
-      <w:r>
-        <w:lastRenderedPageBreak/>
-        <w:t xml:space="preserve">prípade Entity </w:t>
-      </w:r>
-      <w:proofErr w:type="spellStart"/>
-      <w:r>
-        <w:t>Framework</w:t>
-      </w:r>
-      <w:proofErr w:type="spellEnd"/>
-      <w:r>
-        <w:t xml:space="preserve"> </w:t>
-      </w:r>
-      <w:proofErr w:type="spellStart"/>
-      <w:r>
-        <w:t>Core</w:t>
-      </w:r>
-      <w:proofErr w:type="spellEnd"/>
-      <w:r>
-        <w:t>, ktoré je s .NET aplikáciami veľmi často využívané. ORM umožňuje prevod relácií (tabuliek v databáze) na objekty a tým</w:t>
-      </w:r>
-      <w:r>
-        <w:t xml:space="preserve"> umožňuje jednoduchú a prehľadnú prácu s databázovými tabuľkami priamo v programovacom jazyku. </w:t>
-      </w:r>
-    </w:p>
-    <w:p>
-      <w:pPr>
-        <w:pStyle w:val="TEXT"/>
-      </w:pPr>
-    </w:p>
-    <w:p>
-      <w:pPr>
-        <w:pStyle w:val="Nadpis2"/>
-      </w:pPr>
-      <w:bookmarkStart w:id="15" w:name="_Toc221484212"/>
+      <w:bookmarkStart w:id="15" w:name="_Toc221565706"/>
       <w:r>
         <w:rPr>
           <w:rStyle w:val="Nadpis2Char"/>
@@ -10247,7 +10347,7 @@
       <w:pPr>
         <w:pStyle w:val="Nadpis1"/>
       </w:pPr>
-      <w:bookmarkStart w:id="16" w:name="_Toc221484213"/>
+      <w:bookmarkStart w:id="16" w:name="_Toc221565707"/>
       <w:r>
         <w:lastRenderedPageBreak/>
         <w:t>Návrh systému</w:t>
@@ -10296,7 +10396,7 @@
       <w:pPr>
         <w:pStyle w:val="Nadpis2"/>
       </w:pPr>
-      <w:bookmarkStart w:id="17" w:name="_Toc221484214"/>
+      <w:bookmarkStart w:id="17" w:name="_Toc221565708"/>
       <w:r>
         <w:t>Celkový návrh systému</w:t>
       </w:r>
@@ -10381,7 +10481,7 @@
       <w:pPr>
         <w:pStyle w:val="Nadpis2"/>
       </w:pPr>
-      <w:bookmarkStart w:id="18" w:name="_Toc221484215"/>
+      <w:bookmarkStart w:id="18" w:name="_Toc221565709"/>
       <w:r>
         <w:t>Architektúra aplikácie</w:t>
       </w:r>
@@ -10404,7 +10504,7 @@
       <w:pPr>
         <w:pStyle w:val="Nadpis3"/>
       </w:pPr>
-      <w:bookmarkStart w:id="19" w:name="_Toc221484216"/>
+      <w:bookmarkStart w:id="19" w:name="_Toc221565710"/>
       <w:proofErr w:type="spellStart"/>
       <w:r>
         <w:t>Backendová</w:t>
@@ -10611,7 +10711,7 @@
       <w:pPr>
         <w:pStyle w:val="Nadpis3"/>
       </w:pPr>
-      <w:bookmarkStart w:id="20" w:name="_Toc221484217"/>
+      <w:bookmarkStart w:id="20" w:name="_Toc221565711"/>
       <w:proofErr w:type="spellStart"/>
       <w:r>
         <w:t>Frontendová</w:t>
@@ -10798,7 +10898,7 @@
       <w:pPr>
         <w:pStyle w:val="Nadpis3"/>
       </w:pPr>
-      <w:bookmarkStart w:id="21" w:name="_Toc221484218"/>
+      <w:bookmarkStart w:id="21" w:name="_Toc221565712"/>
       <w:r>
         <w:lastRenderedPageBreak/>
         <w:t>D</w:t>
@@ -10896,7 +10996,7 @@
       <w:pPr>
         <w:pStyle w:val="Nadpis2"/>
       </w:pPr>
-      <w:bookmarkStart w:id="22" w:name="_Toc221484219"/>
+      <w:bookmarkStart w:id="22" w:name="_Toc221565713"/>
       <w:r>
         <w:t>Návrh používateľských rolí a oprávnení</w:t>
       </w:r>
@@ -10978,7 +11078,7 @@
       <w:r>
         <w:br w:type="page"/>
       </w:r>
-      <w:bookmarkStart w:id="23" w:name="_Toc221484220"/>
+      <w:bookmarkStart w:id="23" w:name="_Toc221565714"/>
       <w:r>
         <w:lastRenderedPageBreak/>
         <w:t>Implementácia systému</w:t>
@@ -11029,7 +11129,7 @@
       <w:pPr>
         <w:pStyle w:val="Nadpis2"/>
       </w:pPr>
-      <w:bookmarkStart w:id="24" w:name="_Toc221484221"/>
+      <w:bookmarkStart w:id="24" w:name="_Toc221565715"/>
       <w:r>
         <w:t xml:space="preserve">Implementácia </w:t>
       </w:r>
@@ -11051,7 +11151,7 @@
       <w:pPr>
         <w:pStyle w:val="Nadpis3"/>
       </w:pPr>
-      <w:bookmarkStart w:id="25" w:name="_Toc221484222"/>
+      <w:bookmarkStart w:id="25" w:name="_Toc221565716"/>
       <w:r>
         <w:t xml:space="preserve">Štruktúra </w:t>
       </w:r>
@@ -11375,7 +11475,7 @@
       <w:pPr>
         <w:pStyle w:val="Nadpis3"/>
       </w:pPr>
-      <w:bookmarkStart w:id="26" w:name="_Toc221484223"/>
+      <w:bookmarkStart w:id="26" w:name="_Toc221565717"/>
       <w:r>
         <w:t xml:space="preserve">Implementácia </w:t>
       </w:r>
@@ -11512,7 +11612,7 @@
       <w:pPr>
         <w:pStyle w:val="Nadpis3"/>
       </w:pPr>
-      <w:bookmarkStart w:id="27" w:name="_Toc221484224"/>
+      <w:bookmarkStart w:id="27" w:name="_Toc221565718"/>
       <w:r>
         <w:t>Implementácia servi</w:t>
       </w:r>
@@ -11615,7 +11715,7 @@
       <w:pPr>
         <w:pStyle w:val="Nadpis3"/>
       </w:pPr>
-      <w:bookmarkStart w:id="28" w:name="_Toc221484225"/>
+      <w:bookmarkStart w:id="28" w:name="_Toc221565719"/>
       <w:r>
         <w:t>Autentifikácia a autorizácia používateľov</w:t>
       </w:r>
@@ -11849,7 +11949,7 @@
       <w:pPr>
         <w:pStyle w:val="Nadpis2"/>
       </w:pPr>
-      <w:bookmarkStart w:id="29" w:name="_Toc221484226"/>
+      <w:bookmarkStart w:id="29" w:name="_Toc221565720"/>
       <w:r>
         <w:t xml:space="preserve">Implementácia </w:t>
       </w:r>
@@ -11871,7 +11971,7 @@
       <w:pPr>
         <w:pStyle w:val="Nadpis3"/>
       </w:pPr>
-      <w:bookmarkStart w:id="30" w:name="_Toc221484227"/>
+      <w:bookmarkStart w:id="30" w:name="_Toc221565721"/>
       <w:r>
         <w:t xml:space="preserve">Štruktúra </w:t>
       </w:r>
@@ -12166,7 +12266,7 @@
       <w:pPr>
         <w:pStyle w:val="Nadpis3"/>
       </w:pPr>
-      <w:bookmarkStart w:id="31" w:name="_Toc221484228"/>
+      <w:bookmarkStart w:id="31" w:name="_Toc221565722"/>
       <w:proofErr w:type="spellStart"/>
       <w:r>
         <w:t>Routing</w:t>
@@ -12216,7 +12316,7 @@
       <w:pPr>
         <w:pStyle w:val="Nadpis3"/>
       </w:pPr>
-      <w:bookmarkStart w:id="32" w:name="_Toc221484229"/>
+      <w:bookmarkStart w:id="32" w:name="_Toc221565723"/>
       <w:r>
         <w:t>UI a UX</w:t>
       </w:r>
@@ -12381,7 +12481,7 @@
       <w:pPr>
         <w:pStyle w:val="Nadpis3"/>
       </w:pPr>
-      <w:bookmarkStart w:id="33" w:name="_Toc221484230"/>
+      <w:bookmarkStart w:id="33" w:name="_Toc221565724"/>
       <w:r>
         <w:lastRenderedPageBreak/>
         <w:t>Formuláre a</w:t>
@@ -12459,7 +12559,7 @@
       <w:pPr>
         <w:pStyle w:val="Nadpis3"/>
       </w:pPr>
-      <w:bookmarkStart w:id="34" w:name="_Toc221484231"/>
+      <w:bookmarkStart w:id="34" w:name="_Toc221565725"/>
       <w:r>
         <w:t>Správa dát</w:t>
       </w:r>
@@ -12644,38 +12744,129 @@
     </w:p>
     <w:p>
       <w:pPr>
+        <w:pStyle w:val="TEXT"/>
+      </w:pPr>
+    </w:p>
+    <w:p>
+      <w:pPr>
         <w:pStyle w:val="Nadpis3"/>
-        <w:numPr>
-          <w:ilvl w:val="0"/>
-          <w:numId w:val="0"/>
-        </w:numPr>
-        <w:ind w:left="993" w:hanging="851"/>
+      </w:pPr>
+      <w:bookmarkStart w:id="35" w:name="_Toc221565726"/>
+      <w:r>
+        <w:t>Autentifikácia a autorizácia</w:t>
+      </w:r>
+      <w:bookmarkEnd w:id="35"/>
+    </w:p>
+    <w:p>
+      <w:pPr>
+        <w:pStyle w:val="TEXT"/>
+      </w:pPr>
+      <w:r>
+        <w:t>Access a </w:t>
+      </w:r>
+      <w:proofErr w:type="spellStart"/>
+      <w:r>
+        <w:t>refresh</w:t>
+      </w:r>
+      <w:proofErr w:type="spellEnd"/>
+      <w:r>
+        <w:t xml:space="preserve"> token sú na </w:t>
+      </w:r>
+      <w:proofErr w:type="spellStart"/>
+      <w:r>
+        <w:t>frontende</w:t>
+      </w:r>
+      <w:proofErr w:type="spellEnd"/>
+      <w:r>
+        <w:t xml:space="preserve"> uložené</w:t>
+      </w:r>
+      <w:r>
+        <w:t xml:space="preserve"> v http </w:t>
+      </w:r>
+      <w:proofErr w:type="spellStart"/>
+      <w:r>
+        <w:t>only</w:t>
+      </w:r>
+      <w:proofErr w:type="spellEnd"/>
+      <w:r>
+        <w:t xml:space="preserve"> </w:t>
+      </w:r>
+      <w:proofErr w:type="spellStart"/>
+      <w:r>
+        <w:t>cookies</w:t>
+      </w:r>
+      <w:proofErr w:type="spellEnd"/>
+      <w:r>
+        <w:t xml:space="preserve">. Access token je na </w:t>
+      </w:r>
+      <w:proofErr w:type="spellStart"/>
+      <w:r>
+        <w:t>backend</w:t>
+      </w:r>
+      <w:proofErr w:type="spellEnd"/>
+      <w:r>
+        <w:t xml:space="preserve"> odosielaný s každým </w:t>
+      </w:r>
+      <w:proofErr w:type="spellStart"/>
+      <w:r>
+        <w:t>requestom</w:t>
+      </w:r>
+      <w:proofErr w:type="spellEnd"/>
+      <w:r>
+        <w:t xml:space="preserve">. V prípade neplatnosti sa klient pokúsi pomocou </w:t>
+      </w:r>
+      <w:proofErr w:type="spellStart"/>
+      <w:r>
+        <w:t>refresh</w:t>
+      </w:r>
+      <w:proofErr w:type="spellEnd"/>
+      <w:r>
+        <w:t xml:space="preserve"> tokenu získať nové tokeny. V prípade úspechu vie používateľ normálne pokračovať vo využíva</w:t>
+      </w:r>
+      <w:r>
+        <w:t>ní</w:t>
+      </w:r>
+      <w:r>
+        <w:t xml:space="preserve"> aplikácie, zatiaľ čo v opačnom prípade bude odhlásený a presmerovaný na stránku s </w:t>
+      </w:r>
+      <w:proofErr w:type="spellStart"/>
+      <w:r>
+        <w:t>loginom</w:t>
+      </w:r>
+      <w:proofErr w:type="spellEnd"/>
+      <w:r>
+        <w:t xml:space="preserve">. </w:t>
+      </w:r>
+    </w:p>
+    <w:p>
+      <w:pPr>
+        <w:pStyle w:val="TEXT"/>
       </w:pPr>
     </w:p>
     <w:p>
       <w:pPr>
         <w:pStyle w:val="Nadpis3"/>
       </w:pPr>
-      <w:bookmarkStart w:id="35" w:name="_Toc221484232"/>
-      <w:r>
-        <w:t>Autentifikácia a autorizácia</w:t>
-      </w:r>
-      <w:bookmarkEnd w:id="35"/>
+      <w:bookmarkStart w:id="36" w:name="_Toc221565727"/>
+      <w:r>
+        <w:t>Typová bezpečnosť</w:t>
+      </w:r>
+      <w:bookmarkEnd w:id="36"/>
     </w:p>
     <w:p>
       <w:pPr>
         <w:pStyle w:val="TEXT"/>
       </w:pPr>
       <w:r>
-        <w:t>Access a </w:t>
-      </w:r>
-      <w:proofErr w:type="spellStart"/>
-      <w:r>
-        <w:t>refresh</w:t>
-      </w:r>
-      <w:proofErr w:type="spellEnd"/>
-      <w:r>
-        <w:t xml:space="preserve"> token sú na </w:t>
+        <w:t xml:space="preserve">Rovnako ako na </w:t>
+      </w:r>
+      <w:proofErr w:type="spellStart"/>
+      <w:r>
+        <w:t>backende</w:t>
+      </w:r>
+      <w:proofErr w:type="spellEnd"/>
+      <w:r>
+        <w:t xml:space="preserve">, aj na </w:t>
       </w:r>
       <w:proofErr w:type="spellStart"/>
       <w:r>
@@ -12683,102 +12874,6 @@
       </w:r>
       <w:proofErr w:type="spellEnd"/>
       <w:r>
-        <w:t xml:space="preserve"> uložené</w:t>
-      </w:r>
-      <w:r>
-        <w:t xml:space="preserve"> v http </w:t>
-      </w:r>
-      <w:proofErr w:type="spellStart"/>
-      <w:r>
-        <w:t>only</w:t>
-      </w:r>
-      <w:proofErr w:type="spellEnd"/>
-      <w:r>
-        <w:t xml:space="preserve"> </w:t>
-      </w:r>
-      <w:proofErr w:type="spellStart"/>
-      <w:r>
-        <w:t>cookies</w:t>
-      </w:r>
-      <w:proofErr w:type="spellEnd"/>
-      <w:r>
-        <w:t xml:space="preserve">. Access token je na </w:t>
-      </w:r>
-      <w:proofErr w:type="spellStart"/>
-      <w:r>
-        <w:t>backend</w:t>
-      </w:r>
-      <w:proofErr w:type="spellEnd"/>
-      <w:r>
-        <w:t xml:space="preserve"> odosielaný s každým </w:t>
-      </w:r>
-      <w:proofErr w:type="spellStart"/>
-      <w:r>
-        <w:t>requestom</w:t>
-      </w:r>
-      <w:proofErr w:type="spellEnd"/>
-      <w:r>
-        <w:t xml:space="preserve">. V prípade neplatnosti sa klient pokúsi pomocou </w:t>
-      </w:r>
-      <w:proofErr w:type="spellStart"/>
-      <w:r>
-        <w:t>refresh</w:t>
-      </w:r>
-      <w:proofErr w:type="spellEnd"/>
-      <w:r>
-        <w:t xml:space="preserve"> tokenu získať nové tokeny. V prípade úspechu vie používateľ normálne pokračovať vo využíva</w:t>
-      </w:r>
-      <w:r>
-        <w:t>ní</w:t>
-      </w:r>
-      <w:r>
-        <w:t xml:space="preserve"> aplikácie, zatiaľ čo v opačnom prípade bude odhlásený a presmerovaný na stránku s </w:t>
-      </w:r>
-      <w:proofErr w:type="spellStart"/>
-      <w:r>
-        <w:t>loginom</w:t>
-      </w:r>
-      <w:proofErr w:type="spellEnd"/>
-      <w:r>
-        <w:t xml:space="preserve">. </w:t>
-      </w:r>
-    </w:p>
-    <w:p>
-      <w:pPr>
-        <w:pStyle w:val="TEXT"/>
-      </w:pPr>
-    </w:p>
-    <w:p>
-      <w:pPr>
-        <w:pStyle w:val="Nadpis3"/>
-      </w:pPr>
-      <w:bookmarkStart w:id="36" w:name="_Toc221484233"/>
-      <w:r>
-        <w:t>Typová bezpečnosť</w:t>
-      </w:r>
-      <w:bookmarkEnd w:id="36"/>
-    </w:p>
-    <w:p>
-      <w:pPr>
-        <w:pStyle w:val="TEXT"/>
-      </w:pPr>
-      <w:r>
-        <w:t xml:space="preserve">Rovnako ako na </w:t>
-      </w:r>
-      <w:proofErr w:type="spellStart"/>
-      <w:r>
-        <w:t>backende</w:t>
-      </w:r>
-      <w:proofErr w:type="spellEnd"/>
-      <w:r>
-        <w:t xml:space="preserve">, aj na </w:t>
-      </w:r>
-      <w:proofErr w:type="spellStart"/>
-      <w:r>
-        <w:t>frontende</w:t>
-      </w:r>
-      <w:proofErr w:type="spellEnd"/>
-      <w:r>
         <w:t xml:space="preserve"> sme implementovali typovú bezpečnosť pomocou </w:t>
       </w:r>
       <w:proofErr w:type="spellStart"/>
@@ -12807,7 +12902,7 @@
       <w:pPr>
         <w:pStyle w:val="Nadpis1"/>
       </w:pPr>
-      <w:bookmarkStart w:id="37" w:name="_Toc221484234"/>
+      <w:bookmarkStart w:id="37" w:name="_Toc221565728"/>
       <w:proofErr w:type="spellStart"/>
       <w:r>
         <w:lastRenderedPageBreak/>
@@ -12866,7 +12961,16 @@
         <w:t>á</w:t>
       </w:r>
       <w:r>
-        <w:t xml:space="preserve"> aj doména, ktorá zabezpečí jednoduchý prístup používateľov na web</w:t>
+        <w:t xml:space="preserve"> aj doména, ktorá zabezpečí jednoduchý prístu</w:t>
+      </w:r>
+      <w:r>
+        <w:t>p k</w:t>
+      </w:r>
+      <w:r>
+        <w:t xml:space="preserve"> web</w:t>
+      </w:r>
+      <w:r>
+        <w:t>u</w:t>
       </w:r>
       <w:r>
         <w:t>.</w:t>
@@ -12897,7 +13001,7 @@
           <w:szCs w:val="32"/>
         </w:rPr>
       </w:pPr>
-      <w:bookmarkStart w:id="38" w:name="_Toc221484235"/>
+      <w:bookmarkStart w:id="38" w:name="_Toc221565729"/>
       <w:r>
         <w:rPr>
           <w:smallCaps w:val="0"/>
@@ -12906,7 +13010,7 @@
         <w:lastRenderedPageBreak/>
         <w:t>Záver</w:t>
       </w:r>
-      <w:bookmarkEnd w:id="7"/>
+      <w:bookmarkEnd w:id="6"/>
       <w:bookmarkEnd w:id="38"/>
     </w:p>
     <w:p>
@@ -12976,13 +13080,7 @@
         <w:rPr>
           <w:szCs w:val="24"/>
         </w:rPr>
-        <w:t>samovzdeláva</w:t>
-      </w:r>
-      <w:r>
-        <w:rPr>
-          <w:szCs w:val="24"/>
-        </w:rPr>
-        <w:t>n</w:t>
+        <w:t>samovzdelávan</w:t>
       </w:r>
       <w:r>
         <w:rPr>
@@ -13029,6 +13127,9 @@
       <w:pPr>
         <w:pStyle w:val="NormalnytextDP"/>
         <w:ind w:firstLine="0"/>
+        <w:rPr>
+          <w:szCs w:val="24"/>
+        </w:rPr>
       </w:pPr>
       <w:r>
         <w:rPr>
@@ -13037,6 +13138,9 @@
         <w:t>Do budúcnosti by bolo možné projekt rozšíriť o ďalšie predmety, nové typy otázok alebo o aplikáciu pre mobil a podobne. Projekt môže slúžiť ako pomôcka vo výučbe alebo ako základ pre ďalší rozvoj podobných vzdelávacích aplikácií.</w:t>
       </w:r>
       <w:r>
+        <w:rPr>
+          <w:szCs w:val="24"/>
+        </w:rPr>
         <w:t xml:space="preserve"> </w:t>
       </w:r>
     </w:p>
@@ -13048,9 +13152,28 @@
           <w:szCs w:val="24"/>
           <w:lang w:eastAsia="sk-SK"/>
         </w:rPr>
+      </w:pPr>
+      <w:r>
+        <w:rPr>
+          <w:rFonts w:ascii="Times New Roman" w:hAnsi="Times New Roman" w:cs="Times New Roman"/>
+          <w:sz w:val="24"/>
+          <w:szCs w:val="24"/>
+          <w:lang w:eastAsia="sk-SK"/>
+        </w:rPr>
+        <w:br w:type="page"/>
+      </w:r>
+    </w:p>
+    <w:p>
+      <w:pPr>
+        <w:rPr>
+          <w:rFonts w:ascii="Times New Roman" w:hAnsi="Times New Roman" w:cs="Times New Roman"/>
+          <w:sz w:val="24"/>
+          <w:szCs w:val="24"/>
+          <w:lang w:eastAsia="sk-SK"/>
+        </w:rPr>
         <w:sectPr>
-          <w:footerReference w:type="default" r:id="rId16"/>
-          <w:footerReference w:type="first" r:id="rId17"/>
+          <w:footerReference w:type="default" r:id="rId13"/>
+          <w:footerReference w:type="first" r:id="rId14"/>
           <w:pgSz w:w="11906" w:h="16838"/>
           <w:pgMar w:top="1418" w:right="1418" w:bottom="1418" w:left="1985" w:header="708" w:footer="708" w:gutter="0"/>
           <w:pgNumType w:start="7"/>
@@ -13058,15 +13181,6 @@
           <w:docGrid w:linePitch="360"/>
         </w:sectPr>
       </w:pPr>
-      <w:r>
-        <w:rPr>
-          <w:rFonts w:ascii="Times New Roman" w:hAnsi="Times New Roman" w:cs="Times New Roman"/>
-          <w:sz w:val="24"/>
-          <w:szCs w:val="24"/>
-          <w:lang w:eastAsia="sk-SK"/>
-        </w:rPr>
-        <w:br w:type="page"/>
-      </w:r>
     </w:p>
     <w:p>
       <w:pPr>
@@ -13092,33 +13206,35 @@
     <w:p>
       <w:pPr>
         <w:rPr>
+          <w:rFonts w:ascii="Times New Roman" w:hAnsi="Times New Roman" w:cs="Times New Roman"/>
+          <w:b/>
+          <w:bCs/>
+          <w:iCs/>
+          <w:spacing w:val="5"/>
+          <w:sz w:val="32"/>
+          <w:szCs w:val="32"/>
+        </w:rPr>
+      </w:pPr>
+      <w:r>
+        <w:rPr>
+          <w:rStyle w:val="Nzovknihy"/>
+          <w:rFonts w:ascii="Times New Roman" w:hAnsi="Times New Roman" w:cs="Times New Roman"/>
+          <w:i w:val="0"/>
+          <w:sz w:val="32"/>
+          <w:szCs w:val="32"/>
+        </w:rPr>
+        <w:lastRenderedPageBreak/>
+        <w:t>Použitá literatúra</w:t>
+      </w:r>
+    </w:p>
+    <w:p>
+      <w:pPr>
+        <w:rPr>
           <w:smallCaps/>
           <w:sz w:val="32"/>
           <w:szCs w:val="32"/>
         </w:rPr>
       </w:pPr>
-      <w:r>
-        <w:rPr>
-          <w:rStyle w:val="Nzovknihy"/>
-          <w:rFonts w:ascii="Times New Roman" w:hAnsi="Times New Roman" w:cs="Times New Roman"/>
-          <w:i w:val="0"/>
-          <w:sz w:val="32"/>
-          <w:szCs w:val="32"/>
-        </w:rPr>
-        <w:lastRenderedPageBreak/>
-        <w:t>Použitá literatúra</w:t>
-      </w:r>
-    </w:p>
-    <w:p>
-      <w:pPr>
-        <w:spacing w:line="360" w:lineRule="auto"/>
-        <w:rPr>
-          <w:rFonts w:ascii="Times New Roman" w:hAnsi="Times New Roman" w:cs="Times New Roman"/>
-          <w:sz w:val="24"/>
-          <w:szCs w:val="24"/>
-          <w:lang w:eastAsia="sk-SK"/>
-        </w:rPr>
-      </w:pPr>
     </w:p>
     <w:bookmarkStart w:id="39" w:name="_Toc382839398"/>
     <w:p>
@@ -13137,53 +13253,39 @@
         <w:rPr>
           <w:rStyle w:val="Zvraznenodkaz"/>
         </w:rPr>
-        <w:instrText>HYPERLINK "</w:instrText>
+        <w:instrText>HYPERLINK "https://learn.microsoft.com/en-us/aspnet/core/get-started?view=aspnetcore-9.0"</w:instrText>
       </w:r>
       <w:r>
         <w:rPr>
           <w:rStyle w:val="Zvraznenodkaz"/>
-          <w:lang w:val="en-US"/>
-        </w:rPr>
-        <w:instrText>https://learn.microsoft.com/en-us/aspnet/core/get-started?view=aspnetcore-9.0</w:instrText>
+        </w:rPr>
       </w:r>
       <w:r>
         <w:rPr>
           <w:rStyle w:val="Zvraznenodkaz"/>
         </w:rPr>
-        <w:instrText>"</w:instrText>
+        <w:fldChar w:fldCharType="separate"/>
       </w:r>
       <w:r>
         <w:rPr>
           <w:rStyle w:val="Zvraznenodkaz"/>
         </w:rPr>
+        <w:t>https://learn.microsoft.com/en-us/aspnet/core/get-started?view=aspnetcore-9.0</w:t>
       </w:r>
       <w:r>
         <w:rPr>
           <w:rStyle w:val="Zvraznenodkaz"/>
         </w:rPr>
-        <w:fldChar w:fldCharType="separate"/>
-      </w:r>
-      <w:r>
+        <w:fldChar w:fldCharType="end"/>
+      </w:r>
+    </w:p>
+    <w:p>
+      <w:pPr>
         <w:rPr>
           <w:rStyle w:val="Zvraznenodkaz"/>
-          <w:lang w:val="en-US"/>
-        </w:rPr>
-        <w:t>https://learn.microsoft.com/en-us/aspnet/core/get-started?view=aspnetcore-9.0</w:t>
-      </w:r>
-      <w:r>
-        <w:rPr>
-          <w:rStyle w:val="Zvraznenodkaz"/>
-        </w:rPr>
-        <w:fldChar w:fldCharType="end"/>
-      </w:r>
-    </w:p>
-    <w:p>
-      <w:pPr>
-        <w:rPr>
-          <w:rStyle w:val="Zvraznenodkaz"/>
-        </w:rPr>
-      </w:pPr>
-      <w:hyperlink r:id="rId18" w:history="1">
+        </w:rPr>
+      </w:pPr>
+      <w:hyperlink r:id="rId15" w:history="1">
         <w:r>
           <w:rPr>
             <w:rStyle w:val="Zvraznenodkaz"/>
@@ -13211,7 +13313,7 @@
           <w:rStyle w:val="Zvraznenodkaz"/>
         </w:rPr>
       </w:pPr>
-      <w:hyperlink r:id="rId19" w:history="1">
+      <w:hyperlink r:id="rId16" w:history="1">
         <w:r>
           <w:rPr>
             <w:rStyle w:val="Zvraznenodkaz"/>
@@ -13226,7 +13328,7 @@
           <w:rStyle w:val="Zvraznenodkaz"/>
         </w:rPr>
       </w:pPr>
-      <w:hyperlink r:id="rId20" w:history="1">
+      <w:hyperlink r:id="rId17" w:history="1">
         <w:r>
           <w:rPr>
             <w:rStyle w:val="Zvraznenodkaz"/>
@@ -13254,7 +13356,7 @@
           <w:rStyle w:val="Zvraznenodkaz"/>
         </w:rPr>
       </w:pPr>
-      <w:hyperlink r:id="rId21" w:history="1">
+      <w:hyperlink r:id="rId18" w:history="1">
         <w:r>
           <w:rPr>
             <w:rStyle w:val="Zvraznenodkaz"/>
@@ -13275,7 +13377,7 @@
           <w:rStyle w:val="Zvraznenodkaz"/>
         </w:rPr>
       </w:pPr>
-      <w:hyperlink r:id="rId22" w:history="1">
+      <w:hyperlink r:id="rId19" w:history="1">
         <w:r>
           <w:rPr>
             <w:rStyle w:val="Zvraznenodkaz"/>
@@ -13290,7 +13392,7 @@
           <w:rStyle w:val="Zvraznenodkaz"/>
         </w:rPr>
       </w:pPr>
-      <w:hyperlink r:id="rId23" w:history="1">
+      <w:hyperlink r:id="rId20" w:history="1">
         <w:r>
           <w:rPr>
             <w:rStyle w:val="Zvraznenodkaz"/>
@@ -13305,7 +13407,7 @@
           <w:rStyle w:val="Zvraznenodkaz"/>
         </w:rPr>
       </w:pPr>
-      <w:hyperlink r:id="rId24" w:history="1">
+      <w:hyperlink r:id="rId21" w:history="1">
         <w:r>
           <w:rPr>
             <w:rStyle w:val="Zvraznenodkaz"/>
@@ -13320,7 +13422,7 @@
           <w:rStyle w:val="Zvraznenodkaz"/>
         </w:rPr>
       </w:pPr>
-      <w:hyperlink r:id="rId25" w:history="1">
+      <w:hyperlink r:id="rId22" w:history="1">
         <w:r>
           <w:rPr>
             <w:rStyle w:val="Zvraznenodkaz"/>
@@ -13335,7 +13437,7 @@
           <w:rStyle w:val="Zvraznenodkaz"/>
         </w:rPr>
       </w:pPr>
-      <w:hyperlink r:id="rId26" w:history="1">
+      <w:hyperlink r:id="rId23" w:history="1">
         <w:r>
           <w:rPr>
             <w:rStyle w:val="Zvraznenodkaz"/>
@@ -13350,7 +13452,7 @@
           <w:rStyle w:val="Zvraznenodkaz"/>
         </w:rPr>
       </w:pPr>
-      <w:hyperlink r:id="rId27" w:history="1">
+      <w:hyperlink r:id="rId24" w:history="1">
         <w:r>
           <w:rPr>
             <w:rStyle w:val="Zvraznenodkaz"/>
@@ -13360,7 +13462,12 @@
       </w:hyperlink>
     </w:p>
     <w:p>
-      <w:hyperlink r:id="rId28" w:history="1">
+      <w:pPr>
+        <w:rPr>
+          <w:rStyle w:val="Zvraznenodkaz"/>
+        </w:rPr>
+      </w:pPr>
+      <w:hyperlink r:id="rId25" w:history="1">
         <w:r>
           <w:rPr>
             <w:rStyle w:val="Zvraznenodkaz"/>
@@ -13411,8 +13518,8 @@
           <w:szCs w:val="32"/>
         </w:rPr>
         <w:sectPr>
-          <w:headerReference w:type="first" r:id="rId29"/>
-          <w:footerReference w:type="first" r:id="rId30"/>
+          <w:headerReference w:type="first" r:id="rId26"/>
+          <w:footerReference w:type="first" r:id="rId27"/>
           <w:type w:val="continuous"/>
           <w:pgSz w:w="11906" w:h="16838"/>
           <w:pgMar w:top="1418" w:right="1418" w:bottom="1418" w:left="1985" w:header="708" w:footer="708" w:gutter="0"/>
@@ -13436,7 +13543,7 @@
         </w:rPr>
       </w:pPr>
       <w:bookmarkStart w:id="40" w:name="_Toc740436385"/>
-      <w:bookmarkStart w:id="41" w:name="_Toc221484236"/>
+      <w:bookmarkStart w:id="41" w:name="_Toc221565730"/>
       <w:bookmarkEnd w:id="39"/>
       <w:r>
         <w:rPr>
@@ -13563,7 +13670,7 @@
       </w:pPr>
     </w:p>
     <w:sectPr>
-      <w:footerReference w:type="first" r:id="rId31"/>
+      <w:footerReference w:type="first" r:id="rId28"/>
       <w:pgSz w:w="11906" w:h="16838"/>
       <w:pgMar w:top="1418" w:right="1418" w:bottom="1418" w:left="1985" w:header="708" w:footer="708" w:gutter="0"/>
       <w:pgNumType w:fmt="upperLetter" w:start="1"/>
@@ -13605,6 +13712,7 @@
   <w:p>
     <w:pPr>
       <w:pStyle w:val="Pta"/>
+      <w:jc w:val="center"/>
     </w:pPr>
   </w:p>
 </w:ftr>
@@ -13622,17 +13730,6 @@
 </file>
 
 <file path=word/footer3.xml><?xml version="1.0" encoding="utf-8"?>
-<w:ftr xmlns:wpc="http://schemas.microsoft.com/office/word/2010/wordprocessingCanvas" xmlns:cx="http://schemas.microsoft.com/office/drawing/2014/chartex" xmlns:cx1="http://schemas.microsoft.com/office/drawing/2015/9/8/chartex" xmlns:cx2="http://schemas.microsoft.com/office/drawing/2015/10/21/chartex" xmlns:cx3="http://schemas.microsoft.com/office/drawing/2016/5/9/chartex" xmlns:cx4="http://schemas.microsoft.com/office/drawing/2016/5/10/chartex" xmlns:cx5="http://schemas.microsoft.com/office/drawing/2016/5/11/chartex" xmlns:cx6="http://schemas.microsoft.com/office/drawing/2016/5/12/chartex" xmlns:cx7="http://schemas.microsoft.com/office/drawing/2016/5/13/chartex" xmlns:cx8="http://schemas.microsoft.com/office/drawing/2016/5/14/chartex" xmlns:mc="http://schemas.openxmlformats.org/markup-compatibility/2006" xmlns:aink="http://schemas.microsoft.com/office/drawing/2016/ink" xmlns:am3d="http://schemas.microsoft.com/office/drawing/2017/model3d" xmlns:o="urn:schemas-microsoft-com:office:office" xmlns:oel="http://schemas.microsoft.com/office/2019/extlst" xmlns:r="http://schemas.openxmlformats.org/officeDocument/2006/relationships" xmlns:m="http://schemas.openxmlformats.org/officeDocument/2006/math" xmlns:v="urn:schemas-microsoft-com:vml" xmlns:wp14="http://schemas.microsoft.com/office/word/2010/wordprocessingDrawing" xmlns:wp="http://schemas.openxmlformats.org/drawingml/2006/wordprocessingDrawing" xmlns:w10="urn:schemas-microsoft-com:office:word" xmlns:w="http://schemas.openxmlformats.org/wordprocessingml/2006/main" xmlns:w14="http://schemas.microsoft.com/office/word/2010/wordml" xmlns:w15="http://schemas.microsoft.com/office/word/2012/wordml" xmlns:w16cex="http://schemas.microsoft.com/office/word/2018/wordml/cex" xmlns:w16cid="http://schemas.microsoft.com/office/word/2016/wordml/cid" xmlns:w16="http://schemas.microsoft.com/office/word/2018/wordml" xmlns:w16du="http://schemas.microsoft.com/office/word/2023/wordml/word16du" xmlns:w16sdtdh="http://schemas.microsoft.com/office/word/2020/wordml/sdtdatahash" xmlns:w16sdtfl="http://schemas.microsoft.com/office/word/2024/wordml/sdtformatlock" xmlns:w16se="http://schemas.microsoft.com/office/word/2015/wordml/symex" xmlns:wpg="http://schemas.microsoft.com/office/word/2010/wordprocessingGroup" xmlns:wpi="http://schemas.microsoft.com/office/word/2010/wordprocessingInk" xmlns:wne="http://schemas.microsoft.com/office/word/2006/wordml" xmlns:wps="http://schemas.microsoft.com/office/word/2010/wordprocessingShape" mc:Ignorable="w14 w15 w16se w16cid w16 w16cex w16sdtdh w16sdtfl w16du wp14">
-  <w:p>
-    <w:pPr>
-      <w:pStyle w:val="Pta"/>
-      <w:jc w:val="center"/>
-    </w:pPr>
-  </w:p>
-</w:ftr>
-</file>
-
-<file path=word/footer4.xml><?xml version="1.0" encoding="utf-8"?>
 <w:ftr xmlns:wpc="http://schemas.microsoft.com/office/word/2010/wordprocessingCanvas" xmlns:cx="http://schemas.microsoft.com/office/drawing/2014/chartex" xmlns:cx1="http://schemas.microsoft.com/office/drawing/2015/9/8/chartex" xmlns:cx2="http://schemas.microsoft.com/office/drawing/2015/10/21/chartex" xmlns:cx3="http://schemas.microsoft.com/office/drawing/2016/5/9/chartex" xmlns:cx4="http://schemas.microsoft.com/office/drawing/2016/5/10/chartex" xmlns:cx5="http://schemas.microsoft.com/office/drawing/2016/5/11/chartex" xmlns:cx6="http://schemas.microsoft.com/office/drawing/2016/5/12/chartex" xmlns:cx7="http://schemas.microsoft.com/office/drawing/2016/5/13/chartex" xmlns:cx8="http://schemas.microsoft.com/office/drawing/2016/5/14/chartex" xmlns:mc="http://schemas.openxmlformats.org/markup-compatibility/2006" xmlns:aink="http://schemas.microsoft.com/office/drawing/2016/ink" xmlns:am3d="http://schemas.microsoft.com/office/drawing/2017/model3d" xmlns:o="urn:schemas-microsoft-com:office:office" xmlns:oel="http://schemas.microsoft.com/office/2019/extlst" xmlns:r="http://schemas.openxmlformats.org/officeDocument/2006/relationships" xmlns:m="http://schemas.openxmlformats.org/officeDocument/2006/math" xmlns:v="urn:schemas-microsoft-com:vml" xmlns:wp14="http://schemas.microsoft.com/office/word/2010/wordprocessingDrawing" xmlns:wp="http://schemas.openxmlformats.org/drawingml/2006/wordprocessingDrawing" xmlns:w10="urn:schemas-microsoft-com:office:word" xmlns:w="http://schemas.openxmlformats.org/wordprocessingml/2006/main" xmlns:w14="http://schemas.microsoft.com/office/word/2010/wordml" xmlns:w15="http://schemas.microsoft.com/office/word/2012/wordml" xmlns:w16cex="http://schemas.microsoft.com/office/word/2018/wordml/cex" xmlns:w16cid="http://schemas.microsoft.com/office/word/2016/wordml/cid" xmlns:w16="http://schemas.microsoft.com/office/word/2018/wordml" xmlns:w16du="http://schemas.microsoft.com/office/word/2023/wordml/word16du" xmlns:w16sdtdh="http://schemas.microsoft.com/office/word/2020/wordml/sdtdatahash" xmlns:w16sdtfl="http://schemas.microsoft.com/office/word/2024/wordml/sdtformatlock" xmlns:w16se="http://schemas.microsoft.com/office/word/2015/wordml/symex" xmlns:wpg="http://schemas.microsoft.com/office/word/2010/wordprocessingGroup" xmlns:wpi="http://schemas.microsoft.com/office/word/2010/wordprocessingInk" xmlns:wne="http://schemas.microsoft.com/office/word/2006/wordml" xmlns:wps="http://schemas.microsoft.com/office/word/2010/wordprocessingShape" mc:Ignorable="w14 w15 w16se w16cid w16 w16cex w16sdtdh w16sdtfl w16du wp14">
   <w:sdt>
     <w:sdtPr>
@@ -13684,7 +13781,7 @@
 </w:ftr>
 </file>
 
-<file path=word/footer5.xml><?xml version="1.0" encoding="utf-8"?>
+<file path=word/footer4.xml><?xml version="1.0" encoding="utf-8"?>
 <w:ftr xmlns:wpc="http://schemas.microsoft.com/office/word/2010/wordprocessingCanvas" xmlns:cx="http://schemas.microsoft.com/office/drawing/2014/chartex" xmlns:cx1="http://schemas.microsoft.com/office/drawing/2015/9/8/chartex" xmlns:cx2="http://schemas.microsoft.com/office/drawing/2015/10/21/chartex" xmlns:cx3="http://schemas.microsoft.com/office/drawing/2016/5/9/chartex" xmlns:cx4="http://schemas.microsoft.com/office/drawing/2016/5/10/chartex" xmlns:cx5="http://schemas.microsoft.com/office/drawing/2016/5/11/chartex" xmlns:cx6="http://schemas.microsoft.com/office/drawing/2016/5/12/chartex" xmlns:cx7="http://schemas.microsoft.com/office/drawing/2016/5/13/chartex" xmlns:cx8="http://schemas.microsoft.com/office/drawing/2016/5/14/chartex" xmlns:mc="http://schemas.openxmlformats.org/markup-compatibility/2006" xmlns:aink="http://schemas.microsoft.com/office/drawing/2016/ink" xmlns:am3d="http://schemas.microsoft.com/office/drawing/2017/model3d" xmlns:o="urn:schemas-microsoft-com:office:office" xmlns:oel="http://schemas.microsoft.com/office/2019/extlst" xmlns:r="http://schemas.openxmlformats.org/officeDocument/2006/relationships" xmlns:m="http://schemas.openxmlformats.org/officeDocument/2006/math" xmlns:v="urn:schemas-microsoft-com:vml" xmlns:wp14="http://schemas.microsoft.com/office/word/2010/wordprocessingDrawing" xmlns:wp="http://schemas.openxmlformats.org/drawingml/2006/wordprocessingDrawing" xmlns:w10="urn:schemas-microsoft-com:office:word" xmlns:w="http://schemas.openxmlformats.org/wordprocessingml/2006/main" xmlns:w14="http://schemas.microsoft.com/office/word/2010/wordml" xmlns:w15="http://schemas.microsoft.com/office/word/2012/wordml" xmlns:w16cex="http://schemas.microsoft.com/office/word/2018/wordml/cex" xmlns:w16cid="http://schemas.microsoft.com/office/word/2016/wordml/cid" xmlns:w16="http://schemas.microsoft.com/office/word/2018/wordml" xmlns:w16du="http://schemas.microsoft.com/office/word/2023/wordml/word16du" xmlns:w16sdtdh="http://schemas.microsoft.com/office/word/2020/wordml/sdtdatahash" xmlns:w16sdtfl="http://schemas.microsoft.com/office/word/2024/wordml/sdtformatlock" xmlns:w16se="http://schemas.microsoft.com/office/word/2015/wordml/symex" xmlns:wpg="http://schemas.microsoft.com/office/word/2010/wordprocessingGroup" xmlns:wpi="http://schemas.microsoft.com/office/word/2010/wordprocessingInk" xmlns:wne="http://schemas.microsoft.com/office/word/2006/wordml" xmlns:wps="http://schemas.microsoft.com/office/word/2010/wordprocessingShape" mc:Ignorable="w14 w15 w16se w16cid w16 w16cex w16sdtdh w16sdtfl w16du wp14">
   <w:p>
     <w:pPr>
@@ -13696,7 +13793,7 @@
 </w:ftr>
 </file>
 
-<file path=word/footer6.xml><?xml version="1.0" encoding="utf-8"?>
+<file path=word/footer5.xml><?xml version="1.0" encoding="utf-8"?>
 <w:ftr xmlns:wpc="http://schemas.microsoft.com/office/word/2010/wordprocessingCanvas" xmlns:cx="http://schemas.microsoft.com/office/drawing/2014/chartex" xmlns:cx1="http://schemas.microsoft.com/office/drawing/2015/9/8/chartex" xmlns:cx2="http://schemas.microsoft.com/office/drawing/2015/10/21/chartex" xmlns:cx3="http://schemas.microsoft.com/office/drawing/2016/5/9/chartex" xmlns:cx4="http://schemas.microsoft.com/office/drawing/2016/5/10/chartex" xmlns:cx5="http://schemas.microsoft.com/office/drawing/2016/5/11/chartex" xmlns:cx6="http://schemas.microsoft.com/office/drawing/2016/5/12/chartex" xmlns:cx7="http://schemas.microsoft.com/office/drawing/2016/5/13/chartex" xmlns:cx8="http://schemas.microsoft.com/office/drawing/2016/5/14/chartex" xmlns:mc="http://schemas.openxmlformats.org/markup-compatibility/2006" xmlns:aink="http://schemas.microsoft.com/office/drawing/2016/ink" xmlns:am3d="http://schemas.microsoft.com/office/drawing/2017/model3d" xmlns:o="urn:schemas-microsoft-com:office:office" xmlns:oel="http://schemas.microsoft.com/office/2019/extlst" xmlns:r="http://schemas.openxmlformats.org/officeDocument/2006/relationships" xmlns:m="http://schemas.openxmlformats.org/officeDocument/2006/math" xmlns:v="urn:schemas-microsoft-com:vml" xmlns:wp14="http://schemas.microsoft.com/office/word/2010/wordprocessingDrawing" xmlns:wp="http://schemas.openxmlformats.org/drawingml/2006/wordprocessingDrawing" xmlns:w10="urn:schemas-microsoft-com:office:word" xmlns:w="http://schemas.openxmlformats.org/wordprocessingml/2006/main" xmlns:w14="http://schemas.microsoft.com/office/word/2010/wordml" xmlns:w15="http://schemas.microsoft.com/office/word/2012/wordml" xmlns:w16cex="http://schemas.microsoft.com/office/word/2018/wordml/cex" xmlns:w16cid="http://schemas.microsoft.com/office/word/2016/wordml/cid" xmlns:w16="http://schemas.microsoft.com/office/word/2018/wordml" xmlns:w16du="http://schemas.microsoft.com/office/word/2023/wordml/word16du" xmlns:w16sdtdh="http://schemas.microsoft.com/office/word/2020/wordml/sdtdatahash" xmlns:w16sdtfl="http://schemas.microsoft.com/office/word/2024/wordml/sdtformatlock" xmlns:w16se="http://schemas.microsoft.com/office/word/2015/wordml/symex" xmlns:wpg="http://schemas.microsoft.com/office/word/2010/wordprocessingGroup" xmlns:wpi="http://schemas.microsoft.com/office/word/2010/wordprocessingInk" xmlns:wne="http://schemas.microsoft.com/office/word/2006/wordml" xmlns:wps="http://schemas.microsoft.com/office/word/2010/wordprocessingShape" mc:Ignorable="w14 w15 w16se w16cid w16 w16cex w16sdtdh w16sdtfl w16du wp14">
   <w:p>
     <w:pPr>
@@ -13707,7 +13804,7 @@
 </w:ftr>
 </file>
 
-<file path=word/footer7.xml><?xml version="1.0" encoding="utf-8"?>
+<file path=word/footer6.xml><?xml version="1.0" encoding="utf-8"?>
 <w:ftr xmlns:wpc="http://schemas.microsoft.com/office/word/2010/wordprocessingCanvas" xmlns:cx="http://schemas.microsoft.com/office/drawing/2014/chartex" xmlns:cx1="http://schemas.microsoft.com/office/drawing/2015/9/8/chartex" xmlns:cx2="http://schemas.microsoft.com/office/drawing/2015/10/21/chartex" xmlns:cx3="http://schemas.microsoft.com/office/drawing/2016/5/9/chartex" xmlns:cx4="http://schemas.microsoft.com/office/drawing/2016/5/10/chartex" xmlns:cx5="http://schemas.microsoft.com/office/drawing/2016/5/11/chartex" xmlns:cx6="http://schemas.microsoft.com/office/drawing/2016/5/12/chartex" xmlns:cx7="http://schemas.microsoft.com/office/drawing/2016/5/13/chartex" xmlns:cx8="http://schemas.microsoft.com/office/drawing/2016/5/14/chartex" xmlns:mc="http://schemas.openxmlformats.org/markup-compatibility/2006" xmlns:aink="http://schemas.microsoft.com/office/drawing/2016/ink" xmlns:am3d="http://schemas.microsoft.com/office/drawing/2017/model3d" xmlns:o="urn:schemas-microsoft-com:office:office" xmlns:oel="http://schemas.microsoft.com/office/2019/extlst" xmlns:r="http://schemas.openxmlformats.org/officeDocument/2006/relationships" xmlns:m="http://schemas.openxmlformats.org/officeDocument/2006/math" xmlns:v="urn:schemas-microsoft-com:vml" xmlns:wp14="http://schemas.microsoft.com/office/word/2010/wordprocessingDrawing" xmlns:wp="http://schemas.openxmlformats.org/drawingml/2006/wordprocessingDrawing" xmlns:w10="urn:schemas-microsoft-com:office:word" xmlns:w="http://schemas.openxmlformats.org/wordprocessingml/2006/main" xmlns:w14="http://schemas.microsoft.com/office/word/2010/wordml" xmlns:w15="http://schemas.microsoft.com/office/word/2012/wordml" xmlns:w16cex="http://schemas.microsoft.com/office/word/2018/wordml/cex" xmlns:w16cid="http://schemas.microsoft.com/office/word/2016/wordml/cid" xmlns:w16="http://schemas.microsoft.com/office/word/2018/wordml" xmlns:w16du="http://schemas.microsoft.com/office/word/2023/wordml/word16du" xmlns:w16sdtdh="http://schemas.microsoft.com/office/word/2020/wordml/sdtdatahash" xmlns:w16sdtfl="http://schemas.microsoft.com/office/word/2024/wordml/sdtformatlock" xmlns:w16se="http://schemas.microsoft.com/office/word/2015/wordml/symex" xmlns:wpg="http://schemas.microsoft.com/office/word/2010/wordprocessingGroup" xmlns:wpi="http://schemas.microsoft.com/office/word/2010/wordprocessingInk" xmlns:wne="http://schemas.microsoft.com/office/word/2006/wordml" xmlns:wps="http://schemas.microsoft.com/office/word/2010/wordprocessingShape" mc:Ignorable="w14 w15 w16se w16cid w16 w16cex w16sdtdh w16sdtfl w16du wp14">
   <w:p>
     <w:pPr>
@@ -13744,16 +13841,6 @@
 </file>
 
 <file path=word/header1.xml><?xml version="1.0" encoding="utf-8"?>
-<w:hdr xmlns:wpc="http://schemas.microsoft.com/office/word/2010/wordprocessingCanvas" xmlns:cx="http://schemas.microsoft.com/office/drawing/2014/chartex" xmlns:cx1="http://schemas.microsoft.com/office/drawing/2015/9/8/chartex" xmlns:cx2="http://schemas.microsoft.com/office/drawing/2015/10/21/chartex" xmlns:cx3="http://schemas.microsoft.com/office/drawing/2016/5/9/chartex" xmlns:cx4="http://schemas.microsoft.com/office/drawing/2016/5/10/chartex" xmlns:cx5="http://schemas.microsoft.com/office/drawing/2016/5/11/chartex" xmlns:cx6="http://schemas.microsoft.com/office/drawing/2016/5/12/chartex" xmlns:cx7="http://schemas.microsoft.com/office/drawing/2016/5/13/chartex" xmlns:cx8="http://schemas.microsoft.com/office/drawing/2016/5/14/chartex" xmlns:mc="http://schemas.openxmlformats.org/markup-compatibility/2006" xmlns:aink="http://schemas.microsoft.com/office/drawing/2016/ink" xmlns:am3d="http://schemas.microsoft.com/office/drawing/2017/model3d" xmlns:o="urn:schemas-microsoft-com:office:office" xmlns:oel="http://schemas.microsoft.com/office/2019/extlst" xmlns:r="http://schemas.openxmlformats.org/officeDocument/2006/relationships" xmlns:m="http://schemas.openxmlformats.org/officeDocument/2006/math" xmlns:v="urn:schemas-microsoft-com:vml" xmlns:wp14="http://schemas.microsoft.com/office/word/2010/wordprocessingDrawing" xmlns:wp="http://schemas.openxmlformats.org/drawingml/2006/wordprocessingDrawing" xmlns:w10="urn:schemas-microsoft-com:office:word" xmlns:w="http://schemas.openxmlformats.org/wordprocessingml/2006/main" xmlns:w14="http://schemas.microsoft.com/office/word/2010/wordml" xmlns:w15="http://schemas.microsoft.com/office/word/2012/wordml" xmlns:w16cex="http://schemas.microsoft.com/office/word/2018/wordml/cex" xmlns:w16cid="http://schemas.microsoft.com/office/word/2016/wordml/cid" xmlns:w16="http://schemas.microsoft.com/office/word/2018/wordml" xmlns:w16du="http://schemas.microsoft.com/office/word/2023/wordml/word16du" xmlns:w16sdtdh="http://schemas.microsoft.com/office/word/2020/wordml/sdtdatahash" xmlns:w16sdtfl="http://schemas.microsoft.com/office/word/2024/wordml/sdtformatlock" xmlns:w16se="http://schemas.microsoft.com/office/word/2015/wordml/symex" xmlns:wpg="http://schemas.microsoft.com/office/word/2010/wordprocessingGroup" xmlns:wpi="http://schemas.microsoft.com/office/word/2010/wordprocessingInk" xmlns:wne="http://schemas.microsoft.com/office/word/2006/wordml" xmlns:wps="http://schemas.microsoft.com/office/word/2010/wordprocessingShape" mc:Ignorable="w14 w15 w16se w16cid w16 w16cex w16sdtdh w16sdtfl w16du wp14">
-  <w:p>
-    <w:pPr>
-      <w:pStyle w:val="Hlavika"/>
-    </w:pPr>
-  </w:p>
-</w:hdr>
-</file>
-
-<file path=word/header2.xml><?xml version="1.0" encoding="utf-8"?>
 <w:hdr xmlns:wpc="http://schemas.microsoft.com/office/word/2010/wordprocessingCanvas" xmlns:cx="http://schemas.microsoft.com/office/drawing/2014/chartex" xmlns:cx1="http://schemas.microsoft.com/office/drawing/2015/9/8/chartex" xmlns:cx2="http://schemas.microsoft.com/office/drawing/2015/10/21/chartex" xmlns:cx3="http://schemas.microsoft.com/office/drawing/2016/5/9/chartex" xmlns:cx4="http://schemas.microsoft.com/office/drawing/2016/5/10/chartex" xmlns:cx5="http://schemas.microsoft.com/office/drawing/2016/5/11/chartex" xmlns:cx6="http://schemas.microsoft.com/office/drawing/2016/5/12/chartex" xmlns:cx7="http://schemas.microsoft.com/office/drawing/2016/5/13/chartex" xmlns:cx8="http://schemas.microsoft.com/office/drawing/2016/5/14/chartex" xmlns:mc="http://schemas.openxmlformats.org/markup-compatibility/2006" xmlns:aink="http://schemas.microsoft.com/office/drawing/2016/ink" xmlns:am3d="http://schemas.microsoft.com/office/drawing/2017/model3d" xmlns:o="urn:schemas-microsoft-com:office:office" xmlns:oel="http://schemas.microsoft.com/office/2019/extlst" xmlns:r="http://schemas.openxmlformats.org/officeDocument/2006/relationships" xmlns:m="http://schemas.openxmlformats.org/officeDocument/2006/math" xmlns:v="urn:schemas-microsoft-com:vml" xmlns:wp14="http://schemas.microsoft.com/office/word/2010/wordprocessingDrawing" xmlns:wp="http://schemas.openxmlformats.org/drawingml/2006/wordprocessingDrawing" xmlns:w10="urn:schemas-microsoft-com:office:word" xmlns:w="http://schemas.openxmlformats.org/wordprocessingml/2006/main" xmlns:w14="http://schemas.microsoft.com/office/word/2010/wordml" xmlns:w15="http://schemas.microsoft.com/office/word/2012/wordml" xmlns:w16cex="http://schemas.microsoft.com/office/word/2018/wordml/cex" xmlns:w16cid="http://schemas.microsoft.com/office/word/2016/wordml/cid" xmlns:w16="http://schemas.microsoft.com/office/word/2018/wordml" xmlns:w16du="http://schemas.microsoft.com/office/word/2023/wordml/word16du" xmlns:w16sdtdh="http://schemas.microsoft.com/office/word/2020/wordml/sdtdatahash" xmlns:w16sdtfl="http://schemas.microsoft.com/office/word/2024/wordml/sdtformatlock" xmlns:w16se="http://schemas.microsoft.com/office/word/2015/wordml/symex" xmlns:wpg="http://schemas.microsoft.com/office/word/2010/wordprocessingGroup" xmlns:wpi="http://schemas.microsoft.com/office/word/2010/wordprocessingInk" xmlns:wne="http://schemas.microsoft.com/office/word/2006/wordml" xmlns:wps="http://schemas.microsoft.com/office/word/2010/wordprocessingShape" mc:Ignorable="w14 w15 w16se w16cid w16 w16cex w16sdtdh w16sdtfl w16du wp14">
   <w:p>
     <w:pPr>
@@ -13769,17 +13856,7 @@
 </w:hdr>
 </file>
 
-<file path=word/header3.xml><?xml version="1.0" encoding="utf-8"?>
-<w:hdr xmlns:wpc="http://schemas.microsoft.com/office/word/2010/wordprocessingCanvas" xmlns:cx="http://schemas.microsoft.com/office/drawing/2014/chartex" xmlns:cx1="http://schemas.microsoft.com/office/drawing/2015/9/8/chartex" xmlns:cx2="http://schemas.microsoft.com/office/drawing/2015/10/21/chartex" xmlns:cx3="http://schemas.microsoft.com/office/drawing/2016/5/9/chartex" xmlns:cx4="http://schemas.microsoft.com/office/drawing/2016/5/10/chartex" xmlns:cx5="http://schemas.microsoft.com/office/drawing/2016/5/11/chartex" xmlns:cx6="http://schemas.microsoft.com/office/drawing/2016/5/12/chartex" xmlns:cx7="http://schemas.microsoft.com/office/drawing/2016/5/13/chartex" xmlns:cx8="http://schemas.microsoft.com/office/drawing/2016/5/14/chartex" xmlns:mc="http://schemas.openxmlformats.org/markup-compatibility/2006" xmlns:aink="http://schemas.microsoft.com/office/drawing/2016/ink" xmlns:am3d="http://schemas.microsoft.com/office/drawing/2017/model3d" xmlns:o="urn:schemas-microsoft-com:office:office" xmlns:oel="http://schemas.microsoft.com/office/2019/extlst" xmlns:r="http://schemas.openxmlformats.org/officeDocument/2006/relationships" xmlns:m="http://schemas.openxmlformats.org/officeDocument/2006/math" xmlns:v="urn:schemas-microsoft-com:vml" xmlns:wp14="http://schemas.microsoft.com/office/word/2010/wordprocessingDrawing" xmlns:wp="http://schemas.openxmlformats.org/drawingml/2006/wordprocessingDrawing" xmlns:w10="urn:schemas-microsoft-com:office:word" xmlns:w="http://schemas.openxmlformats.org/wordprocessingml/2006/main" xmlns:w14="http://schemas.microsoft.com/office/word/2010/wordml" xmlns:w15="http://schemas.microsoft.com/office/word/2012/wordml" xmlns:w16cex="http://schemas.microsoft.com/office/word/2018/wordml/cex" xmlns:w16cid="http://schemas.microsoft.com/office/word/2016/wordml/cid" xmlns:w16="http://schemas.microsoft.com/office/word/2018/wordml" xmlns:w16du="http://schemas.microsoft.com/office/word/2023/wordml/word16du" xmlns:w16sdtdh="http://schemas.microsoft.com/office/word/2020/wordml/sdtdatahash" xmlns:w16sdtfl="http://schemas.microsoft.com/office/word/2024/wordml/sdtformatlock" xmlns:w16se="http://schemas.microsoft.com/office/word/2015/wordml/symex" xmlns:wpg="http://schemas.microsoft.com/office/word/2010/wordprocessingGroup" xmlns:wpi="http://schemas.microsoft.com/office/word/2010/wordprocessingInk" xmlns:wne="http://schemas.microsoft.com/office/word/2006/wordml" xmlns:wps="http://schemas.microsoft.com/office/word/2010/wordprocessingShape" mc:Ignorable="w14 w15 w16se w16cid w16 w16cex w16sdtdh w16sdtfl w16du wp14">
-  <w:p>
-    <w:pPr>
-      <w:pStyle w:val="Hlavika"/>
-    </w:pPr>
-  </w:p>
-</w:hdr>
-</file>
-
-<file path=word/header4.xml><?xml version="1.0" encoding="utf-8"?>
+<file path=word/header2.xml><?xml version="1.0" encoding="utf-8"?>
 <w:hdr xmlns:wpc="http://schemas.microsoft.com/office/word/2010/wordprocessingCanvas" xmlns:cx="http://schemas.microsoft.com/office/drawing/2014/chartex" xmlns:cx1="http://schemas.microsoft.com/office/drawing/2015/9/8/chartex" xmlns:cx2="http://schemas.microsoft.com/office/drawing/2015/10/21/chartex" xmlns:cx3="http://schemas.microsoft.com/office/drawing/2016/5/9/chartex" xmlns:cx4="http://schemas.microsoft.com/office/drawing/2016/5/10/chartex" xmlns:cx5="http://schemas.microsoft.com/office/drawing/2016/5/11/chartex" xmlns:cx6="http://schemas.microsoft.com/office/drawing/2016/5/12/chartex" xmlns:cx7="http://schemas.microsoft.com/office/drawing/2016/5/13/chartex" xmlns:cx8="http://schemas.microsoft.com/office/drawing/2016/5/14/chartex" xmlns:mc="http://schemas.openxmlformats.org/markup-compatibility/2006" xmlns:aink="http://schemas.microsoft.com/office/drawing/2016/ink" xmlns:am3d="http://schemas.microsoft.com/office/drawing/2017/model3d" xmlns:o="urn:schemas-microsoft-com:office:office" xmlns:oel="http://schemas.microsoft.com/office/2019/extlst" xmlns:r="http://schemas.openxmlformats.org/officeDocument/2006/relationships" xmlns:m="http://schemas.openxmlformats.org/officeDocument/2006/math" xmlns:v="urn:schemas-microsoft-com:vml" xmlns:wp14="http://schemas.microsoft.com/office/word/2010/wordprocessingDrawing" xmlns:wp="http://schemas.openxmlformats.org/drawingml/2006/wordprocessingDrawing" xmlns:w10="urn:schemas-microsoft-com:office:word" xmlns:w="http://schemas.openxmlformats.org/wordprocessingml/2006/main" xmlns:w14="http://schemas.microsoft.com/office/word/2010/wordml" xmlns:w15="http://schemas.microsoft.com/office/word/2012/wordml" xmlns:w16cex="http://schemas.microsoft.com/office/word/2018/wordml/cex" xmlns:w16cid="http://schemas.microsoft.com/office/word/2016/wordml/cid" xmlns:w16="http://schemas.microsoft.com/office/word/2018/wordml" xmlns:w16du="http://schemas.microsoft.com/office/word/2023/wordml/word16du" xmlns:w16sdtdh="http://schemas.microsoft.com/office/word/2020/wordml/sdtdatahash" xmlns:w16sdtfl="http://schemas.microsoft.com/office/word/2024/wordml/sdtformatlock" xmlns:w16se="http://schemas.microsoft.com/office/word/2015/wordml/symex" xmlns:wpg="http://schemas.microsoft.com/office/word/2010/wordprocessingGroup" xmlns:wpi="http://schemas.microsoft.com/office/word/2010/wordprocessingInk" xmlns:wne="http://schemas.microsoft.com/office/word/2006/wordml" xmlns:wps="http://schemas.microsoft.com/office/word/2010/wordprocessingShape" mc:Ignorable="w14 w15 w16se w16cid w16 w16cex w16sdtdh w16sdtfl w16du wp14">
   <w:p>
     <w:pPr>
@@ -15438,6 +15515,7 @@
   <w:style w:type="character" w:default="1" w:styleId="Predvolenpsmoodseku">
     <w:name w:val="Default Paragraph Font"/>
     <w:uiPriority w:val="1"/>
+    <w:semiHidden/>
     <w:unhideWhenUsed/>
   </w:style>
   <w:style w:type="table" w:default="1" w:styleId="Normlnatabuka">
@@ -16555,6 +16633,7 @@
     <w:rsid w:val="000535E3"/>
     <w:rsid w:val="00062512"/>
     <w:rsid w:val="000C6879"/>
+    <w:rsid w:val="00102146"/>
     <w:rsid w:val="001104D2"/>
     <w:rsid w:val="00126386"/>
     <w:rsid w:val="00132643"/>
@@ -16582,6 +16661,7 @@
     <w:rsid w:val="007E0306"/>
     <w:rsid w:val="007E75EE"/>
     <w:rsid w:val="00837545"/>
+    <w:rsid w:val="00897286"/>
     <w:rsid w:val="008B05CD"/>
     <w:rsid w:val="00923045"/>
     <w:rsid w:val="00937A59"/>
@@ -16591,6 +16671,7 @@
     <w:rsid w:val="00B63FBC"/>
     <w:rsid w:val="00BC0E45"/>
     <w:rsid w:val="00BE05E0"/>
+    <w:rsid w:val="00BE4B47"/>
     <w:rsid w:val="00BE5613"/>
     <w:rsid w:val="00C13BF0"/>
     <w:rsid w:val="00C52E6C"/>
@@ -16600,6 +16681,7 @@
     <w:rsid w:val="00CB7C87"/>
     <w:rsid w:val="00D1018A"/>
     <w:rsid w:val="00D4365B"/>
+    <w:rsid w:val="00D46867"/>
     <w:rsid w:val="00D57A8B"/>
     <w:rsid w:val="00D65A6B"/>
     <w:rsid w:val="00D67AE0"/>

</xml_diff>